<commit_message>
fix: adiciona novos atributos no documento
</commit_message>
<xml_diff>
--- a/Documentacao - Ciclo de vida de um Processo.docx
+++ b/Documentacao - Ciclo de vida de um Processo.docx
@@ -1,6 +1,6 @@
 
 <file path=word/document.xml><?xml version="1.0" encoding="utf-8"?>
-<w:document xmlns:wpc="http://schemas.microsoft.com/office/word/2010/wordprocessingCanvas" xmlns:mc="http://schemas.openxmlformats.org/markup-compatibility/2006" xmlns:o="urn:schemas-microsoft-com:office:office" xmlns:r="http://schemas.openxmlformats.org/officeDocument/2006/relationships" xmlns:m="http://schemas.openxmlformats.org/officeDocument/2006/math" xmlns:v="urn:schemas-microsoft-com:vml" xmlns:wp14="http://schemas.microsoft.com/office/word/2010/wordprocessingDrawing" xmlns:wp="http://schemas.openxmlformats.org/drawingml/2006/wordprocessingDrawing" xmlns:w10="urn:schemas-microsoft-com:office:word" xmlns:w="http://schemas.openxmlformats.org/wordprocessingml/2006/main" xmlns:w14="http://schemas.microsoft.com/office/word/2010/wordml" xmlns:w15="http://schemas.microsoft.com/office/word/2012/wordml" xmlns:wpg="http://schemas.microsoft.com/office/word/2010/wordprocessingGroup" xmlns:wpi="http://schemas.microsoft.com/office/word/2010/wordprocessingInk" xmlns:wne="http://schemas.microsoft.com/office/word/2006/wordml" xmlns:wps="http://schemas.microsoft.com/office/word/2010/wordprocessingShape" mc:Ignorable="w14 w15 wp14">
+<w:document xmlns:wpc="http://schemas.microsoft.com/office/word/2010/wordprocessingCanvas" xmlns:cx="http://schemas.microsoft.com/office/drawing/2014/chartex" xmlns:cx1="http://schemas.microsoft.com/office/drawing/2015/9/8/chartex" xmlns:cx2="http://schemas.microsoft.com/office/drawing/2015/10/21/chartex" xmlns:cx3="http://schemas.microsoft.com/office/drawing/2016/5/9/chartex" xmlns:cx4="http://schemas.microsoft.com/office/drawing/2016/5/10/chartex" xmlns:cx5="http://schemas.microsoft.com/office/drawing/2016/5/11/chartex" xmlns:cx6="http://schemas.microsoft.com/office/drawing/2016/5/12/chartex" xmlns:cx7="http://schemas.microsoft.com/office/drawing/2016/5/13/chartex" xmlns:cx8="http://schemas.microsoft.com/office/drawing/2016/5/14/chartex" xmlns:mc="http://schemas.openxmlformats.org/markup-compatibility/2006" xmlns:aink="http://schemas.microsoft.com/office/drawing/2016/ink" xmlns:am3d="http://schemas.microsoft.com/office/drawing/2017/model3d" xmlns:o="urn:schemas-microsoft-com:office:office" xmlns:oel="http://schemas.microsoft.com/office/2019/extlst" xmlns:r="http://schemas.openxmlformats.org/officeDocument/2006/relationships" xmlns:m="http://schemas.openxmlformats.org/officeDocument/2006/math" xmlns:v="urn:schemas-microsoft-com:vml" xmlns:wp14="http://schemas.microsoft.com/office/word/2010/wordprocessingDrawing" xmlns:wp="http://schemas.openxmlformats.org/drawingml/2006/wordprocessingDrawing" xmlns:w10="urn:schemas-microsoft-com:office:word" xmlns:w="http://schemas.openxmlformats.org/wordprocessingml/2006/main" xmlns:w14="http://schemas.microsoft.com/office/word/2010/wordml" xmlns:w15="http://schemas.microsoft.com/office/word/2012/wordml" xmlns:w16cex="http://schemas.microsoft.com/office/word/2018/wordml/cex" xmlns:w16cid="http://schemas.microsoft.com/office/word/2016/wordml/cid" xmlns:w16="http://schemas.microsoft.com/office/word/2018/wordml" xmlns:w16du="http://schemas.microsoft.com/office/word/2023/wordml/word16du" xmlns:w16sdtdh="http://schemas.microsoft.com/office/word/2020/wordml/sdtdatahash" xmlns:w16sdtfl="http://schemas.microsoft.com/office/word/2024/wordml/sdtformatlock" xmlns:w16se="http://schemas.microsoft.com/office/word/2015/wordml/symex" xmlns:wpg="http://schemas.microsoft.com/office/word/2010/wordprocessingGroup" xmlns:wpi="http://schemas.microsoft.com/office/word/2010/wordprocessingInk" xmlns:wne="http://schemas.microsoft.com/office/word/2006/wordml" xmlns:wps="http://schemas.microsoft.com/office/word/2010/wordprocessingShape" mc:Ignorable="w14 w15 w16se w16cid w16 w16cex w16sdtdh w16sdtfl w16du wp14">
   <w:body>
     <w:p>
       <w:pPr>
@@ -118,12 +118,17 @@
         <w:t xml:space="preserve">) e </w:t>
       </w:r>
       <w:proofErr w:type="spellStart"/>
+      <w:proofErr w:type="gramStart"/>
       <w:r>
         <w:t>wait</w:t>
       </w:r>
       <w:proofErr w:type="spellEnd"/>
       <w:r>
-        <w:t xml:space="preserve">(). A </w:t>
+        <w:t>(</w:t>
+      </w:r>
+      <w:proofErr w:type="gramEnd"/>
+      <w:r>
+        <w:t xml:space="preserve">). A </w:t>
       </w:r>
       <w:proofErr w:type="spellStart"/>
       <w:r>
@@ -267,10 +272,7 @@
         <w:t>Representa um nó</w:t>
       </w:r>
       <w:r>
-        <w:t xml:space="preserve"> na lista encadeada de filhos de um processo. Cada processo pai mantem uma lista </w:t>
-      </w:r>
-      <w:r>
-        <w:t xml:space="preserve">de </w:t>
+        <w:t xml:space="preserve"> na lista encadeada de filhos de um processo. Cada processo pai mantem uma lista de </w:t>
       </w:r>
       <w:proofErr w:type="spellStart"/>
       <w:r>
@@ -317,12 +319,6 @@
         <w:gridCol w:w="3120"/>
       </w:tblGrid>
       <w:tr>
-        <w:tblPrEx>
-          <w:tblCellMar>
-            <w:top w:w="0" w:type="dxa"/>
-            <w:bottom w:w="0" w:type="dxa"/>
-          </w:tblCellMar>
-        </w:tblPrEx>
         <w:tc>
           <w:tcPr>
             <w:tcW w:w="3120" w:type="dxa"/>
@@ -425,12 +421,6 @@
         </w:tc>
       </w:tr>
       <w:tr>
-        <w:tblPrEx>
-          <w:tblCellMar>
-            <w:top w:w="0" w:type="dxa"/>
-            <w:bottom w:w="0" w:type="dxa"/>
-          </w:tblCellMar>
-        </w:tblPrEx>
         <w:tc>
           <w:tcPr>
             <w:tcW w:w="3120" w:type="dxa"/>
@@ -449,7 +439,6 @@
           </w:tcPr>
           <w:p>
             <w:proofErr w:type="spellStart"/>
-            <w:proofErr w:type="gramStart"/>
             <w:r>
               <w:rPr>
                 <w:sz w:val="22"/>
@@ -458,7 +447,6 @@
               <w:t>pid</w:t>
             </w:r>
             <w:proofErr w:type="spellEnd"/>
-            <w:proofErr w:type="gramEnd"/>
           </w:p>
         </w:tc>
         <w:tc>
@@ -479,7 +467,6 @@
           </w:tcPr>
           <w:p>
             <w:proofErr w:type="spellStart"/>
-            <w:proofErr w:type="gramStart"/>
             <w:r>
               <w:rPr>
                 <w:sz w:val="22"/>
@@ -488,7 +475,6 @@
               <w:t>int</w:t>
             </w:r>
             <w:proofErr w:type="spellEnd"/>
-            <w:proofErr w:type="gramEnd"/>
           </w:p>
         </w:tc>
         <w:tc>
@@ -519,12 +505,6 @@
         </w:tc>
       </w:tr>
       <w:tr>
-        <w:tblPrEx>
-          <w:tblCellMar>
-            <w:top w:w="0" w:type="dxa"/>
-            <w:bottom w:w="0" w:type="dxa"/>
-          </w:tblCellMar>
-        </w:tblPrEx>
         <w:tc>
           <w:tcPr>
             <w:tcW w:w="3120" w:type="dxa"/>
@@ -543,21 +523,12 @@
           </w:tcPr>
           <w:p>
             <w:proofErr w:type="spellStart"/>
-            <w:proofErr w:type="gramStart"/>
-            <w:r>
-              <w:rPr>
-                <w:sz w:val="22"/>
-                <w:szCs w:val="22"/>
-              </w:rPr>
-              <w:t>tempo</w:t>
-            </w:r>
-            <w:proofErr w:type="gramEnd"/>
-            <w:r>
-              <w:rPr>
-                <w:sz w:val="22"/>
-                <w:szCs w:val="22"/>
-              </w:rPr>
-              <w:t>_execucao_total</w:t>
+            <w:r>
+              <w:rPr>
+                <w:sz w:val="22"/>
+                <w:szCs w:val="22"/>
+              </w:rPr>
+              <w:t>tempo_execucao_total</w:t>
             </w:r>
             <w:proofErr w:type="spellEnd"/>
           </w:p>
@@ -580,7 +551,6 @@
           </w:tcPr>
           <w:p>
             <w:proofErr w:type="spellStart"/>
-            <w:proofErr w:type="gramStart"/>
             <w:r>
               <w:rPr>
                 <w:sz w:val="22"/>
@@ -589,7 +559,6 @@
               <w:t>int</w:t>
             </w:r>
             <w:proofErr w:type="spellEnd"/>
-            <w:proofErr w:type="gramEnd"/>
           </w:p>
         </w:tc>
         <w:tc>
@@ -620,12 +589,6 @@
         </w:tc>
       </w:tr>
       <w:tr>
-        <w:tblPrEx>
-          <w:tblCellMar>
-            <w:top w:w="0" w:type="dxa"/>
-            <w:bottom w:w="0" w:type="dxa"/>
-          </w:tblCellMar>
-        </w:tblPrEx>
         <w:tc>
           <w:tcPr>
             <w:tcW w:w="3120" w:type="dxa"/>
@@ -644,7 +607,6 @@
           </w:tcPr>
           <w:p>
             <w:proofErr w:type="spellStart"/>
-            <w:proofErr w:type="gramStart"/>
             <w:r>
               <w:rPr>
                 <w:sz w:val="22"/>
@@ -653,7 +615,6 @@
               <w:t>prox</w:t>
             </w:r>
             <w:proofErr w:type="spellEnd"/>
-            <w:proofErr w:type="gramEnd"/>
           </w:p>
         </w:tc>
         <w:tc>
@@ -673,21 +634,12 @@
             </w:tcMar>
           </w:tcPr>
           <w:p>
-            <w:proofErr w:type="gramStart"/>
-            <w:r>
-              <w:rPr>
-                <w:sz w:val="22"/>
-                <w:szCs w:val="22"/>
-              </w:rPr>
-              <w:t>filho</w:t>
-            </w:r>
-            <w:proofErr w:type="gramEnd"/>
-            <w:r>
-              <w:rPr>
-                <w:sz w:val="22"/>
-                <w:szCs w:val="22"/>
-              </w:rPr>
-              <w:t>*</w:t>
+            <w:r>
+              <w:rPr>
+                <w:sz w:val="22"/>
+                <w:szCs w:val="22"/>
+              </w:rPr>
+              <w:t>filho*</w:t>
             </w:r>
           </w:p>
         </w:tc>
@@ -788,12 +740,6 @@
         <w:gridCol w:w="4680"/>
       </w:tblGrid>
       <w:tr>
-        <w:tblPrEx>
-          <w:tblCellMar>
-            <w:top w:w="0" w:type="dxa"/>
-            <w:bottom w:w="0" w:type="dxa"/>
-          </w:tblCellMar>
-        </w:tblPrEx>
         <w:tc>
           <w:tcPr>
             <w:tcW w:w="4680" w:type="dxa"/>
@@ -856,31 +802,24 @@
         </w:tc>
       </w:tr>
       <w:tr>
-        <w:tblPrEx>
-          <w:tblCellMar>
-            <w:top w:w="0" w:type="dxa"/>
-            <w:bottom w:w="0" w:type="dxa"/>
-          </w:tblCellMar>
-        </w:tblPrEx>
-        <w:tc>
-          <w:tcPr>
-            <w:tcW w:w="4680" w:type="dxa"/>
-            <w:tcBorders>
-              <w:top w:val="single" w:sz="1" w:space="0" w:color="CCCCCC"/>
-              <w:left w:val="single" w:sz="1" w:space="0" w:color="CCCCCC"/>
-              <w:bottom w:val="single" w:sz="1" w:space="0" w:color="CCCCCC"/>
-              <w:right w:val="single" w:sz="1" w:space="0" w:color="CCCCCC"/>
-            </w:tcBorders>
-            <w:tcMar>
-              <w:top w:w="80" w:type="dxa"/>
-              <w:left w:w="120" w:type="dxa"/>
-              <w:bottom w:w="80" w:type="dxa"/>
-              <w:right w:w="120" w:type="dxa"/>
-            </w:tcMar>
-          </w:tcPr>
-          <w:p>
-            <w:proofErr w:type="spellStart"/>
-            <w:proofErr w:type="gramStart"/>
+        <w:tc>
+          <w:tcPr>
+            <w:tcW w:w="4680" w:type="dxa"/>
+            <w:tcBorders>
+              <w:top w:val="single" w:sz="1" w:space="0" w:color="CCCCCC"/>
+              <w:left w:val="single" w:sz="1" w:space="0" w:color="CCCCCC"/>
+              <w:bottom w:val="single" w:sz="1" w:space="0" w:color="CCCCCC"/>
+              <w:right w:val="single" w:sz="1" w:space="0" w:color="CCCCCC"/>
+            </w:tcBorders>
+            <w:tcMar>
+              <w:top w:w="80" w:type="dxa"/>
+              <w:left w:w="120" w:type="dxa"/>
+              <w:bottom w:w="80" w:type="dxa"/>
+              <w:right w:w="120" w:type="dxa"/>
+            </w:tcMar>
+          </w:tcPr>
+          <w:p>
+            <w:proofErr w:type="spellStart"/>
             <w:r>
               <w:rPr>
                 <w:sz w:val="22"/>
@@ -889,83 +828,60 @@
               <w:t>pid</w:t>
             </w:r>
             <w:proofErr w:type="spellEnd"/>
-            <w:proofErr w:type="gramEnd"/>
-          </w:p>
-        </w:tc>
-        <w:tc>
-          <w:tcPr>
-            <w:tcW w:w="4680" w:type="dxa"/>
-            <w:tcBorders>
-              <w:top w:val="single" w:sz="1" w:space="0" w:color="CCCCCC"/>
-              <w:left w:val="single" w:sz="1" w:space="0" w:color="CCCCCC"/>
-              <w:bottom w:val="single" w:sz="1" w:space="0" w:color="CCCCCC"/>
-              <w:right w:val="single" w:sz="1" w:space="0" w:color="CCCCCC"/>
-            </w:tcBorders>
-            <w:tcMar>
-              <w:top w:w="80" w:type="dxa"/>
-              <w:left w:w="120" w:type="dxa"/>
-              <w:bottom w:w="80" w:type="dxa"/>
-              <w:right w:w="120" w:type="dxa"/>
-            </w:tcMar>
-          </w:tcPr>
-          <w:p>
-            <w:r>
-              <w:rPr>
-                <w:sz w:val="22"/>
-                <w:szCs w:val="22"/>
-              </w:rPr>
-              <w:t xml:space="preserve">Identificador </w:t>
-            </w:r>
-            <w:r>
-              <w:rPr>
-                <w:sz w:val="22"/>
-                <w:szCs w:val="22"/>
-              </w:rPr>
-              <w:t>do processo</w:t>
+          </w:p>
+        </w:tc>
+        <w:tc>
+          <w:tcPr>
+            <w:tcW w:w="4680" w:type="dxa"/>
+            <w:tcBorders>
+              <w:top w:val="single" w:sz="1" w:space="0" w:color="CCCCCC"/>
+              <w:left w:val="single" w:sz="1" w:space="0" w:color="CCCCCC"/>
+              <w:bottom w:val="single" w:sz="1" w:space="0" w:color="CCCCCC"/>
+              <w:right w:val="single" w:sz="1" w:space="0" w:color="CCCCCC"/>
+            </w:tcBorders>
+            <w:tcMar>
+              <w:top w:w="80" w:type="dxa"/>
+              <w:left w:w="120" w:type="dxa"/>
+              <w:bottom w:w="80" w:type="dxa"/>
+              <w:right w:w="120" w:type="dxa"/>
+            </w:tcMar>
+          </w:tcPr>
+          <w:p>
+            <w:r>
+              <w:rPr>
+                <w:sz w:val="22"/>
+                <w:szCs w:val="22"/>
+              </w:rPr>
+              <w:t>Identificador do processo</w:t>
             </w:r>
           </w:p>
         </w:tc>
       </w:tr>
       <w:tr>
-        <w:tblPrEx>
-          <w:tblCellMar>
-            <w:top w:w="0" w:type="dxa"/>
-            <w:bottom w:w="0" w:type="dxa"/>
-          </w:tblCellMar>
-        </w:tblPrEx>
-        <w:tc>
-          <w:tcPr>
-            <w:tcW w:w="4680" w:type="dxa"/>
-            <w:tcBorders>
-              <w:top w:val="single" w:sz="1" w:space="0" w:color="CCCCCC"/>
-              <w:left w:val="single" w:sz="1" w:space="0" w:color="CCCCCC"/>
-              <w:bottom w:val="single" w:sz="1" w:space="0" w:color="CCCCCC"/>
-              <w:right w:val="single" w:sz="1" w:space="0" w:color="CCCCCC"/>
-            </w:tcBorders>
-            <w:tcMar>
-              <w:top w:w="80" w:type="dxa"/>
-              <w:left w:w="120" w:type="dxa"/>
-              <w:bottom w:w="80" w:type="dxa"/>
-              <w:right w:w="120" w:type="dxa"/>
-            </w:tcMar>
-          </w:tcPr>
-          <w:p>
-            <w:proofErr w:type="spellStart"/>
-            <w:proofErr w:type="gramStart"/>
-            <w:r>
-              <w:rPr>
-                <w:sz w:val="22"/>
-                <w:szCs w:val="22"/>
-              </w:rPr>
-              <w:t>pid</w:t>
-            </w:r>
-            <w:proofErr w:type="gramEnd"/>
-            <w:r>
-              <w:rPr>
-                <w:sz w:val="22"/>
-                <w:szCs w:val="22"/>
-              </w:rPr>
-              <w:t>_pai</w:t>
+        <w:tc>
+          <w:tcPr>
+            <w:tcW w:w="4680" w:type="dxa"/>
+            <w:tcBorders>
+              <w:top w:val="single" w:sz="1" w:space="0" w:color="CCCCCC"/>
+              <w:left w:val="single" w:sz="1" w:space="0" w:color="CCCCCC"/>
+              <w:bottom w:val="single" w:sz="1" w:space="0" w:color="CCCCCC"/>
+              <w:right w:val="single" w:sz="1" w:space="0" w:color="CCCCCC"/>
+            </w:tcBorders>
+            <w:tcMar>
+              <w:top w:w="80" w:type="dxa"/>
+              <w:left w:w="120" w:type="dxa"/>
+              <w:bottom w:w="80" w:type="dxa"/>
+              <w:right w:w="120" w:type="dxa"/>
+            </w:tcMar>
+          </w:tcPr>
+          <w:p>
+            <w:proofErr w:type="spellStart"/>
+            <w:r>
+              <w:rPr>
+                <w:sz w:val="22"/>
+                <w:szCs w:val="22"/>
+              </w:rPr>
+              <w:t>pid_pai</w:t>
             </w:r>
             <w:proofErr w:type="spellEnd"/>
           </w:p>
@@ -1028,770 +944,611 @@
         </w:tc>
       </w:tr>
       <w:tr>
-        <w:tblPrEx>
-          <w:tblCellMar>
-            <w:top w:w="0" w:type="dxa"/>
-            <w:bottom w:w="0" w:type="dxa"/>
-          </w:tblCellMar>
-        </w:tblPrEx>
-        <w:tc>
-          <w:tcPr>
-            <w:tcW w:w="4680" w:type="dxa"/>
-            <w:tcBorders>
-              <w:top w:val="single" w:sz="1" w:space="0" w:color="CCCCCC"/>
-              <w:left w:val="single" w:sz="1" w:space="0" w:color="CCCCCC"/>
-              <w:bottom w:val="single" w:sz="1" w:space="0" w:color="CCCCCC"/>
-              <w:right w:val="single" w:sz="1" w:space="0" w:color="CCCCCC"/>
-            </w:tcBorders>
-            <w:tcMar>
-              <w:top w:w="80" w:type="dxa"/>
-              <w:left w:w="120" w:type="dxa"/>
-              <w:bottom w:w="80" w:type="dxa"/>
-              <w:right w:w="120" w:type="dxa"/>
-            </w:tcMar>
-          </w:tcPr>
-          <w:p>
-            <w:proofErr w:type="spellStart"/>
-            <w:proofErr w:type="gramStart"/>
-            <w:r>
-              <w:rPr>
-                <w:sz w:val="22"/>
-                <w:szCs w:val="22"/>
-              </w:rPr>
-              <w:lastRenderedPageBreak/>
-              <w:t>tempo</w:t>
-            </w:r>
-            <w:proofErr w:type="gramEnd"/>
-            <w:r>
-              <w:rPr>
-                <w:sz w:val="22"/>
-                <w:szCs w:val="22"/>
-              </w:rPr>
-              <w:t>_total</w:t>
-            </w:r>
-            <w:proofErr w:type="spellEnd"/>
-          </w:p>
-        </w:tc>
-        <w:tc>
-          <w:tcPr>
-            <w:tcW w:w="4680" w:type="dxa"/>
-            <w:tcBorders>
-              <w:top w:val="single" w:sz="1" w:space="0" w:color="CCCCCC"/>
-              <w:left w:val="single" w:sz="1" w:space="0" w:color="CCCCCC"/>
-              <w:bottom w:val="single" w:sz="1" w:space="0" w:color="CCCCCC"/>
-              <w:right w:val="single" w:sz="1" w:space="0" w:color="CCCCCC"/>
-            </w:tcBorders>
-            <w:tcMar>
-              <w:top w:w="80" w:type="dxa"/>
-              <w:left w:w="120" w:type="dxa"/>
-              <w:bottom w:w="80" w:type="dxa"/>
-              <w:right w:w="120" w:type="dxa"/>
-            </w:tcMar>
-          </w:tcPr>
-          <w:p>
-            <w:r>
-              <w:rPr>
-                <w:sz w:val="22"/>
-                <w:szCs w:val="22"/>
-              </w:rPr>
-              <w:t>Tempo total de CPU que o processo precisa para concluir</w:t>
+        <w:tc>
+          <w:tcPr>
+            <w:tcW w:w="4680" w:type="dxa"/>
+            <w:tcBorders>
+              <w:top w:val="single" w:sz="1" w:space="0" w:color="CCCCCC"/>
+              <w:left w:val="single" w:sz="1" w:space="0" w:color="CCCCCC"/>
+              <w:bottom w:val="single" w:sz="1" w:space="0" w:color="CCCCCC"/>
+              <w:right w:val="single" w:sz="1" w:space="0" w:color="CCCCCC"/>
+            </w:tcBorders>
+            <w:tcMar>
+              <w:top w:w="80" w:type="dxa"/>
+              <w:left w:w="120" w:type="dxa"/>
+              <w:bottom w:w="80" w:type="dxa"/>
+              <w:right w:w="120" w:type="dxa"/>
+            </w:tcMar>
+          </w:tcPr>
+          <w:p>
+            <w:pPr>
+              <w:rPr>
+                <w:sz w:val="22"/>
+                <w:szCs w:val="22"/>
+              </w:rPr>
+            </w:pPr>
+            <w:proofErr w:type="spellStart"/>
+            <w:r>
+              <w:rPr>
+                <w:sz w:val="22"/>
+                <w:szCs w:val="22"/>
+              </w:rPr>
+              <w:t>qtde_filhos</w:t>
+            </w:r>
+            <w:proofErr w:type="spellEnd"/>
+          </w:p>
+        </w:tc>
+        <w:tc>
+          <w:tcPr>
+            <w:tcW w:w="4680" w:type="dxa"/>
+            <w:tcBorders>
+              <w:top w:val="single" w:sz="1" w:space="0" w:color="CCCCCC"/>
+              <w:left w:val="single" w:sz="1" w:space="0" w:color="CCCCCC"/>
+              <w:bottom w:val="single" w:sz="1" w:space="0" w:color="CCCCCC"/>
+              <w:right w:val="single" w:sz="1" w:space="0" w:color="CCCCCC"/>
+            </w:tcBorders>
+            <w:tcMar>
+              <w:top w:w="80" w:type="dxa"/>
+              <w:left w:w="120" w:type="dxa"/>
+              <w:bottom w:w="80" w:type="dxa"/>
+              <w:right w:w="120" w:type="dxa"/>
+            </w:tcMar>
+          </w:tcPr>
+          <w:p>
+            <w:pPr>
+              <w:rPr>
+                <w:sz w:val="22"/>
+                <w:szCs w:val="22"/>
+              </w:rPr>
+            </w:pPr>
+            <w:r>
+              <w:rPr>
+                <w:sz w:val="22"/>
+                <w:szCs w:val="22"/>
+              </w:rPr>
+              <w:t>Quantidade de filhos do processo</w:t>
             </w:r>
           </w:p>
         </w:tc>
       </w:tr>
       <w:tr>
-        <w:tblPrEx>
-          <w:tblCellMar>
-            <w:top w:w="0" w:type="dxa"/>
-            <w:bottom w:w="0" w:type="dxa"/>
-          </w:tblCellMar>
-        </w:tblPrEx>
-        <w:tc>
-          <w:tcPr>
-            <w:tcW w:w="4680" w:type="dxa"/>
-            <w:tcBorders>
-              <w:top w:val="single" w:sz="1" w:space="0" w:color="CCCCCC"/>
-              <w:left w:val="single" w:sz="1" w:space="0" w:color="CCCCCC"/>
-              <w:bottom w:val="single" w:sz="1" w:space="0" w:color="CCCCCC"/>
-              <w:right w:val="single" w:sz="1" w:space="0" w:color="CCCCCC"/>
-            </w:tcBorders>
-            <w:tcMar>
-              <w:top w:w="80" w:type="dxa"/>
-              <w:left w:w="120" w:type="dxa"/>
-              <w:bottom w:w="80" w:type="dxa"/>
-              <w:right w:w="120" w:type="dxa"/>
-            </w:tcMar>
-          </w:tcPr>
-          <w:p>
-            <w:proofErr w:type="spellStart"/>
-            <w:proofErr w:type="gramStart"/>
-            <w:r>
-              <w:rPr>
-                <w:sz w:val="22"/>
-                <w:szCs w:val="22"/>
-              </w:rPr>
-              <w:t>tempo</w:t>
-            </w:r>
-            <w:proofErr w:type="gramEnd"/>
-            <w:r>
-              <w:rPr>
-                <w:sz w:val="22"/>
-                <w:szCs w:val="22"/>
-              </w:rPr>
-              <w:t>_executado</w:t>
-            </w:r>
-            <w:proofErr w:type="spellEnd"/>
-          </w:p>
-        </w:tc>
-        <w:tc>
-          <w:tcPr>
-            <w:tcW w:w="4680" w:type="dxa"/>
-            <w:tcBorders>
-              <w:top w:val="single" w:sz="1" w:space="0" w:color="CCCCCC"/>
-              <w:left w:val="single" w:sz="1" w:space="0" w:color="CCCCCC"/>
-              <w:bottom w:val="single" w:sz="1" w:space="0" w:color="CCCCCC"/>
-              <w:right w:val="single" w:sz="1" w:space="0" w:color="CCCCCC"/>
-            </w:tcBorders>
-            <w:tcMar>
-              <w:top w:w="80" w:type="dxa"/>
-              <w:left w:w="120" w:type="dxa"/>
-              <w:bottom w:w="80" w:type="dxa"/>
-              <w:right w:w="120" w:type="dxa"/>
-            </w:tcMar>
-          </w:tcPr>
-          <w:p>
-            <w:r>
-              <w:rPr>
-                <w:sz w:val="22"/>
-                <w:szCs w:val="22"/>
-              </w:rPr>
-              <w:t xml:space="preserve">Quanto </w:t>
-            </w:r>
-            <w:r>
-              <w:rPr>
-                <w:sz w:val="22"/>
-                <w:szCs w:val="22"/>
-              </w:rPr>
-              <w:t>já</w:t>
-            </w:r>
-            <w:r>
-              <w:rPr>
-                <w:sz w:val="22"/>
-                <w:szCs w:val="22"/>
-              </w:rPr>
-              <w:t xml:space="preserve"> foi executado </w:t>
-            </w:r>
-            <w:r>
-              <w:rPr>
-                <w:sz w:val="22"/>
-                <w:szCs w:val="22"/>
-              </w:rPr>
-              <w:t>até</w:t>
-            </w:r>
-            <w:r>
-              <w:rPr>
-                <w:sz w:val="22"/>
-                <w:szCs w:val="22"/>
-              </w:rPr>
-              <w:t xml:space="preserve"> o momento</w:t>
+        <w:tc>
+          <w:tcPr>
+            <w:tcW w:w="4680" w:type="dxa"/>
+            <w:tcBorders>
+              <w:top w:val="single" w:sz="1" w:space="0" w:color="CCCCCC"/>
+              <w:left w:val="single" w:sz="1" w:space="0" w:color="CCCCCC"/>
+              <w:bottom w:val="single" w:sz="1" w:space="0" w:color="CCCCCC"/>
+              <w:right w:val="single" w:sz="1" w:space="0" w:color="CCCCCC"/>
+            </w:tcBorders>
+            <w:tcMar>
+              <w:top w:w="80" w:type="dxa"/>
+              <w:left w:w="120" w:type="dxa"/>
+              <w:bottom w:w="80" w:type="dxa"/>
+              <w:right w:w="120" w:type="dxa"/>
+            </w:tcMar>
+          </w:tcPr>
+          <w:p>
+            <w:proofErr w:type="spellStart"/>
+            <w:r>
+              <w:rPr>
+                <w:sz w:val="22"/>
+                <w:szCs w:val="22"/>
+              </w:rPr>
+              <w:lastRenderedPageBreak/>
+              <w:t>tempo_total</w:t>
+            </w:r>
+            <w:proofErr w:type="spellEnd"/>
+          </w:p>
+        </w:tc>
+        <w:tc>
+          <w:tcPr>
+            <w:tcW w:w="4680" w:type="dxa"/>
+            <w:tcBorders>
+              <w:top w:val="single" w:sz="1" w:space="0" w:color="CCCCCC"/>
+              <w:left w:val="single" w:sz="1" w:space="0" w:color="CCCCCC"/>
+              <w:bottom w:val="single" w:sz="1" w:space="0" w:color="CCCCCC"/>
+              <w:right w:val="single" w:sz="1" w:space="0" w:color="CCCCCC"/>
+            </w:tcBorders>
+            <w:tcMar>
+              <w:top w:w="80" w:type="dxa"/>
+              <w:left w:w="120" w:type="dxa"/>
+              <w:bottom w:w="80" w:type="dxa"/>
+              <w:right w:w="120" w:type="dxa"/>
+            </w:tcMar>
+          </w:tcPr>
+          <w:p>
+            <w:r>
+              <w:rPr>
+                <w:sz w:val="22"/>
+                <w:szCs w:val="22"/>
+              </w:rPr>
+              <w:t>Tempo total de CPU que o processo precisa para concluir</w:t>
             </w:r>
           </w:p>
         </w:tc>
       </w:tr>
       <w:tr>
-        <w:tblPrEx>
-          <w:tblCellMar>
-            <w:top w:w="0" w:type="dxa"/>
-            <w:bottom w:w="0" w:type="dxa"/>
-          </w:tblCellMar>
-        </w:tblPrEx>
-        <w:tc>
-          <w:tcPr>
-            <w:tcW w:w="4680" w:type="dxa"/>
-            <w:tcBorders>
-              <w:top w:val="single" w:sz="1" w:space="0" w:color="CCCCCC"/>
-              <w:left w:val="single" w:sz="1" w:space="0" w:color="CCCCCC"/>
-              <w:bottom w:val="single" w:sz="1" w:space="0" w:color="CCCCCC"/>
-              <w:right w:val="single" w:sz="1" w:space="0" w:color="CCCCCC"/>
-            </w:tcBorders>
-            <w:tcMar>
-              <w:top w:w="80" w:type="dxa"/>
-              <w:left w:w="120" w:type="dxa"/>
-              <w:bottom w:w="80" w:type="dxa"/>
-              <w:right w:w="120" w:type="dxa"/>
-            </w:tcMar>
-          </w:tcPr>
-          <w:p>
-            <w:proofErr w:type="spellStart"/>
-            <w:proofErr w:type="gramStart"/>
-            <w:r>
-              <w:rPr>
-                <w:sz w:val="22"/>
-                <w:szCs w:val="22"/>
-              </w:rPr>
-              <w:t>tempo</w:t>
-            </w:r>
-            <w:proofErr w:type="gramEnd"/>
-            <w:r>
-              <w:rPr>
-                <w:sz w:val="22"/>
-                <w:szCs w:val="22"/>
-              </w:rPr>
-              <w:t>_espera</w:t>
-            </w:r>
-            <w:proofErr w:type="spellEnd"/>
-          </w:p>
-        </w:tc>
-        <w:tc>
-          <w:tcPr>
-            <w:tcW w:w="4680" w:type="dxa"/>
-            <w:tcBorders>
-              <w:top w:val="single" w:sz="1" w:space="0" w:color="CCCCCC"/>
-              <w:left w:val="single" w:sz="1" w:space="0" w:color="CCCCCC"/>
-              <w:bottom w:val="single" w:sz="1" w:space="0" w:color="CCCCCC"/>
-              <w:right w:val="single" w:sz="1" w:space="0" w:color="CCCCCC"/>
-            </w:tcBorders>
-            <w:tcMar>
-              <w:top w:w="80" w:type="dxa"/>
-              <w:left w:w="120" w:type="dxa"/>
-              <w:bottom w:w="80" w:type="dxa"/>
-              <w:right w:w="120" w:type="dxa"/>
-            </w:tcMar>
-          </w:tcPr>
-          <w:p>
-            <w:r>
-              <w:rPr>
-                <w:sz w:val="22"/>
-                <w:szCs w:val="22"/>
-              </w:rPr>
-              <w:t>Tempo acumulado na fila de pronto</w:t>
+        <w:tc>
+          <w:tcPr>
+            <w:tcW w:w="4680" w:type="dxa"/>
+            <w:tcBorders>
+              <w:top w:val="single" w:sz="1" w:space="0" w:color="CCCCCC"/>
+              <w:left w:val="single" w:sz="1" w:space="0" w:color="CCCCCC"/>
+              <w:bottom w:val="single" w:sz="1" w:space="0" w:color="CCCCCC"/>
+              <w:right w:val="single" w:sz="1" w:space="0" w:color="CCCCCC"/>
+            </w:tcBorders>
+            <w:tcMar>
+              <w:top w:w="80" w:type="dxa"/>
+              <w:left w:w="120" w:type="dxa"/>
+              <w:bottom w:w="80" w:type="dxa"/>
+              <w:right w:w="120" w:type="dxa"/>
+            </w:tcMar>
+          </w:tcPr>
+          <w:p>
+            <w:proofErr w:type="spellStart"/>
+            <w:r>
+              <w:rPr>
+                <w:sz w:val="22"/>
+                <w:szCs w:val="22"/>
+              </w:rPr>
+              <w:t>tempo_executado</w:t>
+            </w:r>
+            <w:proofErr w:type="spellEnd"/>
+          </w:p>
+        </w:tc>
+        <w:tc>
+          <w:tcPr>
+            <w:tcW w:w="4680" w:type="dxa"/>
+            <w:tcBorders>
+              <w:top w:val="single" w:sz="1" w:space="0" w:color="CCCCCC"/>
+              <w:left w:val="single" w:sz="1" w:space="0" w:color="CCCCCC"/>
+              <w:bottom w:val="single" w:sz="1" w:space="0" w:color="CCCCCC"/>
+              <w:right w:val="single" w:sz="1" w:space="0" w:color="CCCCCC"/>
+            </w:tcBorders>
+            <w:tcMar>
+              <w:top w:w="80" w:type="dxa"/>
+              <w:left w:w="120" w:type="dxa"/>
+              <w:bottom w:w="80" w:type="dxa"/>
+              <w:right w:w="120" w:type="dxa"/>
+            </w:tcMar>
+          </w:tcPr>
+          <w:p>
+            <w:r>
+              <w:rPr>
+                <w:sz w:val="22"/>
+                <w:szCs w:val="22"/>
+              </w:rPr>
+              <w:t xml:space="preserve">Quanto </w:t>
+            </w:r>
+            <w:r>
+              <w:rPr>
+                <w:sz w:val="22"/>
+                <w:szCs w:val="22"/>
+              </w:rPr>
+              <w:t>já</w:t>
+            </w:r>
+            <w:r>
+              <w:rPr>
+                <w:sz w:val="22"/>
+                <w:szCs w:val="22"/>
+              </w:rPr>
+              <w:t xml:space="preserve"> foi executado </w:t>
+            </w:r>
+            <w:r>
+              <w:rPr>
+                <w:sz w:val="22"/>
+                <w:szCs w:val="22"/>
+              </w:rPr>
+              <w:t>até</w:t>
+            </w:r>
+            <w:r>
+              <w:rPr>
+                <w:sz w:val="22"/>
+                <w:szCs w:val="22"/>
+              </w:rPr>
+              <w:t xml:space="preserve"> o momento</w:t>
             </w:r>
           </w:p>
         </w:tc>
       </w:tr>
       <w:tr>
-        <w:tblPrEx>
-          <w:tblCellMar>
-            <w:top w:w="0" w:type="dxa"/>
-            <w:bottom w:w="0" w:type="dxa"/>
-          </w:tblCellMar>
-        </w:tblPrEx>
-        <w:tc>
-          <w:tcPr>
-            <w:tcW w:w="4680" w:type="dxa"/>
-            <w:tcBorders>
-              <w:top w:val="single" w:sz="1" w:space="0" w:color="CCCCCC"/>
-              <w:left w:val="single" w:sz="1" w:space="0" w:color="CCCCCC"/>
-              <w:bottom w:val="single" w:sz="1" w:space="0" w:color="CCCCCC"/>
-              <w:right w:val="single" w:sz="1" w:space="0" w:color="CCCCCC"/>
-            </w:tcBorders>
-            <w:tcMar>
-              <w:top w:w="80" w:type="dxa"/>
-              <w:left w:w="120" w:type="dxa"/>
-              <w:bottom w:w="80" w:type="dxa"/>
-              <w:right w:w="120" w:type="dxa"/>
-            </w:tcMar>
-          </w:tcPr>
-          <w:p>
-            <w:proofErr w:type="spellStart"/>
-            <w:proofErr w:type="gramStart"/>
-            <w:r>
-              <w:rPr>
-                <w:sz w:val="22"/>
-                <w:szCs w:val="22"/>
-              </w:rPr>
-              <w:t>tempo</w:t>
-            </w:r>
-            <w:proofErr w:type="gramEnd"/>
-            <w:r>
-              <w:rPr>
-                <w:sz w:val="22"/>
-                <w:szCs w:val="22"/>
-              </w:rPr>
-              <w:t>_bloqueado</w:t>
-            </w:r>
-            <w:proofErr w:type="spellEnd"/>
-          </w:p>
-        </w:tc>
-        <w:tc>
-          <w:tcPr>
-            <w:tcW w:w="4680" w:type="dxa"/>
-            <w:tcBorders>
-              <w:top w:val="single" w:sz="1" w:space="0" w:color="CCCCCC"/>
-              <w:left w:val="single" w:sz="1" w:space="0" w:color="CCCCCC"/>
-              <w:bottom w:val="single" w:sz="1" w:space="0" w:color="CCCCCC"/>
-              <w:right w:val="single" w:sz="1" w:space="0" w:color="CCCCCC"/>
-            </w:tcBorders>
-            <w:tcMar>
-              <w:top w:w="80" w:type="dxa"/>
-              <w:left w:w="120" w:type="dxa"/>
-              <w:bottom w:w="80" w:type="dxa"/>
-              <w:right w:w="120" w:type="dxa"/>
-            </w:tcMar>
-          </w:tcPr>
-          <w:p>
-            <w:r>
-              <w:rPr>
-                <w:sz w:val="22"/>
-                <w:szCs w:val="22"/>
-              </w:rPr>
-              <w:t>Tempo acumulado nas filas de bloqueio</w:t>
+        <w:tc>
+          <w:tcPr>
+            <w:tcW w:w="4680" w:type="dxa"/>
+            <w:tcBorders>
+              <w:top w:val="single" w:sz="1" w:space="0" w:color="CCCCCC"/>
+              <w:left w:val="single" w:sz="1" w:space="0" w:color="CCCCCC"/>
+              <w:bottom w:val="single" w:sz="1" w:space="0" w:color="CCCCCC"/>
+              <w:right w:val="single" w:sz="1" w:space="0" w:color="CCCCCC"/>
+            </w:tcBorders>
+            <w:tcMar>
+              <w:top w:w="80" w:type="dxa"/>
+              <w:left w:w="120" w:type="dxa"/>
+              <w:bottom w:w="80" w:type="dxa"/>
+              <w:right w:w="120" w:type="dxa"/>
+            </w:tcMar>
+          </w:tcPr>
+          <w:p>
+            <w:proofErr w:type="spellStart"/>
+            <w:r>
+              <w:rPr>
+                <w:sz w:val="22"/>
+                <w:szCs w:val="22"/>
+              </w:rPr>
+              <w:t>tempo_espera</w:t>
+            </w:r>
+            <w:proofErr w:type="spellEnd"/>
+          </w:p>
+        </w:tc>
+        <w:tc>
+          <w:tcPr>
+            <w:tcW w:w="4680" w:type="dxa"/>
+            <w:tcBorders>
+              <w:top w:val="single" w:sz="1" w:space="0" w:color="CCCCCC"/>
+              <w:left w:val="single" w:sz="1" w:space="0" w:color="CCCCCC"/>
+              <w:bottom w:val="single" w:sz="1" w:space="0" w:color="CCCCCC"/>
+              <w:right w:val="single" w:sz="1" w:space="0" w:color="CCCCCC"/>
+            </w:tcBorders>
+            <w:tcMar>
+              <w:top w:w="80" w:type="dxa"/>
+              <w:left w:w="120" w:type="dxa"/>
+              <w:bottom w:w="80" w:type="dxa"/>
+              <w:right w:w="120" w:type="dxa"/>
+            </w:tcMar>
+          </w:tcPr>
+          <w:p>
+            <w:r>
+              <w:rPr>
+                <w:sz w:val="22"/>
+                <w:szCs w:val="22"/>
+              </w:rPr>
+              <w:t>Tempo acumulado na fila de pronto</w:t>
             </w:r>
           </w:p>
         </w:tc>
       </w:tr>
       <w:tr>
-        <w:tblPrEx>
-          <w:tblCellMar>
-            <w:top w:w="0" w:type="dxa"/>
-            <w:bottom w:w="0" w:type="dxa"/>
-          </w:tblCellMar>
-        </w:tblPrEx>
-        <w:tc>
-          <w:tcPr>
-            <w:tcW w:w="4680" w:type="dxa"/>
-            <w:tcBorders>
-              <w:top w:val="single" w:sz="1" w:space="0" w:color="CCCCCC"/>
-              <w:left w:val="single" w:sz="1" w:space="0" w:color="CCCCCC"/>
-              <w:bottom w:val="single" w:sz="1" w:space="0" w:color="CCCCCC"/>
-              <w:right w:val="single" w:sz="1" w:space="0" w:color="CCCCCC"/>
-            </w:tcBorders>
-            <w:tcMar>
-              <w:top w:w="80" w:type="dxa"/>
-              <w:left w:w="120" w:type="dxa"/>
-              <w:bottom w:w="80" w:type="dxa"/>
-              <w:right w:w="120" w:type="dxa"/>
-            </w:tcMar>
-          </w:tcPr>
-          <w:p>
-            <w:proofErr w:type="spellStart"/>
-            <w:proofErr w:type="gramStart"/>
-            <w:r>
-              <w:rPr>
-                <w:sz w:val="22"/>
-                <w:szCs w:val="22"/>
-              </w:rPr>
-              <w:t>tempo</w:t>
-            </w:r>
-            <w:proofErr w:type="gramEnd"/>
-            <w:r>
-              <w:rPr>
-                <w:sz w:val="22"/>
-                <w:szCs w:val="22"/>
-              </w:rPr>
-              <w:t>_inicio</w:t>
-            </w:r>
-            <w:proofErr w:type="spellEnd"/>
-            <w:r>
-              <w:rPr>
-                <w:sz w:val="22"/>
-                <w:szCs w:val="22"/>
-              </w:rPr>
-              <w:t xml:space="preserve"> / </w:t>
-            </w:r>
-            <w:proofErr w:type="spellStart"/>
-            <w:r>
-              <w:rPr>
-                <w:sz w:val="22"/>
-                <w:szCs w:val="22"/>
-              </w:rPr>
-              <w:t>tempo_fim</w:t>
-            </w:r>
-            <w:proofErr w:type="spellEnd"/>
-          </w:p>
-        </w:tc>
-        <w:tc>
-          <w:tcPr>
-            <w:tcW w:w="4680" w:type="dxa"/>
-            <w:tcBorders>
-              <w:top w:val="single" w:sz="1" w:space="0" w:color="CCCCCC"/>
-              <w:left w:val="single" w:sz="1" w:space="0" w:color="CCCCCC"/>
-              <w:bottom w:val="single" w:sz="1" w:space="0" w:color="CCCCCC"/>
-              <w:right w:val="single" w:sz="1" w:space="0" w:color="CCCCCC"/>
-            </w:tcBorders>
-            <w:tcMar>
-              <w:top w:w="80" w:type="dxa"/>
-              <w:left w:w="120" w:type="dxa"/>
-              <w:bottom w:w="80" w:type="dxa"/>
-              <w:right w:w="120" w:type="dxa"/>
-            </w:tcMar>
-          </w:tcPr>
-          <w:p>
-            <w:r>
-              <w:rPr>
-                <w:sz w:val="22"/>
-                <w:szCs w:val="22"/>
-              </w:rPr>
-              <w:t>Criação e finalização do processo</w:t>
+        <w:tc>
+          <w:tcPr>
+            <w:tcW w:w="4680" w:type="dxa"/>
+            <w:tcBorders>
+              <w:top w:val="single" w:sz="1" w:space="0" w:color="CCCCCC"/>
+              <w:left w:val="single" w:sz="1" w:space="0" w:color="CCCCCC"/>
+              <w:bottom w:val="single" w:sz="1" w:space="0" w:color="CCCCCC"/>
+              <w:right w:val="single" w:sz="1" w:space="0" w:color="CCCCCC"/>
+            </w:tcBorders>
+            <w:tcMar>
+              <w:top w:w="80" w:type="dxa"/>
+              <w:left w:w="120" w:type="dxa"/>
+              <w:bottom w:w="80" w:type="dxa"/>
+              <w:right w:w="120" w:type="dxa"/>
+            </w:tcMar>
+          </w:tcPr>
+          <w:p>
+            <w:proofErr w:type="spellStart"/>
+            <w:r>
+              <w:rPr>
+                <w:sz w:val="22"/>
+                <w:szCs w:val="22"/>
+              </w:rPr>
+              <w:t>tempo_bloqueado</w:t>
+            </w:r>
+            <w:proofErr w:type="spellEnd"/>
+          </w:p>
+        </w:tc>
+        <w:tc>
+          <w:tcPr>
+            <w:tcW w:w="4680" w:type="dxa"/>
+            <w:tcBorders>
+              <w:top w:val="single" w:sz="1" w:space="0" w:color="CCCCCC"/>
+              <w:left w:val="single" w:sz="1" w:space="0" w:color="CCCCCC"/>
+              <w:bottom w:val="single" w:sz="1" w:space="0" w:color="CCCCCC"/>
+              <w:right w:val="single" w:sz="1" w:space="0" w:color="CCCCCC"/>
+            </w:tcBorders>
+            <w:tcMar>
+              <w:top w:w="80" w:type="dxa"/>
+              <w:left w:w="120" w:type="dxa"/>
+              <w:bottom w:w="80" w:type="dxa"/>
+              <w:right w:w="120" w:type="dxa"/>
+            </w:tcMar>
+          </w:tcPr>
+          <w:p>
+            <w:r>
+              <w:rPr>
+                <w:sz w:val="22"/>
+                <w:szCs w:val="22"/>
+              </w:rPr>
+              <w:t>Tempo acumulado nas filas de bloqueio</w:t>
             </w:r>
           </w:p>
         </w:tc>
       </w:tr>
       <w:tr>
-        <w:tblPrEx>
-          <w:tblCellMar>
-            <w:top w:w="0" w:type="dxa"/>
-            <w:bottom w:w="0" w:type="dxa"/>
-          </w:tblCellMar>
-        </w:tblPrEx>
-        <w:tc>
-          <w:tcPr>
-            <w:tcW w:w="4680" w:type="dxa"/>
-            <w:tcBorders>
-              <w:top w:val="single" w:sz="1" w:space="0" w:color="CCCCCC"/>
-              <w:left w:val="single" w:sz="1" w:space="0" w:color="CCCCCC"/>
-              <w:bottom w:val="single" w:sz="1" w:space="0" w:color="CCCCCC"/>
-              <w:right w:val="single" w:sz="1" w:space="0" w:color="CCCCCC"/>
-            </w:tcBorders>
-            <w:tcMar>
-              <w:top w:w="80" w:type="dxa"/>
-              <w:left w:w="120" w:type="dxa"/>
-              <w:bottom w:w="80" w:type="dxa"/>
-              <w:right w:w="120" w:type="dxa"/>
-            </w:tcMar>
-          </w:tcPr>
-          <w:p>
-            <w:proofErr w:type="spellStart"/>
-            <w:proofErr w:type="gramStart"/>
-            <w:r>
-              <w:rPr>
-                <w:sz w:val="22"/>
-                <w:szCs w:val="22"/>
-              </w:rPr>
-              <w:t>entrou</w:t>
-            </w:r>
-            <w:proofErr w:type="gramEnd"/>
-            <w:r>
-              <w:rPr>
-                <w:sz w:val="22"/>
-                <w:szCs w:val="22"/>
-              </w:rPr>
-              <w:t>_pronto</w:t>
-            </w:r>
-            <w:proofErr w:type="spellEnd"/>
-          </w:p>
-        </w:tc>
-        <w:tc>
-          <w:tcPr>
-            <w:tcW w:w="4680" w:type="dxa"/>
-            <w:tcBorders>
-              <w:top w:val="single" w:sz="1" w:space="0" w:color="CCCCCC"/>
-              <w:left w:val="single" w:sz="1" w:space="0" w:color="CCCCCC"/>
-              <w:bottom w:val="single" w:sz="1" w:space="0" w:color="CCCCCC"/>
-              <w:right w:val="single" w:sz="1" w:space="0" w:color="CCCCCC"/>
-            </w:tcBorders>
-            <w:tcMar>
-              <w:top w:w="80" w:type="dxa"/>
-              <w:left w:w="120" w:type="dxa"/>
-              <w:bottom w:w="80" w:type="dxa"/>
-              <w:right w:w="120" w:type="dxa"/>
-            </w:tcMar>
-          </w:tcPr>
-          <w:p>
-            <w:r>
-              <w:rPr>
-                <w:sz w:val="22"/>
-                <w:szCs w:val="22"/>
-              </w:rPr>
-              <w:t>Quando</w:t>
-            </w:r>
-            <w:r>
-              <w:rPr>
-                <w:sz w:val="22"/>
-                <w:szCs w:val="22"/>
-              </w:rPr>
-              <w:t xml:space="preserve"> entrou na fila de pronto (usado para calcular espera)</w:t>
-            </w:r>
+        <w:tc>
+          <w:tcPr>
+            <w:tcW w:w="4680" w:type="dxa"/>
+            <w:tcBorders>
+              <w:top w:val="single" w:sz="1" w:space="0" w:color="CCCCCC"/>
+              <w:left w:val="single" w:sz="1" w:space="0" w:color="CCCCCC"/>
+              <w:bottom w:val="single" w:sz="1" w:space="0" w:color="CCCCCC"/>
+              <w:right w:val="single" w:sz="1" w:space="0" w:color="CCCCCC"/>
+            </w:tcBorders>
+            <w:tcMar>
+              <w:top w:w="80" w:type="dxa"/>
+              <w:left w:w="120" w:type="dxa"/>
+              <w:bottom w:w="80" w:type="dxa"/>
+              <w:right w:w="120" w:type="dxa"/>
+            </w:tcMar>
+          </w:tcPr>
+          <w:p>
+            <w:pPr>
+              <w:rPr>
+                <w:sz w:val="22"/>
+                <w:szCs w:val="22"/>
+              </w:rPr>
+            </w:pPr>
+            <w:proofErr w:type="spellStart"/>
+            <w:r>
+              <w:rPr>
+                <w:sz w:val="22"/>
+                <w:szCs w:val="22"/>
+              </w:rPr>
+              <w:t>tempo_wait</w:t>
+            </w:r>
+            <w:proofErr w:type="spellEnd"/>
+          </w:p>
+        </w:tc>
+        <w:tc>
+          <w:tcPr>
+            <w:tcW w:w="4680" w:type="dxa"/>
+            <w:tcBorders>
+              <w:top w:val="single" w:sz="1" w:space="0" w:color="CCCCCC"/>
+              <w:left w:val="single" w:sz="1" w:space="0" w:color="CCCCCC"/>
+              <w:bottom w:val="single" w:sz="1" w:space="0" w:color="CCCCCC"/>
+              <w:right w:val="single" w:sz="1" w:space="0" w:color="CCCCCC"/>
+            </w:tcBorders>
+            <w:tcMar>
+              <w:top w:w="80" w:type="dxa"/>
+              <w:left w:w="120" w:type="dxa"/>
+              <w:bottom w:w="80" w:type="dxa"/>
+              <w:right w:w="120" w:type="dxa"/>
+            </w:tcMar>
+          </w:tcPr>
+          <w:p>
+            <w:pPr>
+              <w:rPr>
+                <w:sz w:val="22"/>
+                <w:szCs w:val="22"/>
+              </w:rPr>
+            </w:pPr>
+            <w:r>
+              <w:rPr>
+                <w:sz w:val="22"/>
+                <w:szCs w:val="22"/>
+              </w:rPr>
+              <w:t xml:space="preserve">Tempo acumulado na fila de </w:t>
+            </w:r>
+            <w:proofErr w:type="spellStart"/>
+            <w:r>
+              <w:rPr>
+                <w:sz w:val="22"/>
+                <w:szCs w:val="22"/>
+              </w:rPr>
+              <w:t>wait</w:t>
+            </w:r>
+            <w:proofErr w:type="spellEnd"/>
           </w:p>
         </w:tc>
       </w:tr>
       <w:tr>
-        <w:tblPrEx>
-          <w:tblCellMar>
-            <w:top w:w="0" w:type="dxa"/>
-            <w:bottom w:w="0" w:type="dxa"/>
-          </w:tblCellMar>
-        </w:tblPrEx>
-        <w:tc>
-          <w:tcPr>
-            <w:tcW w:w="4680" w:type="dxa"/>
-            <w:tcBorders>
-              <w:top w:val="single" w:sz="1" w:space="0" w:color="CCCCCC"/>
-              <w:left w:val="single" w:sz="1" w:space="0" w:color="CCCCCC"/>
-              <w:bottom w:val="single" w:sz="1" w:space="0" w:color="CCCCCC"/>
-              <w:right w:val="single" w:sz="1" w:space="0" w:color="CCCCCC"/>
-            </w:tcBorders>
-            <w:tcMar>
-              <w:top w:w="80" w:type="dxa"/>
-              <w:left w:w="120" w:type="dxa"/>
-              <w:bottom w:w="80" w:type="dxa"/>
-              <w:right w:w="120" w:type="dxa"/>
-            </w:tcMar>
-          </w:tcPr>
-          <w:p>
-            <w:proofErr w:type="spellStart"/>
-            <w:proofErr w:type="gramStart"/>
-            <w:r>
-              <w:rPr>
-                <w:sz w:val="22"/>
-                <w:szCs w:val="22"/>
-              </w:rPr>
-              <w:t>entrou</w:t>
-            </w:r>
-            <w:proofErr w:type="gramEnd"/>
-            <w:r>
-              <w:rPr>
-                <w:sz w:val="22"/>
-                <w:szCs w:val="22"/>
-              </w:rPr>
-              <w:t>_bloqueado</w:t>
-            </w:r>
-            <w:proofErr w:type="spellEnd"/>
-          </w:p>
-        </w:tc>
-        <w:tc>
-          <w:tcPr>
-            <w:tcW w:w="4680" w:type="dxa"/>
-            <w:tcBorders>
-              <w:top w:val="single" w:sz="1" w:space="0" w:color="CCCCCC"/>
-              <w:left w:val="single" w:sz="1" w:space="0" w:color="CCCCCC"/>
-              <w:bottom w:val="single" w:sz="1" w:space="0" w:color="CCCCCC"/>
-              <w:right w:val="single" w:sz="1" w:space="0" w:color="CCCCCC"/>
-            </w:tcBorders>
-            <w:tcMar>
-              <w:top w:w="80" w:type="dxa"/>
-              <w:left w:w="120" w:type="dxa"/>
-              <w:bottom w:w="80" w:type="dxa"/>
-              <w:right w:w="120" w:type="dxa"/>
-            </w:tcMar>
-          </w:tcPr>
-          <w:p>
-            <w:proofErr w:type="gramStart"/>
-            <w:r>
-              <w:rPr>
-                <w:sz w:val="22"/>
-                <w:szCs w:val="22"/>
-              </w:rPr>
-              <w:t>momento</w:t>
-            </w:r>
-            <w:proofErr w:type="gramEnd"/>
-            <w:r>
-              <w:rPr>
-                <w:sz w:val="22"/>
-                <w:szCs w:val="22"/>
-              </w:rPr>
-              <w:t xml:space="preserve"> em que foi bloqueado (</w:t>
-            </w:r>
-            <w:r>
-              <w:rPr>
-                <w:sz w:val="22"/>
-                <w:szCs w:val="22"/>
-              </w:rPr>
-              <w:t xml:space="preserve">por </w:t>
-            </w:r>
-            <w:r>
-              <w:rPr>
-                <w:sz w:val="22"/>
-                <w:szCs w:val="22"/>
-              </w:rPr>
-              <w:t xml:space="preserve">recurso ou </w:t>
-            </w:r>
-            <w:proofErr w:type="spellStart"/>
-            <w:r>
-              <w:rPr>
-                <w:sz w:val="22"/>
-                <w:szCs w:val="22"/>
-              </w:rPr>
-              <w:t>wait</w:t>
-            </w:r>
-            <w:proofErr w:type="spellEnd"/>
-            <w:r>
-              <w:rPr>
-                <w:sz w:val="22"/>
-                <w:szCs w:val="22"/>
-              </w:rPr>
-              <w:t>)</w:t>
+        <w:tc>
+          <w:tcPr>
+            <w:tcW w:w="4680" w:type="dxa"/>
+            <w:tcBorders>
+              <w:top w:val="single" w:sz="1" w:space="0" w:color="CCCCCC"/>
+              <w:left w:val="single" w:sz="1" w:space="0" w:color="CCCCCC"/>
+              <w:bottom w:val="single" w:sz="1" w:space="0" w:color="CCCCCC"/>
+              <w:right w:val="single" w:sz="1" w:space="0" w:color="CCCCCC"/>
+            </w:tcBorders>
+            <w:tcMar>
+              <w:top w:w="80" w:type="dxa"/>
+              <w:left w:w="120" w:type="dxa"/>
+              <w:bottom w:w="80" w:type="dxa"/>
+              <w:right w:w="120" w:type="dxa"/>
+            </w:tcMar>
+          </w:tcPr>
+          <w:p>
+            <w:proofErr w:type="spellStart"/>
+            <w:r>
+              <w:rPr>
+                <w:sz w:val="22"/>
+                <w:szCs w:val="22"/>
+              </w:rPr>
+              <w:t>tempo_inicio</w:t>
+            </w:r>
+            <w:proofErr w:type="spellEnd"/>
+            <w:r>
+              <w:rPr>
+                <w:sz w:val="22"/>
+                <w:szCs w:val="22"/>
+              </w:rPr>
+              <w:t xml:space="preserve"> / </w:t>
+            </w:r>
+            <w:proofErr w:type="spellStart"/>
+            <w:r>
+              <w:rPr>
+                <w:sz w:val="22"/>
+                <w:szCs w:val="22"/>
+              </w:rPr>
+              <w:t>tempo_fim</w:t>
+            </w:r>
+            <w:proofErr w:type="spellEnd"/>
+          </w:p>
+        </w:tc>
+        <w:tc>
+          <w:tcPr>
+            <w:tcW w:w="4680" w:type="dxa"/>
+            <w:tcBorders>
+              <w:top w:val="single" w:sz="1" w:space="0" w:color="CCCCCC"/>
+              <w:left w:val="single" w:sz="1" w:space="0" w:color="CCCCCC"/>
+              <w:bottom w:val="single" w:sz="1" w:space="0" w:color="CCCCCC"/>
+              <w:right w:val="single" w:sz="1" w:space="0" w:color="CCCCCC"/>
+            </w:tcBorders>
+            <w:tcMar>
+              <w:top w:w="80" w:type="dxa"/>
+              <w:left w:w="120" w:type="dxa"/>
+              <w:bottom w:w="80" w:type="dxa"/>
+              <w:right w:w="120" w:type="dxa"/>
+            </w:tcMar>
+          </w:tcPr>
+          <w:p>
+            <w:r>
+              <w:rPr>
+                <w:sz w:val="22"/>
+                <w:szCs w:val="22"/>
+              </w:rPr>
+              <w:t>Criação e finalização do processo</w:t>
             </w:r>
           </w:p>
         </w:tc>
       </w:tr>
       <w:tr>
-        <w:tblPrEx>
-          <w:tblCellMar>
-            <w:top w:w="0" w:type="dxa"/>
-            <w:bottom w:w="0" w:type="dxa"/>
-          </w:tblCellMar>
-        </w:tblPrEx>
-        <w:tc>
-          <w:tcPr>
-            <w:tcW w:w="4680" w:type="dxa"/>
-            <w:tcBorders>
-              <w:top w:val="single" w:sz="1" w:space="0" w:color="CCCCCC"/>
-              <w:left w:val="single" w:sz="1" w:space="0" w:color="CCCCCC"/>
-              <w:bottom w:val="single" w:sz="1" w:space="0" w:color="CCCCCC"/>
-              <w:right w:val="single" w:sz="1" w:space="0" w:color="CCCCCC"/>
-            </w:tcBorders>
-            <w:tcMar>
-              <w:top w:w="80" w:type="dxa"/>
-              <w:left w:w="120" w:type="dxa"/>
-              <w:bottom w:w="80" w:type="dxa"/>
-              <w:right w:w="120" w:type="dxa"/>
-            </w:tcMar>
-          </w:tcPr>
-          <w:p>
-            <w:proofErr w:type="spellStart"/>
-            <w:proofErr w:type="gramStart"/>
-            <w:r>
-              <w:rPr>
-                <w:sz w:val="22"/>
-                <w:szCs w:val="22"/>
-              </w:rPr>
-              <w:t>criou</w:t>
-            </w:r>
-            <w:proofErr w:type="gramEnd"/>
-            <w:r>
-              <w:rPr>
-                <w:sz w:val="22"/>
-                <w:szCs w:val="22"/>
-              </w:rPr>
-              <w:t>_filho</w:t>
-            </w:r>
-            <w:proofErr w:type="spellEnd"/>
-          </w:p>
-        </w:tc>
-        <w:tc>
-          <w:tcPr>
-            <w:tcW w:w="4680" w:type="dxa"/>
-            <w:tcBorders>
-              <w:top w:val="single" w:sz="1" w:space="0" w:color="CCCCCC"/>
-              <w:left w:val="single" w:sz="1" w:space="0" w:color="CCCCCC"/>
-              <w:bottom w:val="single" w:sz="1" w:space="0" w:color="CCCCCC"/>
-              <w:right w:val="single" w:sz="1" w:space="0" w:color="CCCCCC"/>
-            </w:tcBorders>
-            <w:tcMar>
-              <w:top w:w="80" w:type="dxa"/>
-              <w:left w:w="120" w:type="dxa"/>
-              <w:bottom w:w="80" w:type="dxa"/>
-              <w:right w:w="120" w:type="dxa"/>
-            </w:tcMar>
-          </w:tcPr>
-          <w:p>
-            <w:r>
-              <w:rPr>
-                <w:sz w:val="22"/>
-                <w:szCs w:val="22"/>
-              </w:rPr>
-              <w:t xml:space="preserve">1 se </w:t>
-            </w:r>
-            <w:proofErr w:type="spellStart"/>
-            <w:r>
-              <w:rPr>
-                <w:sz w:val="22"/>
-                <w:szCs w:val="22"/>
-              </w:rPr>
-              <w:t>ja</w:t>
-            </w:r>
-            <w:proofErr w:type="spellEnd"/>
-            <w:r>
-              <w:rPr>
-                <w:sz w:val="22"/>
-                <w:szCs w:val="22"/>
-              </w:rPr>
-              <w:t xml:space="preserve"> executou um </w:t>
-            </w:r>
-            <w:proofErr w:type="spellStart"/>
-            <w:r>
-              <w:rPr>
-                <w:sz w:val="22"/>
-                <w:szCs w:val="22"/>
-              </w:rPr>
-              <w:t>fork</w:t>
-            </w:r>
-            <w:proofErr w:type="spellEnd"/>
-            <w:r>
-              <w:rPr>
-                <w:sz w:val="22"/>
-                <w:szCs w:val="22"/>
-              </w:rPr>
-              <w:t xml:space="preserve"> durante sua vida</w:t>
+        <w:tc>
+          <w:tcPr>
+            <w:tcW w:w="4680" w:type="dxa"/>
+            <w:tcBorders>
+              <w:top w:val="single" w:sz="1" w:space="0" w:color="CCCCCC"/>
+              <w:left w:val="single" w:sz="1" w:space="0" w:color="CCCCCC"/>
+              <w:bottom w:val="single" w:sz="1" w:space="0" w:color="CCCCCC"/>
+              <w:right w:val="single" w:sz="1" w:space="0" w:color="CCCCCC"/>
+            </w:tcBorders>
+            <w:tcMar>
+              <w:top w:w="80" w:type="dxa"/>
+              <w:left w:w="120" w:type="dxa"/>
+              <w:bottom w:w="80" w:type="dxa"/>
+              <w:right w:w="120" w:type="dxa"/>
+            </w:tcMar>
+          </w:tcPr>
+          <w:p>
+            <w:proofErr w:type="spellStart"/>
+            <w:r>
+              <w:rPr>
+                <w:sz w:val="22"/>
+                <w:szCs w:val="22"/>
+              </w:rPr>
+              <w:t>entrou_pronto</w:t>
+            </w:r>
+            <w:proofErr w:type="spellEnd"/>
+          </w:p>
+        </w:tc>
+        <w:tc>
+          <w:tcPr>
+            <w:tcW w:w="4680" w:type="dxa"/>
+            <w:tcBorders>
+              <w:top w:val="single" w:sz="1" w:space="0" w:color="CCCCCC"/>
+              <w:left w:val="single" w:sz="1" w:space="0" w:color="CCCCCC"/>
+              <w:bottom w:val="single" w:sz="1" w:space="0" w:color="CCCCCC"/>
+              <w:right w:val="single" w:sz="1" w:space="0" w:color="CCCCCC"/>
+            </w:tcBorders>
+            <w:tcMar>
+              <w:top w:w="80" w:type="dxa"/>
+              <w:left w:w="120" w:type="dxa"/>
+              <w:bottom w:w="80" w:type="dxa"/>
+              <w:right w:w="120" w:type="dxa"/>
+            </w:tcMar>
+          </w:tcPr>
+          <w:p>
+            <w:r>
+              <w:rPr>
+                <w:sz w:val="22"/>
+                <w:szCs w:val="22"/>
+              </w:rPr>
+              <w:t>Quando</w:t>
+            </w:r>
+            <w:r>
+              <w:rPr>
+                <w:sz w:val="22"/>
+                <w:szCs w:val="22"/>
+              </w:rPr>
+              <w:t xml:space="preserve"> entrou na fila de pronto (usado para calcular espera)</w:t>
             </w:r>
           </w:p>
         </w:tc>
       </w:tr>
       <w:tr>
-        <w:tblPrEx>
-          <w:tblCellMar>
-            <w:top w:w="0" w:type="dxa"/>
-            <w:bottom w:w="0" w:type="dxa"/>
-          </w:tblCellMar>
-        </w:tblPrEx>
-        <w:tc>
-          <w:tcPr>
-            <w:tcW w:w="4680" w:type="dxa"/>
-            <w:tcBorders>
-              <w:top w:val="single" w:sz="1" w:space="0" w:color="CCCCCC"/>
-              <w:left w:val="single" w:sz="1" w:space="0" w:color="CCCCCC"/>
-              <w:bottom w:val="single" w:sz="1" w:space="0" w:color="CCCCCC"/>
-              <w:right w:val="single" w:sz="1" w:space="0" w:color="CCCCCC"/>
-            </w:tcBorders>
-            <w:tcMar>
-              <w:top w:w="80" w:type="dxa"/>
-              <w:left w:w="120" w:type="dxa"/>
-              <w:bottom w:w="80" w:type="dxa"/>
-              <w:right w:w="120" w:type="dxa"/>
-            </w:tcMar>
-          </w:tcPr>
-          <w:p>
-            <w:proofErr w:type="spellStart"/>
-            <w:proofErr w:type="gramStart"/>
-            <w:r>
-              <w:rPr>
-                <w:sz w:val="22"/>
-                <w:szCs w:val="22"/>
-              </w:rPr>
-              <w:t>esperando</w:t>
-            </w:r>
-            <w:proofErr w:type="gramEnd"/>
-            <w:r>
-              <w:rPr>
-                <w:sz w:val="22"/>
-                <w:szCs w:val="22"/>
-              </w:rPr>
-              <w:t>_filho</w:t>
-            </w:r>
-            <w:proofErr w:type="spellEnd"/>
-          </w:p>
-        </w:tc>
-        <w:tc>
-          <w:tcPr>
-            <w:tcW w:w="4680" w:type="dxa"/>
-            <w:tcBorders>
-              <w:top w:val="single" w:sz="1" w:space="0" w:color="CCCCCC"/>
-              <w:left w:val="single" w:sz="1" w:space="0" w:color="CCCCCC"/>
-              <w:bottom w:val="single" w:sz="1" w:space="0" w:color="CCCCCC"/>
-              <w:right w:val="single" w:sz="1" w:space="0" w:color="CCCCCC"/>
-            </w:tcBorders>
-            <w:tcMar>
-              <w:top w:w="80" w:type="dxa"/>
-              <w:left w:w="120" w:type="dxa"/>
-              <w:bottom w:w="80" w:type="dxa"/>
-              <w:right w:w="120" w:type="dxa"/>
-            </w:tcMar>
-          </w:tcPr>
-          <w:p>
-            <w:r>
-              <w:rPr>
-                <w:sz w:val="22"/>
-                <w:szCs w:val="22"/>
-              </w:rPr>
-              <w:t>1 se está</w:t>
-            </w:r>
-            <w:r>
-              <w:rPr>
-                <w:sz w:val="22"/>
-                <w:szCs w:val="22"/>
-              </w:rPr>
-              <w:t xml:space="preserve"> atualmente bloqueado em </w:t>
+        <w:tc>
+          <w:tcPr>
+            <w:tcW w:w="4680" w:type="dxa"/>
+            <w:tcBorders>
+              <w:top w:val="single" w:sz="1" w:space="0" w:color="CCCCCC"/>
+              <w:left w:val="single" w:sz="1" w:space="0" w:color="CCCCCC"/>
+              <w:bottom w:val="single" w:sz="1" w:space="0" w:color="CCCCCC"/>
+              <w:right w:val="single" w:sz="1" w:space="0" w:color="CCCCCC"/>
+            </w:tcBorders>
+            <w:tcMar>
+              <w:top w:w="80" w:type="dxa"/>
+              <w:left w:w="120" w:type="dxa"/>
+              <w:bottom w:w="80" w:type="dxa"/>
+              <w:right w:w="120" w:type="dxa"/>
+            </w:tcMar>
+          </w:tcPr>
+          <w:p>
+            <w:proofErr w:type="spellStart"/>
+            <w:r>
+              <w:rPr>
+                <w:sz w:val="22"/>
+                <w:szCs w:val="22"/>
+              </w:rPr>
+              <w:t>entrou_bloqueado</w:t>
+            </w:r>
+            <w:proofErr w:type="spellEnd"/>
+          </w:p>
+        </w:tc>
+        <w:tc>
+          <w:tcPr>
+            <w:tcW w:w="4680" w:type="dxa"/>
+            <w:tcBorders>
+              <w:top w:val="single" w:sz="1" w:space="0" w:color="CCCCCC"/>
+              <w:left w:val="single" w:sz="1" w:space="0" w:color="CCCCCC"/>
+              <w:bottom w:val="single" w:sz="1" w:space="0" w:color="CCCCCC"/>
+              <w:right w:val="single" w:sz="1" w:space="0" w:color="CCCCCC"/>
+            </w:tcBorders>
+            <w:tcMar>
+              <w:top w:w="80" w:type="dxa"/>
+              <w:left w:w="120" w:type="dxa"/>
+              <w:bottom w:w="80" w:type="dxa"/>
+              <w:right w:w="120" w:type="dxa"/>
+            </w:tcMar>
+          </w:tcPr>
+          <w:p>
+            <w:r>
+              <w:rPr>
+                <w:sz w:val="22"/>
+                <w:szCs w:val="22"/>
+              </w:rPr>
+              <w:t>momento</w:t>
+            </w:r>
+            <w:r>
+              <w:rPr>
+                <w:sz w:val="22"/>
+                <w:szCs w:val="22"/>
+              </w:rPr>
+              <w:t xml:space="preserve"> em que foi bloqueado (</w:t>
+            </w:r>
+            <w:r>
+              <w:rPr>
+                <w:sz w:val="22"/>
+                <w:szCs w:val="22"/>
+              </w:rPr>
+              <w:t xml:space="preserve">por </w:t>
+            </w:r>
+            <w:r>
+              <w:rPr>
+                <w:sz w:val="22"/>
+                <w:szCs w:val="22"/>
+              </w:rPr>
+              <w:t xml:space="preserve">recurso ou </w:t>
             </w:r>
             <w:proofErr w:type="spellStart"/>
             <w:r>
@@ -1802,333 +1559,433 @@
               <w:t>wait</w:t>
             </w:r>
             <w:proofErr w:type="spellEnd"/>
+            <w:r>
+              <w:rPr>
+                <w:sz w:val="22"/>
+                <w:szCs w:val="22"/>
+              </w:rPr>
+              <w:t>)</w:t>
+            </w:r>
           </w:p>
         </w:tc>
       </w:tr>
       <w:tr>
-        <w:tblPrEx>
-          <w:tblCellMar>
-            <w:top w:w="0" w:type="dxa"/>
-            <w:bottom w:w="0" w:type="dxa"/>
-          </w:tblCellMar>
-        </w:tblPrEx>
-        <w:tc>
-          <w:tcPr>
-            <w:tcW w:w="4680" w:type="dxa"/>
-            <w:tcBorders>
-              <w:top w:val="single" w:sz="1" w:space="0" w:color="CCCCCC"/>
-              <w:left w:val="single" w:sz="1" w:space="0" w:color="CCCCCC"/>
-              <w:bottom w:val="single" w:sz="1" w:space="0" w:color="CCCCCC"/>
-              <w:right w:val="single" w:sz="1" w:space="0" w:color="CCCCCC"/>
-            </w:tcBorders>
-            <w:tcMar>
-              <w:top w:w="80" w:type="dxa"/>
-              <w:left w:w="120" w:type="dxa"/>
-              <w:bottom w:w="80" w:type="dxa"/>
-              <w:right w:w="120" w:type="dxa"/>
-            </w:tcMar>
-          </w:tcPr>
-          <w:p>
-            <w:proofErr w:type="spellStart"/>
-            <w:proofErr w:type="gramStart"/>
-            <w:r>
-              <w:rPr>
-                <w:sz w:val="22"/>
-                <w:szCs w:val="22"/>
-              </w:rPr>
-              <w:t>possui</w:t>
-            </w:r>
-            <w:proofErr w:type="gramEnd"/>
-            <w:r>
-              <w:rPr>
-                <w:sz w:val="22"/>
-                <w:szCs w:val="22"/>
-              </w:rPr>
-              <w:t>_filho</w:t>
-            </w:r>
-            <w:proofErr w:type="spellEnd"/>
-          </w:p>
-        </w:tc>
-        <w:tc>
-          <w:tcPr>
-            <w:tcW w:w="4680" w:type="dxa"/>
-            <w:tcBorders>
-              <w:top w:val="single" w:sz="1" w:space="0" w:color="CCCCCC"/>
-              <w:left w:val="single" w:sz="1" w:space="0" w:color="CCCCCC"/>
-              <w:bottom w:val="single" w:sz="1" w:space="0" w:color="CCCCCC"/>
-              <w:right w:val="single" w:sz="1" w:space="0" w:color="CCCCCC"/>
-            </w:tcBorders>
-            <w:tcMar>
-              <w:top w:w="80" w:type="dxa"/>
-              <w:left w:w="120" w:type="dxa"/>
-              <w:bottom w:w="80" w:type="dxa"/>
-              <w:right w:w="120" w:type="dxa"/>
-            </w:tcMar>
-          </w:tcPr>
-          <w:p>
-            <w:r>
-              <w:rPr>
-                <w:sz w:val="22"/>
-                <w:szCs w:val="22"/>
-              </w:rPr>
-              <w:t>1 se ainda tem filhos vivos na lista</w:t>
+        <w:tc>
+          <w:tcPr>
+            <w:tcW w:w="4680" w:type="dxa"/>
+            <w:tcBorders>
+              <w:top w:val="single" w:sz="1" w:space="0" w:color="CCCCCC"/>
+              <w:left w:val="single" w:sz="1" w:space="0" w:color="CCCCCC"/>
+              <w:bottom w:val="single" w:sz="1" w:space="0" w:color="CCCCCC"/>
+              <w:right w:val="single" w:sz="1" w:space="0" w:color="CCCCCC"/>
+            </w:tcBorders>
+            <w:tcMar>
+              <w:top w:w="80" w:type="dxa"/>
+              <w:left w:w="120" w:type="dxa"/>
+              <w:bottom w:w="80" w:type="dxa"/>
+              <w:right w:w="120" w:type="dxa"/>
+            </w:tcMar>
+          </w:tcPr>
+          <w:p>
+            <w:proofErr w:type="spellStart"/>
+            <w:r>
+              <w:rPr>
+                <w:sz w:val="22"/>
+                <w:szCs w:val="22"/>
+              </w:rPr>
+              <w:t>criou_filho</w:t>
+            </w:r>
+            <w:proofErr w:type="spellEnd"/>
+          </w:p>
+        </w:tc>
+        <w:tc>
+          <w:tcPr>
+            <w:tcW w:w="4680" w:type="dxa"/>
+            <w:tcBorders>
+              <w:top w:val="single" w:sz="1" w:space="0" w:color="CCCCCC"/>
+              <w:left w:val="single" w:sz="1" w:space="0" w:color="CCCCCC"/>
+              <w:bottom w:val="single" w:sz="1" w:space="0" w:color="CCCCCC"/>
+              <w:right w:val="single" w:sz="1" w:space="0" w:color="CCCCCC"/>
+            </w:tcBorders>
+            <w:tcMar>
+              <w:top w:w="80" w:type="dxa"/>
+              <w:left w:w="120" w:type="dxa"/>
+              <w:bottom w:w="80" w:type="dxa"/>
+              <w:right w:w="120" w:type="dxa"/>
+            </w:tcMar>
+          </w:tcPr>
+          <w:p>
+            <w:r>
+              <w:rPr>
+                <w:sz w:val="22"/>
+                <w:szCs w:val="22"/>
+              </w:rPr>
+              <w:t xml:space="preserve">1 se </w:t>
+            </w:r>
+            <w:proofErr w:type="spellStart"/>
+            <w:r>
+              <w:rPr>
+                <w:sz w:val="22"/>
+                <w:szCs w:val="22"/>
+              </w:rPr>
+              <w:t>ja</w:t>
+            </w:r>
+            <w:proofErr w:type="spellEnd"/>
+            <w:r>
+              <w:rPr>
+                <w:sz w:val="22"/>
+                <w:szCs w:val="22"/>
+              </w:rPr>
+              <w:t xml:space="preserve"> executou um </w:t>
+            </w:r>
+            <w:proofErr w:type="spellStart"/>
+            <w:r>
+              <w:rPr>
+                <w:sz w:val="22"/>
+                <w:szCs w:val="22"/>
+              </w:rPr>
+              <w:t>fork</w:t>
+            </w:r>
+            <w:proofErr w:type="spellEnd"/>
+            <w:r>
+              <w:rPr>
+                <w:sz w:val="22"/>
+                <w:szCs w:val="22"/>
+              </w:rPr>
+              <w:t xml:space="preserve"> durante sua vida</w:t>
             </w:r>
           </w:p>
         </w:tc>
       </w:tr>
       <w:tr>
-        <w:tblPrEx>
-          <w:tblCellMar>
-            <w:top w:w="0" w:type="dxa"/>
-            <w:bottom w:w="0" w:type="dxa"/>
-          </w:tblCellMar>
-        </w:tblPrEx>
-        <w:tc>
-          <w:tcPr>
-            <w:tcW w:w="4680" w:type="dxa"/>
-            <w:tcBorders>
-              <w:top w:val="single" w:sz="1" w:space="0" w:color="CCCCCC"/>
-              <w:left w:val="single" w:sz="1" w:space="0" w:color="CCCCCC"/>
-              <w:bottom w:val="single" w:sz="1" w:space="0" w:color="CCCCCC"/>
-              <w:right w:val="single" w:sz="1" w:space="0" w:color="CCCCCC"/>
-            </w:tcBorders>
-            <w:tcMar>
-              <w:top w:w="80" w:type="dxa"/>
-              <w:left w:w="120" w:type="dxa"/>
-              <w:bottom w:w="80" w:type="dxa"/>
-              <w:right w:w="120" w:type="dxa"/>
-            </w:tcMar>
-          </w:tcPr>
-          <w:p>
-            <w:proofErr w:type="gramStart"/>
-            <w:r>
-              <w:rPr>
-                <w:sz w:val="22"/>
-                <w:szCs w:val="22"/>
-              </w:rPr>
-              <w:t>terminou</w:t>
-            </w:r>
-            <w:proofErr w:type="gramEnd"/>
-          </w:p>
-        </w:tc>
-        <w:tc>
-          <w:tcPr>
-            <w:tcW w:w="4680" w:type="dxa"/>
-            <w:tcBorders>
-              <w:top w:val="single" w:sz="1" w:space="0" w:color="CCCCCC"/>
-              <w:left w:val="single" w:sz="1" w:space="0" w:color="CCCCCC"/>
-              <w:bottom w:val="single" w:sz="1" w:space="0" w:color="CCCCCC"/>
-              <w:right w:val="single" w:sz="1" w:space="0" w:color="CCCCCC"/>
-            </w:tcBorders>
-            <w:tcMar>
-              <w:top w:w="80" w:type="dxa"/>
-              <w:left w:w="120" w:type="dxa"/>
-              <w:bottom w:w="80" w:type="dxa"/>
-              <w:right w:w="120" w:type="dxa"/>
-            </w:tcMar>
-          </w:tcPr>
-          <w:p>
-            <w:r>
-              <w:rPr>
-                <w:sz w:val="22"/>
-                <w:szCs w:val="22"/>
-              </w:rPr>
-              <w:t>1 se o proce</w:t>
-            </w:r>
-            <w:r>
-              <w:rPr>
-                <w:sz w:val="22"/>
-                <w:szCs w:val="22"/>
-              </w:rPr>
-              <w:t>sso finalizou</w:t>
-            </w:r>
+        <w:tc>
+          <w:tcPr>
+            <w:tcW w:w="4680" w:type="dxa"/>
+            <w:tcBorders>
+              <w:top w:val="single" w:sz="1" w:space="0" w:color="CCCCCC"/>
+              <w:left w:val="single" w:sz="1" w:space="0" w:color="CCCCCC"/>
+              <w:bottom w:val="single" w:sz="1" w:space="0" w:color="CCCCCC"/>
+              <w:right w:val="single" w:sz="1" w:space="0" w:color="CCCCCC"/>
+            </w:tcBorders>
+            <w:tcMar>
+              <w:top w:w="80" w:type="dxa"/>
+              <w:left w:w="120" w:type="dxa"/>
+              <w:bottom w:w="80" w:type="dxa"/>
+              <w:right w:w="120" w:type="dxa"/>
+            </w:tcMar>
+          </w:tcPr>
+          <w:p>
+            <w:proofErr w:type="spellStart"/>
+            <w:r>
+              <w:rPr>
+                <w:sz w:val="22"/>
+                <w:szCs w:val="22"/>
+              </w:rPr>
+              <w:t>esperando_filho</w:t>
+            </w:r>
+            <w:proofErr w:type="spellEnd"/>
+          </w:p>
+        </w:tc>
+        <w:tc>
+          <w:tcPr>
+            <w:tcW w:w="4680" w:type="dxa"/>
+            <w:tcBorders>
+              <w:top w:val="single" w:sz="1" w:space="0" w:color="CCCCCC"/>
+              <w:left w:val="single" w:sz="1" w:space="0" w:color="CCCCCC"/>
+              <w:bottom w:val="single" w:sz="1" w:space="0" w:color="CCCCCC"/>
+              <w:right w:val="single" w:sz="1" w:space="0" w:color="CCCCCC"/>
+            </w:tcBorders>
+            <w:tcMar>
+              <w:top w:w="80" w:type="dxa"/>
+              <w:left w:w="120" w:type="dxa"/>
+              <w:bottom w:w="80" w:type="dxa"/>
+              <w:right w:w="120" w:type="dxa"/>
+            </w:tcMar>
+          </w:tcPr>
+          <w:p>
+            <w:r>
+              <w:rPr>
+                <w:sz w:val="22"/>
+                <w:szCs w:val="22"/>
+              </w:rPr>
+              <w:t>1 se está</w:t>
+            </w:r>
+            <w:r>
+              <w:rPr>
+                <w:sz w:val="22"/>
+                <w:szCs w:val="22"/>
+              </w:rPr>
+              <w:t xml:space="preserve"> atualmente bloqueado em </w:t>
+            </w:r>
+            <w:proofErr w:type="spellStart"/>
+            <w:r>
+              <w:rPr>
+                <w:sz w:val="22"/>
+                <w:szCs w:val="22"/>
+              </w:rPr>
+              <w:t>wait</w:t>
+            </w:r>
+            <w:proofErr w:type="spellEnd"/>
           </w:p>
         </w:tc>
       </w:tr>
       <w:tr>
-        <w:tblPrEx>
-          <w:tblCellMar>
-            <w:top w:w="0" w:type="dxa"/>
-            <w:bottom w:w="0" w:type="dxa"/>
-          </w:tblCellMar>
-        </w:tblPrEx>
-        <w:tc>
-          <w:tcPr>
-            <w:tcW w:w="4680" w:type="dxa"/>
-            <w:tcBorders>
-              <w:top w:val="single" w:sz="1" w:space="0" w:color="CCCCCC"/>
-              <w:left w:val="single" w:sz="1" w:space="0" w:color="CCCCCC"/>
-              <w:bottom w:val="single" w:sz="1" w:space="0" w:color="CCCCCC"/>
-              <w:right w:val="single" w:sz="1" w:space="0" w:color="CCCCCC"/>
-            </w:tcBorders>
-            <w:tcMar>
-              <w:top w:w="80" w:type="dxa"/>
-              <w:left w:w="120" w:type="dxa"/>
-              <w:bottom w:w="80" w:type="dxa"/>
-              <w:right w:w="120" w:type="dxa"/>
-            </w:tcMar>
-          </w:tcPr>
-          <w:p>
-            <w:proofErr w:type="spellStart"/>
-            <w:proofErr w:type="gramStart"/>
-            <w:r>
-              <w:rPr>
-                <w:sz w:val="22"/>
-                <w:szCs w:val="22"/>
-              </w:rPr>
-              <w:t>tempo</w:t>
-            </w:r>
-            <w:proofErr w:type="gramEnd"/>
-            <w:r>
-              <w:rPr>
-                <w:sz w:val="22"/>
-                <w:szCs w:val="22"/>
-              </w:rPr>
-              <w:t>_fork</w:t>
-            </w:r>
-            <w:proofErr w:type="spellEnd"/>
-          </w:p>
-        </w:tc>
-        <w:tc>
-          <w:tcPr>
-            <w:tcW w:w="4680" w:type="dxa"/>
-            <w:tcBorders>
-              <w:top w:val="single" w:sz="1" w:space="0" w:color="CCCCCC"/>
-              <w:left w:val="single" w:sz="1" w:space="0" w:color="CCCCCC"/>
-              <w:bottom w:val="single" w:sz="1" w:space="0" w:color="CCCCCC"/>
-              <w:right w:val="single" w:sz="1" w:space="0" w:color="CCCCCC"/>
-            </w:tcBorders>
-            <w:tcMar>
-              <w:top w:w="80" w:type="dxa"/>
-              <w:left w:w="120" w:type="dxa"/>
-              <w:bottom w:w="80" w:type="dxa"/>
-              <w:right w:w="120" w:type="dxa"/>
-            </w:tcMar>
-          </w:tcPr>
-          <w:p>
-            <w:r>
-              <w:rPr>
-                <w:sz w:val="22"/>
-                <w:szCs w:val="22"/>
-              </w:rPr>
-              <w:t xml:space="preserve">Instante em que fez o </w:t>
-            </w:r>
-            <w:proofErr w:type="spellStart"/>
-            <w:r>
-              <w:rPr>
-                <w:sz w:val="22"/>
-                <w:szCs w:val="22"/>
-              </w:rPr>
-              <w:t>fork</w:t>
-            </w:r>
-            <w:proofErr w:type="spellEnd"/>
-            <w:r>
-              <w:rPr>
-                <w:sz w:val="22"/>
-                <w:szCs w:val="22"/>
-              </w:rPr>
-              <w:t xml:space="preserve"> (-1 se nunca fez)</w:t>
+        <w:tc>
+          <w:tcPr>
+            <w:tcW w:w="4680" w:type="dxa"/>
+            <w:tcBorders>
+              <w:top w:val="single" w:sz="1" w:space="0" w:color="CCCCCC"/>
+              <w:left w:val="single" w:sz="1" w:space="0" w:color="CCCCCC"/>
+              <w:bottom w:val="single" w:sz="1" w:space="0" w:color="CCCCCC"/>
+              <w:right w:val="single" w:sz="1" w:space="0" w:color="CCCCCC"/>
+            </w:tcBorders>
+            <w:tcMar>
+              <w:top w:w="80" w:type="dxa"/>
+              <w:left w:w="120" w:type="dxa"/>
+              <w:bottom w:w="80" w:type="dxa"/>
+              <w:right w:w="120" w:type="dxa"/>
+            </w:tcMar>
+          </w:tcPr>
+          <w:p>
+            <w:proofErr w:type="spellStart"/>
+            <w:r>
+              <w:rPr>
+                <w:sz w:val="22"/>
+                <w:szCs w:val="22"/>
+              </w:rPr>
+              <w:t>possui_filho</w:t>
+            </w:r>
+            <w:proofErr w:type="spellEnd"/>
+          </w:p>
+        </w:tc>
+        <w:tc>
+          <w:tcPr>
+            <w:tcW w:w="4680" w:type="dxa"/>
+            <w:tcBorders>
+              <w:top w:val="single" w:sz="1" w:space="0" w:color="CCCCCC"/>
+              <w:left w:val="single" w:sz="1" w:space="0" w:color="CCCCCC"/>
+              <w:bottom w:val="single" w:sz="1" w:space="0" w:color="CCCCCC"/>
+              <w:right w:val="single" w:sz="1" w:space="0" w:color="CCCCCC"/>
+            </w:tcBorders>
+            <w:tcMar>
+              <w:top w:w="80" w:type="dxa"/>
+              <w:left w:w="120" w:type="dxa"/>
+              <w:bottom w:w="80" w:type="dxa"/>
+              <w:right w:w="120" w:type="dxa"/>
+            </w:tcMar>
+          </w:tcPr>
+          <w:p>
+            <w:r>
+              <w:rPr>
+                <w:sz w:val="22"/>
+                <w:szCs w:val="22"/>
+              </w:rPr>
+              <w:t>1 se ainda tem filhos vivos na lista</w:t>
             </w:r>
           </w:p>
         </w:tc>
       </w:tr>
       <w:tr>
-        <w:tblPrEx>
-          <w:tblCellMar>
-            <w:top w:w="0" w:type="dxa"/>
-            <w:bottom w:w="0" w:type="dxa"/>
-          </w:tblCellMar>
-        </w:tblPrEx>
-        <w:tc>
-          <w:tcPr>
-            <w:tcW w:w="4680" w:type="dxa"/>
-            <w:tcBorders>
-              <w:top w:val="single" w:sz="1" w:space="0" w:color="CCCCCC"/>
-              <w:left w:val="single" w:sz="1" w:space="0" w:color="CCCCCC"/>
-              <w:bottom w:val="single" w:sz="1" w:space="0" w:color="CCCCCC"/>
-              <w:right w:val="single" w:sz="1" w:space="0" w:color="CCCCCC"/>
-            </w:tcBorders>
-            <w:tcMar>
-              <w:top w:w="80" w:type="dxa"/>
-              <w:left w:w="120" w:type="dxa"/>
-              <w:bottom w:w="80" w:type="dxa"/>
-              <w:right w:w="120" w:type="dxa"/>
-            </w:tcMar>
-          </w:tcPr>
-          <w:p>
-            <w:proofErr w:type="spellStart"/>
-            <w:proofErr w:type="gramStart"/>
-            <w:r>
-              <w:rPr>
-                <w:sz w:val="22"/>
-                <w:szCs w:val="22"/>
-              </w:rPr>
-              <w:t>lista</w:t>
-            </w:r>
-            <w:proofErr w:type="gramEnd"/>
-            <w:r>
-              <w:rPr>
-                <w:sz w:val="22"/>
-                <w:szCs w:val="22"/>
-              </w:rPr>
-              <w:t>_filhos</w:t>
-            </w:r>
-            <w:proofErr w:type="spellEnd"/>
-          </w:p>
-        </w:tc>
-        <w:tc>
-          <w:tcPr>
-            <w:tcW w:w="4680" w:type="dxa"/>
-            <w:tcBorders>
-              <w:top w:val="single" w:sz="1" w:space="0" w:color="CCCCCC"/>
-              <w:left w:val="single" w:sz="1" w:space="0" w:color="CCCCCC"/>
-              <w:bottom w:val="single" w:sz="1" w:space="0" w:color="CCCCCC"/>
-              <w:right w:val="single" w:sz="1" w:space="0" w:color="CCCCCC"/>
-            </w:tcBorders>
-            <w:tcMar>
-              <w:top w:w="80" w:type="dxa"/>
-              <w:left w:w="120" w:type="dxa"/>
-              <w:bottom w:w="80" w:type="dxa"/>
-              <w:right w:w="120" w:type="dxa"/>
-            </w:tcMar>
-          </w:tcPr>
-          <w:p>
-            <w:r>
-              <w:rPr>
-                <w:sz w:val="22"/>
-                <w:szCs w:val="22"/>
-              </w:rPr>
-              <w:t>Ponteiro para a lista encadeada de filhos</w:t>
+        <w:tc>
+          <w:tcPr>
+            <w:tcW w:w="4680" w:type="dxa"/>
+            <w:tcBorders>
+              <w:top w:val="single" w:sz="1" w:space="0" w:color="CCCCCC"/>
+              <w:left w:val="single" w:sz="1" w:space="0" w:color="CCCCCC"/>
+              <w:bottom w:val="single" w:sz="1" w:space="0" w:color="CCCCCC"/>
+              <w:right w:val="single" w:sz="1" w:space="0" w:color="CCCCCC"/>
+            </w:tcBorders>
+            <w:tcMar>
+              <w:top w:w="80" w:type="dxa"/>
+              <w:left w:w="120" w:type="dxa"/>
+              <w:bottom w:w="80" w:type="dxa"/>
+              <w:right w:w="120" w:type="dxa"/>
+            </w:tcMar>
+          </w:tcPr>
+          <w:p>
+            <w:r>
+              <w:rPr>
+                <w:sz w:val="22"/>
+                <w:szCs w:val="22"/>
+              </w:rPr>
+              <w:t>terminou</w:t>
+            </w:r>
+          </w:p>
+        </w:tc>
+        <w:tc>
+          <w:tcPr>
+            <w:tcW w:w="4680" w:type="dxa"/>
+            <w:tcBorders>
+              <w:top w:val="single" w:sz="1" w:space="0" w:color="CCCCCC"/>
+              <w:left w:val="single" w:sz="1" w:space="0" w:color="CCCCCC"/>
+              <w:bottom w:val="single" w:sz="1" w:space="0" w:color="CCCCCC"/>
+              <w:right w:val="single" w:sz="1" w:space="0" w:color="CCCCCC"/>
+            </w:tcBorders>
+            <w:tcMar>
+              <w:top w:w="80" w:type="dxa"/>
+              <w:left w:w="120" w:type="dxa"/>
+              <w:bottom w:w="80" w:type="dxa"/>
+              <w:right w:w="120" w:type="dxa"/>
+            </w:tcMar>
+          </w:tcPr>
+          <w:p>
+            <w:r>
+              <w:rPr>
+                <w:sz w:val="22"/>
+                <w:szCs w:val="22"/>
+              </w:rPr>
+              <w:t>1 se o processo finalizou</w:t>
             </w:r>
           </w:p>
         </w:tc>
       </w:tr>
       <w:tr>
-        <w:tblPrEx>
-          <w:tblCellMar>
-            <w:top w:w="0" w:type="dxa"/>
-            <w:bottom w:w="0" w:type="dxa"/>
-          </w:tblCellMar>
-        </w:tblPrEx>
-        <w:tc>
-          <w:tcPr>
-            <w:tcW w:w="4680" w:type="dxa"/>
-            <w:tcBorders>
-              <w:top w:val="single" w:sz="1" w:space="0" w:color="CCCCCC"/>
-              <w:left w:val="single" w:sz="1" w:space="0" w:color="CCCCCC"/>
-              <w:bottom w:val="single" w:sz="1" w:space="0" w:color="CCCCCC"/>
-              <w:right w:val="single" w:sz="1" w:space="0" w:color="CCCCCC"/>
-            </w:tcBorders>
-            <w:tcMar>
-              <w:top w:w="80" w:type="dxa"/>
-              <w:left w:w="120" w:type="dxa"/>
-              <w:bottom w:w="80" w:type="dxa"/>
-              <w:right w:w="120" w:type="dxa"/>
-            </w:tcMar>
-          </w:tcPr>
-          <w:p>
-            <w:proofErr w:type="spellStart"/>
-            <w:proofErr w:type="gramStart"/>
+        <w:tc>
+          <w:tcPr>
+            <w:tcW w:w="4680" w:type="dxa"/>
+            <w:tcBorders>
+              <w:top w:val="single" w:sz="1" w:space="0" w:color="CCCCCC"/>
+              <w:left w:val="single" w:sz="1" w:space="0" w:color="CCCCCC"/>
+              <w:bottom w:val="single" w:sz="1" w:space="0" w:color="CCCCCC"/>
+              <w:right w:val="single" w:sz="1" w:space="0" w:color="CCCCCC"/>
+            </w:tcBorders>
+            <w:tcMar>
+              <w:top w:w="80" w:type="dxa"/>
+              <w:left w:w="120" w:type="dxa"/>
+              <w:bottom w:w="80" w:type="dxa"/>
+              <w:right w:w="120" w:type="dxa"/>
+            </w:tcMar>
+          </w:tcPr>
+          <w:p>
+            <w:proofErr w:type="spellStart"/>
+            <w:r>
+              <w:rPr>
+                <w:sz w:val="22"/>
+                <w:szCs w:val="22"/>
+              </w:rPr>
+              <w:t>tempo_fork</w:t>
+            </w:r>
+            <w:proofErr w:type="spellEnd"/>
+          </w:p>
+        </w:tc>
+        <w:tc>
+          <w:tcPr>
+            <w:tcW w:w="4680" w:type="dxa"/>
+            <w:tcBorders>
+              <w:top w:val="single" w:sz="1" w:space="0" w:color="CCCCCC"/>
+              <w:left w:val="single" w:sz="1" w:space="0" w:color="CCCCCC"/>
+              <w:bottom w:val="single" w:sz="1" w:space="0" w:color="CCCCCC"/>
+              <w:right w:val="single" w:sz="1" w:space="0" w:color="CCCCCC"/>
+            </w:tcBorders>
+            <w:tcMar>
+              <w:top w:w="80" w:type="dxa"/>
+              <w:left w:w="120" w:type="dxa"/>
+              <w:bottom w:w="80" w:type="dxa"/>
+              <w:right w:w="120" w:type="dxa"/>
+            </w:tcMar>
+          </w:tcPr>
+          <w:p>
+            <w:r>
+              <w:rPr>
+                <w:sz w:val="22"/>
+                <w:szCs w:val="22"/>
+              </w:rPr>
+              <w:t xml:space="preserve">Instante em que fez o </w:t>
+            </w:r>
+            <w:proofErr w:type="spellStart"/>
+            <w:r>
+              <w:rPr>
+                <w:sz w:val="22"/>
+                <w:szCs w:val="22"/>
+              </w:rPr>
+              <w:t>fork</w:t>
+            </w:r>
+            <w:proofErr w:type="spellEnd"/>
+            <w:r>
+              <w:rPr>
+                <w:sz w:val="22"/>
+                <w:szCs w:val="22"/>
+              </w:rPr>
+              <w:t xml:space="preserve"> (-1 se nunca fez)</w:t>
+            </w:r>
+          </w:p>
+        </w:tc>
+      </w:tr>
+      <w:tr>
+        <w:tc>
+          <w:tcPr>
+            <w:tcW w:w="4680" w:type="dxa"/>
+            <w:tcBorders>
+              <w:top w:val="single" w:sz="1" w:space="0" w:color="CCCCCC"/>
+              <w:left w:val="single" w:sz="1" w:space="0" w:color="CCCCCC"/>
+              <w:bottom w:val="single" w:sz="1" w:space="0" w:color="CCCCCC"/>
+              <w:right w:val="single" w:sz="1" w:space="0" w:color="CCCCCC"/>
+            </w:tcBorders>
+            <w:tcMar>
+              <w:top w:w="80" w:type="dxa"/>
+              <w:left w:w="120" w:type="dxa"/>
+              <w:bottom w:w="80" w:type="dxa"/>
+              <w:right w:w="120" w:type="dxa"/>
+            </w:tcMar>
+          </w:tcPr>
+          <w:p>
+            <w:proofErr w:type="spellStart"/>
+            <w:r>
+              <w:rPr>
+                <w:sz w:val="22"/>
+                <w:szCs w:val="22"/>
+              </w:rPr>
+              <w:t>lista_filhos</w:t>
+            </w:r>
+            <w:proofErr w:type="spellEnd"/>
+          </w:p>
+        </w:tc>
+        <w:tc>
+          <w:tcPr>
+            <w:tcW w:w="4680" w:type="dxa"/>
+            <w:tcBorders>
+              <w:top w:val="single" w:sz="1" w:space="0" w:color="CCCCCC"/>
+              <w:left w:val="single" w:sz="1" w:space="0" w:color="CCCCCC"/>
+              <w:bottom w:val="single" w:sz="1" w:space="0" w:color="CCCCCC"/>
+              <w:right w:val="single" w:sz="1" w:space="0" w:color="CCCCCC"/>
+            </w:tcBorders>
+            <w:tcMar>
+              <w:top w:w="80" w:type="dxa"/>
+              <w:left w:w="120" w:type="dxa"/>
+              <w:bottom w:w="80" w:type="dxa"/>
+              <w:right w:w="120" w:type="dxa"/>
+            </w:tcMar>
+          </w:tcPr>
+          <w:p>
+            <w:r>
+              <w:rPr>
+                <w:sz w:val="22"/>
+                <w:szCs w:val="22"/>
+              </w:rPr>
+              <w:t>Ponteiro para a lista encadeada de filhos</w:t>
+            </w:r>
+          </w:p>
+        </w:tc>
+      </w:tr>
+      <w:tr>
+        <w:tc>
+          <w:tcPr>
+            <w:tcW w:w="4680" w:type="dxa"/>
+            <w:tcBorders>
+              <w:top w:val="single" w:sz="1" w:space="0" w:color="CCCCCC"/>
+              <w:left w:val="single" w:sz="1" w:space="0" w:color="CCCCCC"/>
+              <w:bottom w:val="single" w:sz="1" w:space="0" w:color="CCCCCC"/>
+              <w:right w:val="single" w:sz="1" w:space="0" w:color="CCCCCC"/>
+            </w:tcBorders>
+            <w:tcMar>
+              <w:top w:w="80" w:type="dxa"/>
+              <w:left w:w="120" w:type="dxa"/>
+              <w:bottom w:w="80" w:type="dxa"/>
+              <w:right w:w="120" w:type="dxa"/>
+            </w:tcMar>
+          </w:tcPr>
+          <w:p>
+            <w:proofErr w:type="spellStart"/>
             <w:r>
               <w:rPr>
                 <w:sz w:val="22"/>
@@ -2137,7 +1994,6 @@
               <w:t>prox</w:t>
             </w:r>
             <w:proofErr w:type="spellEnd"/>
-            <w:proofErr w:type="gramEnd"/>
           </w:p>
         </w:tc>
         <w:tc>
@@ -2194,10 +2050,7 @@
     </w:p>
     <w:p>
       <w:r>
-        <w:t xml:space="preserve">Implementa uma fila encadeada </w:t>
-      </w:r>
-      <w:r>
-        <w:t>(FIFO) que pode</w:t>
+        <w:t>Implementa uma fila encadeada (FIFO) que pode</w:t>
       </w:r>
       <w:r>
         <w:t xml:space="preserve"> assumir diferentes finalidades.</w:t>
@@ -2226,12 +2079,6 @@
         <w:gridCol w:w="4680"/>
       </w:tblGrid>
       <w:tr>
-        <w:tblPrEx>
-          <w:tblCellMar>
-            <w:top w:w="0" w:type="dxa"/>
-            <w:bottom w:w="0" w:type="dxa"/>
-          </w:tblCellMar>
-        </w:tblPrEx>
         <w:tc>
           <w:tcPr>
             <w:tcW w:w="4680" w:type="dxa"/>
@@ -2294,12 +2141,6 @@
         </w:tc>
       </w:tr>
       <w:tr>
-        <w:tblPrEx>
-          <w:tblCellMar>
-            <w:top w:w="0" w:type="dxa"/>
-            <w:bottom w:w="0" w:type="dxa"/>
-          </w:tblCellMar>
-        </w:tblPrEx>
         <w:tc>
           <w:tcPr>
             <w:tcW w:w="4680" w:type="dxa"/>
@@ -2354,12 +2195,6 @@
         </w:tc>
       </w:tr>
       <w:tr>
-        <w:tblPrEx>
-          <w:tblCellMar>
-            <w:top w:w="0" w:type="dxa"/>
-            <w:bottom w:w="0" w:type="dxa"/>
-          </w:tblCellMar>
-        </w:tblPrEx>
         <w:tc>
           <w:tcPr>
             <w:tcW w:w="4680" w:type="dxa"/>
@@ -2414,12 +2249,6 @@
         </w:tc>
       </w:tr>
       <w:tr>
-        <w:tblPrEx>
-          <w:tblCellMar>
-            <w:top w:w="0" w:type="dxa"/>
-            <w:bottom w:w="0" w:type="dxa"/>
-          </w:tblCellMar>
-        </w:tblPrEx>
         <w:tc>
           <w:tcPr>
             <w:tcW w:w="4680" w:type="dxa"/>
@@ -2474,12 +2303,72 @@
         </w:tc>
       </w:tr>
       <w:tr>
-        <w:tblPrEx>
-          <w:tblCellMar>
-            <w:top w:w="0" w:type="dxa"/>
-            <w:bottom w:w="0" w:type="dxa"/>
-          </w:tblCellMar>
-        </w:tblPrEx>
+        <w:tc>
+          <w:tcPr>
+            <w:tcW w:w="4680" w:type="dxa"/>
+            <w:tcBorders>
+              <w:top w:val="single" w:sz="1" w:space="0" w:color="CCCCCC"/>
+              <w:left w:val="single" w:sz="1" w:space="0" w:color="CCCCCC"/>
+              <w:bottom w:val="single" w:sz="1" w:space="0" w:color="CCCCCC"/>
+              <w:right w:val="single" w:sz="1" w:space="0" w:color="CCCCCC"/>
+            </w:tcBorders>
+            <w:tcMar>
+              <w:top w:w="80" w:type="dxa"/>
+              <w:left w:w="120" w:type="dxa"/>
+              <w:bottom w:w="80" w:type="dxa"/>
+              <w:right w:w="120" w:type="dxa"/>
+            </w:tcMar>
+          </w:tcPr>
+          <w:p>
+            <w:pPr>
+              <w:rPr>
+                <w:sz w:val="22"/>
+                <w:szCs w:val="22"/>
+              </w:rPr>
+            </w:pPr>
+            <w:r>
+              <w:rPr>
+                <w:sz w:val="22"/>
+                <w:szCs w:val="22"/>
+              </w:rPr>
+              <w:t>10</w:t>
+            </w:r>
+          </w:p>
+        </w:tc>
+        <w:tc>
+          <w:tcPr>
+            <w:tcW w:w="4680" w:type="dxa"/>
+            <w:tcBorders>
+              <w:top w:val="single" w:sz="1" w:space="0" w:color="CCCCCC"/>
+              <w:left w:val="single" w:sz="1" w:space="0" w:color="CCCCCC"/>
+              <w:bottom w:val="single" w:sz="1" w:space="0" w:color="CCCCCC"/>
+              <w:right w:val="single" w:sz="1" w:space="0" w:color="CCCCCC"/>
+            </w:tcBorders>
+            <w:tcMar>
+              <w:top w:w="80" w:type="dxa"/>
+              <w:left w:w="120" w:type="dxa"/>
+              <w:bottom w:w="80" w:type="dxa"/>
+              <w:right w:w="120" w:type="dxa"/>
+            </w:tcMar>
+          </w:tcPr>
+          <w:p>
+            <w:pPr>
+              <w:rPr>
+                <w:sz w:val="22"/>
+                <w:szCs w:val="22"/>
+              </w:rPr>
+            </w:pPr>
+            <w:r>
+              <w:rPr>
+                <w:sz w:val="22"/>
+                <w:szCs w:val="22"/>
+              </w:rPr>
+              <w:t>Fila de Processos Finalizados</w:t>
+            </w:r>
+          </w:p>
+        </w:tc>
+      </w:tr>
+      <w:tr>
         <w:tc>
           <w:tcPr>
             <w:tcW w:w="4680" w:type="dxa"/>
@@ -2628,12 +2517,6 @@
         <w:gridCol w:w="4680"/>
       </w:tblGrid>
       <w:tr>
-        <w:tblPrEx>
-          <w:tblCellMar>
-            <w:top w:w="0" w:type="dxa"/>
-            <w:bottom w:w="0" w:type="dxa"/>
-          </w:tblCellMar>
-        </w:tblPrEx>
         <w:tc>
           <w:tcPr>
             <w:tcW w:w="4680" w:type="dxa"/>
@@ -2696,45 +2579,30 @@
         </w:tc>
       </w:tr>
       <w:tr>
-        <w:tblPrEx>
-          <w:tblCellMar>
-            <w:top w:w="0" w:type="dxa"/>
-            <w:bottom w:w="0" w:type="dxa"/>
-          </w:tblCellMar>
-        </w:tblPrEx>
-        <w:tc>
-          <w:tcPr>
-            <w:tcW w:w="4680" w:type="dxa"/>
-            <w:tcBorders>
-              <w:top w:val="single" w:sz="1" w:space="0" w:color="CCCCCC"/>
-              <w:left w:val="single" w:sz="1" w:space="0" w:color="CCCCCC"/>
-              <w:bottom w:val="single" w:sz="1" w:space="0" w:color="CCCCCC"/>
-              <w:right w:val="single" w:sz="1" w:space="0" w:color="CCCCCC"/>
-            </w:tcBorders>
-            <w:tcMar>
-              <w:top w:w="80" w:type="dxa"/>
-              <w:left w:w="120" w:type="dxa"/>
-              <w:bottom w:w="80" w:type="dxa"/>
-              <w:right w:w="120" w:type="dxa"/>
-            </w:tcMar>
-          </w:tcPr>
-          <w:p>
-            <w:proofErr w:type="spellStart"/>
-            <w:proofErr w:type="gramStart"/>
-            <w:r>
-              <w:rPr>
-                <w:sz w:val="22"/>
-                <w:szCs w:val="22"/>
-              </w:rPr>
-              <w:t>criar</w:t>
-            </w:r>
-            <w:proofErr w:type="gramEnd"/>
-            <w:r>
-              <w:rPr>
-                <w:sz w:val="22"/>
-                <w:szCs w:val="22"/>
-              </w:rPr>
-              <w:t>_fila</w:t>
+        <w:tc>
+          <w:tcPr>
+            <w:tcW w:w="4680" w:type="dxa"/>
+            <w:tcBorders>
+              <w:top w:val="single" w:sz="1" w:space="0" w:color="CCCCCC"/>
+              <w:left w:val="single" w:sz="1" w:space="0" w:color="CCCCCC"/>
+              <w:bottom w:val="single" w:sz="1" w:space="0" w:color="CCCCCC"/>
+              <w:right w:val="single" w:sz="1" w:space="0" w:color="CCCCCC"/>
+            </w:tcBorders>
+            <w:tcMar>
+              <w:top w:w="80" w:type="dxa"/>
+              <w:left w:w="120" w:type="dxa"/>
+              <w:bottom w:w="80" w:type="dxa"/>
+              <w:right w:w="120" w:type="dxa"/>
+            </w:tcMar>
+          </w:tcPr>
+          <w:p>
+            <w:proofErr w:type="spellStart"/>
+            <w:r>
+              <w:rPr>
+                <w:sz w:val="22"/>
+                <w:szCs w:val="22"/>
+              </w:rPr>
+              <w:t>criar_fila</w:t>
             </w:r>
             <w:proofErr w:type="spellEnd"/>
             <w:r>
@@ -2774,45 +2642,31 @@
         </w:tc>
       </w:tr>
       <w:tr>
-        <w:tblPrEx>
-          <w:tblCellMar>
-            <w:top w:w="0" w:type="dxa"/>
-            <w:bottom w:w="0" w:type="dxa"/>
-          </w:tblCellMar>
-        </w:tblPrEx>
-        <w:tc>
-          <w:tcPr>
-            <w:tcW w:w="4680" w:type="dxa"/>
-            <w:tcBorders>
-              <w:top w:val="single" w:sz="1" w:space="0" w:color="CCCCCC"/>
-              <w:left w:val="single" w:sz="1" w:space="0" w:color="CCCCCC"/>
-              <w:bottom w:val="single" w:sz="1" w:space="0" w:color="CCCCCC"/>
-              <w:right w:val="single" w:sz="1" w:space="0" w:color="CCCCCC"/>
-            </w:tcBorders>
-            <w:tcMar>
-              <w:top w:w="80" w:type="dxa"/>
-              <w:left w:w="120" w:type="dxa"/>
-              <w:bottom w:w="80" w:type="dxa"/>
-              <w:right w:w="120" w:type="dxa"/>
-            </w:tcMar>
-          </w:tcPr>
-          <w:p>
-            <w:proofErr w:type="spellStart"/>
-            <w:proofErr w:type="gramStart"/>
-            <w:r>
-              <w:rPr>
-                <w:sz w:val="22"/>
-                <w:szCs w:val="22"/>
-              </w:rPr>
-              <w:t>fila</w:t>
-            </w:r>
-            <w:proofErr w:type="gramEnd"/>
-            <w:r>
-              <w:rPr>
-                <w:sz w:val="22"/>
-                <w:szCs w:val="22"/>
-              </w:rPr>
-              <w:t>_vazia</w:t>
+        <w:tc>
+          <w:tcPr>
+            <w:tcW w:w="4680" w:type="dxa"/>
+            <w:tcBorders>
+              <w:top w:val="single" w:sz="1" w:space="0" w:color="CCCCCC"/>
+              <w:left w:val="single" w:sz="1" w:space="0" w:color="CCCCCC"/>
+              <w:bottom w:val="single" w:sz="1" w:space="0" w:color="CCCCCC"/>
+              <w:right w:val="single" w:sz="1" w:space="0" w:color="CCCCCC"/>
+            </w:tcBorders>
+            <w:tcMar>
+              <w:top w:w="80" w:type="dxa"/>
+              <w:left w:w="120" w:type="dxa"/>
+              <w:bottom w:w="80" w:type="dxa"/>
+              <w:right w:w="120" w:type="dxa"/>
+            </w:tcMar>
+          </w:tcPr>
+          <w:p>
+            <w:proofErr w:type="spellStart"/>
+            <w:r>
+              <w:rPr>
+                <w:sz w:val="22"/>
+                <w:szCs w:val="22"/>
+              </w:rPr>
+              <w:lastRenderedPageBreak/>
+              <w:t>fila_vazia</w:t>
             </w:r>
             <w:proofErr w:type="spellEnd"/>
             <w:r>
@@ -2868,38 +2722,46 @@
         </w:tc>
       </w:tr>
       <w:tr>
-        <w:tblPrEx>
-          <w:tblCellMar>
-            <w:top w:w="0" w:type="dxa"/>
-            <w:bottom w:w="0" w:type="dxa"/>
-          </w:tblCellMar>
-        </w:tblPrEx>
-        <w:tc>
-          <w:tcPr>
-            <w:tcW w:w="4680" w:type="dxa"/>
-            <w:tcBorders>
-              <w:top w:val="single" w:sz="1" w:space="0" w:color="CCCCCC"/>
-              <w:left w:val="single" w:sz="1" w:space="0" w:color="CCCCCC"/>
-              <w:bottom w:val="single" w:sz="1" w:space="0" w:color="CCCCCC"/>
-              <w:right w:val="single" w:sz="1" w:space="0" w:color="CCCCCC"/>
-            </w:tcBorders>
-            <w:tcMar>
-              <w:top w:w="80" w:type="dxa"/>
-              <w:left w:w="120" w:type="dxa"/>
-              <w:bottom w:w="80" w:type="dxa"/>
-              <w:right w:w="120" w:type="dxa"/>
-            </w:tcMar>
-          </w:tcPr>
-          <w:p>
-            <w:proofErr w:type="spellStart"/>
+        <w:tc>
+          <w:tcPr>
+            <w:tcW w:w="4680" w:type="dxa"/>
+            <w:tcBorders>
+              <w:top w:val="single" w:sz="1" w:space="0" w:color="CCCCCC"/>
+              <w:left w:val="single" w:sz="1" w:space="0" w:color="CCCCCC"/>
+              <w:bottom w:val="single" w:sz="1" w:space="0" w:color="CCCCCC"/>
+              <w:right w:val="single" w:sz="1" w:space="0" w:color="CCCCCC"/>
+            </w:tcBorders>
+            <w:tcMar>
+              <w:top w:w="80" w:type="dxa"/>
+              <w:left w:w="120" w:type="dxa"/>
+              <w:bottom w:w="80" w:type="dxa"/>
+              <w:right w:w="120" w:type="dxa"/>
+            </w:tcMar>
+          </w:tcPr>
+          <w:p>
+            <w:proofErr w:type="spellStart"/>
+            <w:r>
+              <w:rPr>
+                <w:sz w:val="22"/>
+                <w:szCs w:val="22"/>
+              </w:rPr>
+              <w:t>inserir_na_</w:t>
+            </w:r>
             <w:proofErr w:type="gramStart"/>
             <w:r>
               <w:rPr>
                 <w:sz w:val="22"/>
                 <w:szCs w:val="22"/>
               </w:rPr>
-              <w:lastRenderedPageBreak/>
-              <w:t>inserir</w:t>
+              <w:t>fila</w:t>
+            </w:r>
+            <w:proofErr w:type="spellEnd"/>
+            <w:r>
+              <w:rPr>
+                <w:sz w:val="22"/>
+                <w:szCs w:val="22"/>
+              </w:rPr>
+              <w:t>(</w:t>
             </w:r>
             <w:proofErr w:type="gramEnd"/>
             <w:r>
@@ -2907,15 +2769,7 @@
                 <w:sz w:val="22"/>
                 <w:szCs w:val="22"/>
               </w:rPr>
-              <w:t>_na_fila</w:t>
-            </w:r>
-            <w:proofErr w:type="spellEnd"/>
-            <w:r>
-              <w:rPr>
-                <w:sz w:val="22"/>
-                <w:szCs w:val="22"/>
-              </w:rPr>
-              <w:t>(f, p)</w:t>
+              <w:t>f, p)</w:t>
             </w:r>
           </w:p>
         </w:tc>
@@ -2961,45 +2815,30 @@
         </w:tc>
       </w:tr>
       <w:tr>
-        <w:tblPrEx>
-          <w:tblCellMar>
-            <w:top w:w="0" w:type="dxa"/>
-            <w:bottom w:w="0" w:type="dxa"/>
-          </w:tblCellMar>
-        </w:tblPrEx>
-        <w:tc>
-          <w:tcPr>
-            <w:tcW w:w="4680" w:type="dxa"/>
-            <w:tcBorders>
-              <w:top w:val="single" w:sz="1" w:space="0" w:color="CCCCCC"/>
-              <w:left w:val="single" w:sz="1" w:space="0" w:color="CCCCCC"/>
-              <w:bottom w:val="single" w:sz="1" w:space="0" w:color="CCCCCC"/>
-              <w:right w:val="single" w:sz="1" w:space="0" w:color="CCCCCC"/>
-            </w:tcBorders>
-            <w:tcMar>
-              <w:top w:w="80" w:type="dxa"/>
-              <w:left w:w="120" w:type="dxa"/>
-              <w:bottom w:w="80" w:type="dxa"/>
-              <w:right w:w="120" w:type="dxa"/>
-            </w:tcMar>
-          </w:tcPr>
-          <w:p>
-            <w:proofErr w:type="spellStart"/>
-            <w:proofErr w:type="gramStart"/>
-            <w:r>
-              <w:rPr>
-                <w:sz w:val="22"/>
-                <w:szCs w:val="22"/>
-              </w:rPr>
-              <w:t>remover</w:t>
-            </w:r>
-            <w:proofErr w:type="gramEnd"/>
-            <w:r>
-              <w:rPr>
-                <w:sz w:val="22"/>
-                <w:szCs w:val="22"/>
-              </w:rPr>
-              <w:t>_da_fila</w:t>
+        <w:tc>
+          <w:tcPr>
+            <w:tcW w:w="4680" w:type="dxa"/>
+            <w:tcBorders>
+              <w:top w:val="single" w:sz="1" w:space="0" w:color="CCCCCC"/>
+              <w:left w:val="single" w:sz="1" w:space="0" w:color="CCCCCC"/>
+              <w:bottom w:val="single" w:sz="1" w:space="0" w:color="CCCCCC"/>
+              <w:right w:val="single" w:sz="1" w:space="0" w:color="CCCCCC"/>
+            </w:tcBorders>
+            <w:tcMar>
+              <w:top w:w="80" w:type="dxa"/>
+              <w:left w:w="120" w:type="dxa"/>
+              <w:bottom w:w="80" w:type="dxa"/>
+              <w:right w:w="120" w:type="dxa"/>
+            </w:tcMar>
+          </w:tcPr>
+          <w:p>
+            <w:proofErr w:type="spellStart"/>
+            <w:r>
+              <w:rPr>
+                <w:sz w:val="22"/>
+                <w:szCs w:val="22"/>
+              </w:rPr>
+              <w:t>remover_da_fila</w:t>
             </w:r>
             <w:proofErr w:type="spellEnd"/>
             <w:r>
@@ -3055,37 +2894,62 @@
         </w:tc>
       </w:tr>
       <w:tr>
-        <w:tblPrEx>
-          <w:tblCellMar>
-            <w:top w:w="0" w:type="dxa"/>
-            <w:bottom w:w="0" w:type="dxa"/>
-          </w:tblCellMar>
-        </w:tblPrEx>
-        <w:tc>
-          <w:tcPr>
-            <w:tcW w:w="4680" w:type="dxa"/>
-            <w:tcBorders>
-              <w:top w:val="single" w:sz="1" w:space="0" w:color="CCCCCC"/>
-              <w:left w:val="single" w:sz="1" w:space="0" w:color="CCCCCC"/>
-              <w:bottom w:val="single" w:sz="1" w:space="0" w:color="CCCCCC"/>
-              <w:right w:val="single" w:sz="1" w:space="0" w:color="CCCCCC"/>
-            </w:tcBorders>
-            <w:tcMar>
-              <w:top w:w="80" w:type="dxa"/>
-              <w:left w:w="120" w:type="dxa"/>
-              <w:bottom w:w="80" w:type="dxa"/>
-              <w:right w:w="120" w:type="dxa"/>
-            </w:tcMar>
-          </w:tcPr>
-          <w:p>
-            <w:proofErr w:type="spellStart"/>
+        <w:tc>
+          <w:tcPr>
+            <w:tcW w:w="4680" w:type="dxa"/>
+            <w:tcBorders>
+              <w:top w:val="single" w:sz="1" w:space="0" w:color="CCCCCC"/>
+              <w:left w:val="single" w:sz="1" w:space="0" w:color="CCCCCC"/>
+              <w:bottom w:val="single" w:sz="1" w:space="0" w:color="CCCCCC"/>
+              <w:right w:val="single" w:sz="1" w:space="0" w:color="CCCCCC"/>
+            </w:tcBorders>
+            <w:tcMar>
+              <w:top w:w="80" w:type="dxa"/>
+              <w:left w:w="120" w:type="dxa"/>
+              <w:bottom w:w="80" w:type="dxa"/>
+              <w:right w:w="120" w:type="dxa"/>
+            </w:tcMar>
+          </w:tcPr>
+          <w:p>
+            <w:proofErr w:type="spellStart"/>
+            <w:r>
+              <w:rPr>
+                <w:sz w:val="22"/>
+                <w:szCs w:val="22"/>
+              </w:rPr>
+              <w:t>recursos_vazios</w:t>
+            </w:r>
+            <w:proofErr w:type="spellEnd"/>
+            <w:r>
+              <w:rPr>
+                <w:sz w:val="22"/>
+                <w:szCs w:val="22"/>
+              </w:rPr>
+              <w:t>(</w:t>
+            </w:r>
+            <w:proofErr w:type="spellStart"/>
+            <w:r>
+              <w:rPr>
+                <w:sz w:val="22"/>
+                <w:szCs w:val="22"/>
+              </w:rPr>
+              <w:t>fila_</w:t>
+            </w:r>
             <w:proofErr w:type="gramStart"/>
             <w:r>
               <w:rPr>
                 <w:sz w:val="22"/>
                 <w:szCs w:val="22"/>
               </w:rPr>
-              <w:t>recursos</w:t>
+              <w:t>recurso</w:t>
+            </w:r>
+            <w:proofErr w:type="spellEnd"/>
+            <w:r>
+              <w:rPr>
+                <w:sz w:val="22"/>
+                <w:szCs w:val="22"/>
+              </w:rPr>
+              <w:t>[</w:t>
             </w:r>
             <w:proofErr w:type="gramEnd"/>
             <w:r>
@@ -3093,31 +2957,7 @@
                 <w:sz w:val="22"/>
                 <w:szCs w:val="22"/>
               </w:rPr>
-              <w:t>_vazios</w:t>
-            </w:r>
-            <w:proofErr w:type="spellEnd"/>
-            <w:r>
-              <w:rPr>
-                <w:sz w:val="22"/>
-                <w:szCs w:val="22"/>
-              </w:rPr>
-              <w:t>(</w:t>
-            </w:r>
-            <w:proofErr w:type="spellStart"/>
-            <w:r>
-              <w:rPr>
-                <w:sz w:val="22"/>
-                <w:szCs w:val="22"/>
-              </w:rPr>
-              <w:t>fila_recurso</w:t>
-            </w:r>
-            <w:proofErr w:type="spellEnd"/>
-            <w:r>
-              <w:rPr>
-                <w:sz w:val="22"/>
-                <w:szCs w:val="22"/>
-              </w:rPr>
-              <w:t>[])</w:t>
+              <w:t>])</w:t>
             </w:r>
           </w:p>
         </w:tc>
@@ -3222,12 +3062,6 @@
         <w:gridCol w:w="4680"/>
       </w:tblGrid>
       <w:tr>
-        <w:tblPrEx>
-          <w:tblCellMar>
-            <w:top w:w="0" w:type="dxa"/>
-            <w:bottom w:w="0" w:type="dxa"/>
-          </w:tblCellMar>
-        </w:tblPrEx>
         <w:tc>
           <w:tcPr>
             <w:tcW w:w="4680" w:type="dxa"/>
@@ -3290,55 +3124,49 @@
         </w:tc>
       </w:tr>
       <w:tr>
-        <w:tblPrEx>
-          <w:tblCellMar>
-            <w:top w:w="0" w:type="dxa"/>
-            <w:bottom w:w="0" w:type="dxa"/>
-          </w:tblCellMar>
-        </w:tblPrEx>
-        <w:tc>
-          <w:tcPr>
-            <w:tcW w:w="4680" w:type="dxa"/>
-            <w:tcBorders>
-              <w:top w:val="single" w:sz="1" w:space="0" w:color="CCCCCC"/>
-              <w:left w:val="single" w:sz="1" w:space="0" w:color="CCCCCC"/>
-              <w:bottom w:val="single" w:sz="1" w:space="0" w:color="CCCCCC"/>
-              <w:right w:val="single" w:sz="1" w:space="0" w:color="CCCCCC"/>
-            </w:tcBorders>
-            <w:tcMar>
-              <w:top w:w="80" w:type="dxa"/>
-              <w:left w:w="120" w:type="dxa"/>
-              <w:bottom w:w="80" w:type="dxa"/>
-              <w:right w:w="120" w:type="dxa"/>
-            </w:tcMar>
-          </w:tcPr>
-          <w:p>
-            <w:proofErr w:type="spellStart"/>
+        <w:tc>
+          <w:tcPr>
+            <w:tcW w:w="4680" w:type="dxa"/>
+            <w:tcBorders>
+              <w:top w:val="single" w:sz="1" w:space="0" w:color="CCCCCC"/>
+              <w:left w:val="single" w:sz="1" w:space="0" w:color="CCCCCC"/>
+              <w:bottom w:val="single" w:sz="1" w:space="0" w:color="CCCCCC"/>
+              <w:right w:val="single" w:sz="1" w:space="0" w:color="CCCCCC"/>
+            </w:tcBorders>
+            <w:tcMar>
+              <w:top w:w="80" w:type="dxa"/>
+              <w:left w:w="120" w:type="dxa"/>
+              <w:bottom w:w="80" w:type="dxa"/>
+              <w:right w:w="120" w:type="dxa"/>
+            </w:tcMar>
+          </w:tcPr>
+          <w:p>
+            <w:proofErr w:type="spellStart"/>
+            <w:r>
+              <w:rPr>
+                <w:sz w:val="22"/>
+                <w:szCs w:val="22"/>
+              </w:rPr>
+              <w:t>criar_</w:t>
+            </w:r>
             <w:proofErr w:type="gramStart"/>
             <w:r>
               <w:rPr>
                 <w:sz w:val="22"/>
                 <w:szCs w:val="22"/>
               </w:rPr>
-              <w:t>criar</w:t>
-            </w:r>
+              <w:t>processo</w:t>
+            </w:r>
+            <w:proofErr w:type="spellEnd"/>
+            <w:r>
+              <w:rPr>
+                <w:sz w:val="22"/>
+                <w:szCs w:val="22"/>
+              </w:rPr>
+              <w:t>(</w:t>
+            </w:r>
+            <w:proofErr w:type="spellStart"/>
             <w:proofErr w:type="gramEnd"/>
-            <w:r>
-              <w:rPr>
-                <w:sz w:val="22"/>
-                <w:szCs w:val="22"/>
-              </w:rPr>
-              <w:t>_processo</w:t>
-            </w:r>
-            <w:proofErr w:type="spellEnd"/>
-            <w:r>
-              <w:rPr>
-                <w:sz w:val="22"/>
-                <w:szCs w:val="22"/>
-              </w:rPr>
-              <w:t>(</w:t>
-            </w:r>
-            <w:proofErr w:type="spellStart"/>
             <w:r>
               <w:rPr>
                 <w:sz w:val="22"/>
@@ -3423,37 +3251,46 @@
         </w:tc>
       </w:tr>
       <w:tr>
-        <w:tblPrEx>
-          <w:tblCellMar>
-            <w:top w:w="0" w:type="dxa"/>
-            <w:bottom w:w="0" w:type="dxa"/>
-          </w:tblCellMar>
-        </w:tblPrEx>
-        <w:tc>
-          <w:tcPr>
-            <w:tcW w:w="4680" w:type="dxa"/>
-            <w:tcBorders>
-              <w:top w:val="single" w:sz="1" w:space="0" w:color="CCCCCC"/>
-              <w:left w:val="single" w:sz="1" w:space="0" w:color="CCCCCC"/>
-              <w:bottom w:val="single" w:sz="1" w:space="0" w:color="CCCCCC"/>
-              <w:right w:val="single" w:sz="1" w:space="0" w:color="CCCCCC"/>
-            </w:tcBorders>
-            <w:tcMar>
-              <w:top w:w="80" w:type="dxa"/>
-              <w:left w:w="120" w:type="dxa"/>
-              <w:bottom w:w="80" w:type="dxa"/>
-              <w:right w:w="120" w:type="dxa"/>
-            </w:tcMar>
-          </w:tcPr>
-          <w:p>
-            <w:proofErr w:type="spellStart"/>
+        <w:tc>
+          <w:tcPr>
+            <w:tcW w:w="4680" w:type="dxa"/>
+            <w:tcBorders>
+              <w:top w:val="single" w:sz="1" w:space="0" w:color="CCCCCC"/>
+              <w:left w:val="single" w:sz="1" w:space="0" w:color="CCCCCC"/>
+              <w:bottom w:val="single" w:sz="1" w:space="0" w:color="CCCCCC"/>
+              <w:right w:val="single" w:sz="1" w:space="0" w:color="CCCCCC"/>
+            </w:tcBorders>
+            <w:tcMar>
+              <w:top w:w="80" w:type="dxa"/>
+              <w:left w:w="120" w:type="dxa"/>
+              <w:bottom w:w="80" w:type="dxa"/>
+              <w:right w:w="120" w:type="dxa"/>
+            </w:tcMar>
+          </w:tcPr>
+          <w:p>
+            <w:proofErr w:type="spellStart"/>
+            <w:r>
+              <w:rPr>
+                <w:sz w:val="22"/>
+                <w:szCs w:val="22"/>
+              </w:rPr>
+              <w:t>adicionar_</w:t>
+            </w:r>
             <w:proofErr w:type="gramStart"/>
             <w:r>
               <w:rPr>
                 <w:sz w:val="22"/>
                 <w:szCs w:val="22"/>
               </w:rPr>
-              <w:t>adicionar</w:t>
+              <w:t>filho</w:t>
+            </w:r>
+            <w:proofErr w:type="spellEnd"/>
+            <w:r>
+              <w:rPr>
+                <w:sz w:val="22"/>
+                <w:szCs w:val="22"/>
+              </w:rPr>
+              <w:t>(</w:t>
             </w:r>
             <w:proofErr w:type="gramEnd"/>
             <w:r>
@@ -3461,15 +3298,7 @@
                 <w:sz w:val="22"/>
                 <w:szCs w:val="22"/>
               </w:rPr>
-              <w:t>_filho</w:t>
-            </w:r>
-            <w:proofErr w:type="spellEnd"/>
-            <w:r>
-              <w:rPr>
-                <w:sz w:val="22"/>
-                <w:szCs w:val="22"/>
-              </w:rPr>
-              <w:t xml:space="preserve">(pai, </w:t>
+              <w:t xml:space="preserve">pai, </w:t>
             </w:r>
             <w:proofErr w:type="spellStart"/>
             <w:r>
@@ -3524,37 +3353,46 @@
         </w:tc>
       </w:tr>
       <w:tr>
-        <w:tblPrEx>
-          <w:tblCellMar>
-            <w:top w:w="0" w:type="dxa"/>
-            <w:bottom w:w="0" w:type="dxa"/>
-          </w:tblCellMar>
-        </w:tblPrEx>
-        <w:tc>
-          <w:tcPr>
-            <w:tcW w:w="4680" w:type="dxa"/>
-            <w:tcBorders>
-              <w:top w:val="single" w:sz="1" w:space="0" w:color="CCCCCC"/>
-              <w:left w:val="single" w:sz="1" w:space="0" w:color="CCCCCC"/>
-              <w:bottom w:val="single" w:sz="1" w:space="0" w:color="CCCCCC"/>
-              <w:right w:val="single" w:sz="1" w:space="0" w:color="CCCCCC"/>
-            </w:tcBorders>
-            <w:tcMar>
-              <w:top w:w="80" w:type="dxa"/>
-              <w:left w:w="120" w:type="dxa"/>
-              <w:bottom w:w="80" w:type="dxa"/>
-              <w:right w:w="120" w:type="dxa"/>
-            </w:tcMar>
-          </w:tcPr>
-          <w:p>
-            <w:proofErr w:type="spellStart"/>
+        <w:tc>
+          <w:tcPr>
+            <w:tcW w:w="4680" w:type="dxa"/>
+            <w:tcBorders>
+              <w:top w:val="single" w:sz="1" w:space="0" w:color="CCCCCC"/>
+              <w:left w:val="single" w:sz="1" w:space="0" w:color="CCCCCC"/>
+              <w:bottom w:val="single" w:sz="1" w:space="0" w:color="CCCCCC"/>
+              <w:right w:val="single" w:sz="1" w:space="0" w:color="CCCCCC"/>
+            </w:tcBorders>
+            <w:tcMar>
+              <w:top w:w="80" w:type="dxa"/>
+              <w:left w:w="120" w:type="dxa"/>
+              <w:bottom w:w="80" w:type="dxa"/>
+              <w:right w:w="120" w:type="dxa"/>
+            </w:tcMar>
+          </w:tcPr>
+          <w:p>
+            <w:proofErr w:type="spellStart"/>
+            <w:r>
+              <w:rPr>
+                <w:sz w:val="22"/>
+                <w:szCs w:val="22"/>
+              </w:rPr>
+              <w:t>liberar_</w:t>
+            </w:r>
             <w:proofErr w:type="gramStart"/>
             <w:r>
               <w:rPr>
                 <w:sz w:val="22"/>
                 <w:szCs w:val="22"/>
               </w:rPr>
-              <w:t>liberar</w:t>
+              <w:t>filho</w:t>
+            </w:r>
+            <w:proofErr w:type="spellEnd"/>
+            <w:r>
+              <w:rPr>
+                <w:sz w:val="22"/>
+                <w:szCs w:val="22"/>
+              </w:rPr>
+              <w:t>(</w:t>
             </w:r>
             <w:proofErr w:type="gramEnd"/>
             <w:r>
@@ -3562,15 +3400,7 @@
                 <w:sz w:val="22"/>
                 <w:szCs w:val="22"/>
               </w:rPr>
-              <w:t>_filho</w:t>
-            </w:r>
-            <w:proofErr w:type="spellEnd"/>
-            <w:r>
-              <w:rPr>
-                <w:sz w:val="22"/>
-                <w:szCs w:val="22"/>
-              </w:rPr>
-              <w:t xml:space="preserve">(p, </w:t>
+              <w:t xml:space="preserve">p, </w:t>
             </w:r>
             <w:proofErr w:type="spellStart"/>
             <w:r>
@@ -3614,8 +3444,6 @@
               </w:rPr>
               <w:t>Remove um filho especifico da lista encadeada pelo seu PID, corrigindo os ponteiros</w:t>
             </w:r>
-            <w:bookmarkStart w:id="0" w:name="_GoBack"/>
-            <w:bookmarkEnd w:id="0"/>
           </w:p>
         </w:tc>
       </w:tr>
@@ -3690,12 +3518,6 @@
         <w:gridCol w:w="4680"/>
       </w:tblGrid>
       <w:tr>
-        <w:tblPrEx>
-          <w:tblCellMar>
-            <w:top w:w="0" w:type="dxa"/>
-            <w:bottom w:w="0" w:type="dxa"/>
-          </w:tblCellMar>
-        </w:tblPrEx>
         <w:tc>
           <w:tcPr>
             <w:tcW w:w="4680" w:type="dxa"/>
@@ -3758,37 +3580,46 @@
         </w:tc>
       </w:tr>
       <w:tr>
-        <w:tblPrEx>
-          <w:tblCellMar>
-            <w:top w:w="0" w:type="dxa"/>
-            <w:bottom w:w="0" w:type="dxa"/>
-          </w:tblCellMar>
-        </w:tblPrEx>
-        <w:tc>
-          <w:tcPr>
-            <w:tcW w:w="4680" w:type="dxa"/>
-            <w:tcBorders>
-              <w:top w:val="single" w:sz="1" w:space="0" w:color="CCCCCC"/>
-              <w:left w:val="single" w:sz="1" w:space="0" w:color="CCCCCC"/>
-              <w:bottom w:val="single" w:sz="1" w:space="0" w:color="CCCCCC"/>
-              <w:right w:val="single" w:sz="1" w:space="0" w:color="CCCCCC"/>
-            </w:tcBorders>
-            <w:tcMar>
-              <w:top w:w="80" w:type="dxa"/>
-              <w:left w:w="120" w:type="dxa"/>
-              <w:bottom w:w="80" w:type="dxa"/>
-              <w:right w:w="120" w:type="dxa"/>
-            </w:tcMar>
-          </w:tcPr>
-          <w:p>
-            <w:proofErr w:type="spellStart"/>
+        <w:tc>
+          <w:tcPr>
+            <w:tcW w:w="4680" w:type="dxa"/>
+            <w:tcBorders>
+              <w:top w:val="single" w:sz="1" w:space="0" w:color="CCCCCC"/>
+              <w:left w:val="single" w:sz="1" w:space="0" w:color="CCCCCC"/>
+              <w:bottom w:val="single" w:sz="1" w:space="0" w:color="CCCCCC"/>
+              <w:right w:val="single" w:sz="1" w:space="0" w:color="CCCCCC"/>
+            </w:tcBorders>
+            <w:tcMar>
+              <w:top w:w="80" w:type="dxa"/>
+              <w:left w:w="120" w:type="dxa"/>
+              <w:bottom w:w="80" w:type="dxa"/>
+              <w:right w:w="120" w:type="dxa"/>
+            </w:tcMar>
+          </w:tcPr>
+          <w:p>
+            <w:proofErr w:type="spellStart"/>
+            <w:r>
+              <w:rPr>
+                <w:sz w:val="22"/>
+                <w:szCs w:val="22"/>
+              </w:rPr>
+              <w:t>fazer_</w:t>
+            </w:r>
             <w:proofErr w:type="gramStart"/>
             <w:r>
               <w:rPr>
                 <w:sz w:val="22"/>
                 <w:szCs w:val="22"/>
               </w:rPr>
-              <w:t>fazer</w:t>
+              <w:t>fork</w:t>
+            </w:r>
+            <w:proofErr w:type="spellEnd"/>
+            <w:r>
+              <w:rPr>
+                <w:sz w:val="22"/>
+                <w:szCs w:val="22"/>
+              </w:rPr>
+              <w:t>(</w:t>
             </w:r>
             <w:proofErr w:type="gramEnd"/>
             <w:r>
@@ -3796,15 +3627,7 @@
                 <w:sz w:val="22"/>
                 <w:szCs w:val="22"/>
               </w:rPr>
-              <w:t>_fork</w:t>
-            </w:r>
-            <w:proofErr w:type="spellEnd"/>
-            <w:r>
-              <w:rPr>
-                <w:sz w:val="22"/>
-                <w:szCs w:val="22"/>
-              </w:rPr>
-              <w:t xml:space="preserve">(pai, </w:t>
+              <w:t xml:space="preserve">pai, </w:t>
             </w:r>
             <w:proofErr w:type="spellStart"/>
             <w:r>
@@ -3898,37 +3721,46 @@
         </w:tc>
       </w:tr>
       <w:tr>
-        <w:tblPrEx>
-          <w:tblCellMar>
-            <w:top w:w="0" w:type="dxa"/>
-            <w:bottom w:w="0" w:type="dxa"/>
-          </w:tblCellMar>
-        </w:tblPrEx>
-        <w:tc>
-          <w:tcPr>
-            <w:tcW w:w="4680" w:type="dxa"/>
-            <w:tcBorders>
-              <w:top w:val="single" w:sz="1" w:space="0" w:color="CCCCCC"/>
-              <w:left w:val="single" w:sz="1" w:space="0" w:color="CCCCCC"/>
-              <w:bottom w:val="single" w:sz="1" w:space="0" w:color="CCCCCC"/>
-              <w:right w:val="single" w:sz="1" w:space="0" w:color="CCCCCC"/>
-            </w:tcBorders>
-            <w:tcMar>
-              <w:top w:w="80" w:type="dxa"/>
-              <w:left w:w="120" w:type="dxa"/>
-              <w:bottom w:w="80" w:type="dxa"/>
-              <w:right w:w="120" w:type="dxa"/>
-            </w:tcMar>
-          </w:tcPr>
-          <w:p>
-            <w:proofErr w:type="spellStart"/>
+        <w:tc>
+          <w:tcPr>
+            <w:tcW w:w="4680" w:type="dxa"/>
+            <w:tcBorders>
+              <w:top w:val="single" w:sz="1" w:space="0" w:color="CCCCCC"/>
+              <w:left w:val="single" w:sz="1" w:space="0" w:color="CCCCCC"/>
+              <w:bottom w:val="single" w:sz="1" w:space="0" w:color="CCCCCC"/>
+              <w:right w:val="single" w:sz="1" w:space="0" w:color="CCCCCC"/>
+            </w:tcBorders>
+            <w:tcMar>
+              <w:top w:w="80" w:type="dxa"/>
+              <w:left w:w="120" w:type="dxa"/>
+              <w:bottom w:w="80" w:type="dxa"/>
+              <w:right w:w="120" w:type="dxa"/>
+            </w:tcMar>
+          </w:tcPr>
+          <w:p>
+            <w:proofErr w:type="spellStart"/>
+            <w:r>
+              <w:rPr>
+                <w:sz w:val="22"/>
+                <w:szCs w:val="22"/>
+              </w:rPr>
+              <w:t>fazer_</w:t>
+            </w:r>
             <w:proofErr w:type="gramStart"/>
             <w:r>
               <w:rPr>
                 <w:sz w:val="22"/>
                 <w:szCs w:val="22"/>
               </w:rPr>
-              <w:t>fazer</w:t>
+              <w:t>wait</w:t>
+            </w:r>
+            <w:proofErr w:type="spellEnd"/>
+            <w:r>
+              <w:rPr>
+                <w:sz w:val="22"/>
+                <w:szCs w:val="22"/>
+              </w:rPr>
+              <w:t>(</w:t>
             </w:r>
             <w:proofErr w:type="gramEnd"/>
             <w:r>
@@ -3936,15 +3768,7 @@
                 <w:sz w:val="22"/>
                 <w:szCs w:val="22"/>
               </w:rPr>
-              <w:t>_wait</w:t>
-            </w:r>
-            <w:proofErr w:type="spellEnd"/>
-            <w:r>
-              <w:rPr>
-                <w:sz w:val="22"/>
-                <w:szCs w:val="22"/>
-              </w:rPr>
-              <w:t xml:space="preserve">(pai, </w:t>
+              <w:t xml:space="preserve">pai, </w:t>
             </w:r>
             <w:proofErr w:type="spellStart"/>
             <w:r>
@@ -4031,55 +3855,49 @@
         </w:tc>
       </w:tr>
       <w:tr>
-        <w:tblPrEx>
-          <w:tblCellMar>
-            <w:top w:w="0" w:type="dxa"/>
-            <w:bottom w:w="0" w:type="dxa"/>
-          </w:tblCellMar>
-        </w:tblPrEx>
-        <w:tc>
-          <w:tcPr>
-            <w:tcW w:w="4680" w:type="dxa"/>
-            <w:tcBorders>
-              <w:top w:val="single" w:sz="1" w:space="0" w:color="CCCCCC"/>
-              <w:left w:val="single" w:sz="1" w:space="0" w:color="CCCCCC"/>
-              <w:bottom w:val="single" w:sz="1" w:space="0" w:color="CCCCCC"/>
-              <w:right w:val="single" w:sz="1" w:space="0" w:color="CCCCCC"/>
-            </w:tcBorders>
-            <w:tcMar>
-              <w:top w:w="80" w:type="dxa"/>
-              <w:left w:w="120" w:type="dxa"/>
-              <w:bottom w:w="80" w:type="dxa"/>
-              <w:right w:w="120" w:type="dxa"/>
-            </w:tcMar>
-          </w:tcPr>
-          <w:p>
-            <w:proofErr w:type="spellStart"/>
+        <w:tc>
+          <w:tcPr>
+            <w:tcW w:w="4680" w:type="dxa"/>
+            <w:tcBorders>
+              <w:top w:val="single" w:sz="1" w:space="0" w:color="CCCCCC"/>
+              <w:left w:val="single" w:sz="1" w:space="0" w:color="CCCCCC"/>
+              <w:bottom w:val="single" w:sz="1" w:space="0" w:color="CCCCCC"/>
+              <w:right w:val="single" w:sz="1" w:space="0" w:color="CCCCCC"/>
+            </w:tcBorders>
+            <w:tcMar>
+              <w:top w:w="80" w:type="dxa"/>
+              <w:left w:w="120" w:type="dxa"/>
+              <w:bottom w:w="80" w:type="dxa"/>
+              <w:right w:w="120" w:type="dxa"/>
+            </w:tcMar>
+          </w:tcPr>
+          <w:p>
+            <w:proofErr w:type="spellStart"/>
+            <w:r>
+              <w:rPr>
+                <w:sz w:val="22"/>
+                <w:szCs w:val="22"/>
+              </w:rPr>
+              <w:t>verificar_termino_</w:t>
+            </w:r>
             <w:proofErr w:type="gramStart"/>
             <w:r>
               <w:rPr>
                 <w:sz w:val="22"/>
                 <w:szCs w:val="22"/>
               </w:rPr>
-              <w:t>verificar</w:t>
-            </w:r>
+              <w:t>filho</w:t>
+            </w:r>
+            <w:proofErr w:type="spellEnd"/>
+            <w:r>
+              <w:rPr>
+                <w:sz w:val="22"/>
+                <w:szCs w:val="22"/>
+              </w:rPr>
+              <w:t>(</w:t>
+            </w:r>
+            <w:proofErr w:type="spellStart"/>
             <w:proofErr w:type="gramEnd"/>
-            <w:r>
-              <w:rPr>
-                <w:sz w:val="22"/>
-                <w:szCs w:val="22"/>
-              </w:rPr>
-              <w:t>_termino_filho</w:t>
-            </w:r>
-            <w:proofErr w:type="spellEnd"/>
-            <w:r>
-              <w:rPr>
-                <w:sz w:val="22"/>
-                <w:szCs w:val="22"/>
-              </w:rPr>
-              <w:t>(</w:t>
-            </w:r>
-            <w:proofErr w:type="spellStart"/>
             <w:r>
               <w:rPr>
                 <w:sz w:val="22"/>
@@ -4270,12 +4088,6 @@
         <w:gridCol w:w="4680"/>
       </w:tblGrid>
       <w:tr>
-        <w:tblPrEx>
-          <w:tblCellMar>
-            <w:top w:w="0" w:type="dxa"/>
-            <w:bottom w:w="0" w:type="dxa"/>
-          </w:tblCellMar>
-        </w:tblPrEx>
         <w:tc>
           <w:tcPr>
             <w:tcW w:w="4680" w:type="dxa"/>
@@ -4335,54 +4147,54 @@
                 <w:sz w:val="22"/>
                 <w:szCs w:val="22"/>
               </w:rPr>
-              <w:t>Descric</w:t>
-            </w:r>
-            <w:r>
-              <w:rPr>
-                <w:b/>
-                <w:bCs/>
-                <w:color w:val="FFFFFF"/>
-                <w:sz w:val="22"/>
-                <w:szCs w:val="22"/>
-              </w:rPr>
-              <w:t>ao</w:t>
+              <w:t>Descricao</w:t>
             </w:r>
             <w:proofErr w:type="spellEnd"/>
           </w:p>
         </w:tc>
       </w:tr>
       <w:tr>
-        <w:tblPrEx>
-          <w:tblCellMar>
-            <w:top w:w="0" w:type="dxa"/>
-            <w:bottom w:w="0" w:type="dxa"/>
-          </w:tblCellMar>
-        </w:tblPrEx>
-        <w:tc>
-          <w:tcPr>
-            <w:tcW w:w="4680" w:type="dxa"/>
-            <w:tcBorders>
-              <w:top w:val="single" w:sz="1" w:space="0" w:color="CCCCCC"/>
-              <w:left w:val="single" w:sz="1" w:space="0" w:color="CCCCCC"/>
-              <w:bottom w:val="single" w:sz="1" w:space="0" w:color="CCCCCC"/>
-              <w:right w:val="single" w:sz="1" w:space="0" w:color="CCCCCC"/>
-            </w:tcBorders>
-            <w:tcMar>
-              <w:top w:w="80" w:type="dxa"/>
-              <w:left w:w="120" w:type="dxa"/>
-              <w:bottom w:w="80" w:type="dxa"/>
-              <w:right w:w="120" w:type="dxa"/>
-            </w:tcMar>
-          </w:tcPr>
-          <w:p>
-            <w:proofErr w:type="spellStart"/>
+        <w:tc>
+          <w:tcPr>
+            <w:tcW w:w="4680" w:type="dxa"/>
+            <w:tcBorders>
+              <w:top w:val="single" w:sz="1" w:space="0" w:color="CCCCCC"/>
+              <w:left w:val="single" w:sz="1" w:space="0" w:color="CCCCCC"/>
+              <w:bottom w:val="single" w:sz="1" w:space="0" w:color="CCCCCC"/>
+              <w:right w:val="single" w:sz="1" w:space="0" w:color="CCCCCC"/>
+            </w:tcBorders>
+            <w:tcMar>
+              <w:top w:w="80" w:type="dxa"/>
+              <w:left w:w="120" w:type="dxa"/>
+              <w:bottom w:w="80" w:type="dxa"/>
+              <w:right w:w="120" w:type="dxa"/>
+            </w:tcMar>
+          </w:tcPr>
+          <w:p>
+            <w:proofErr w:type="spellStart"/>
+            <w:r>
+              <w:rPr>
+                <w:sz w:val="22"/>
+                <w:szCs w:val="22"/>
+              </w:rPr>
+              <w:lastRenderedPageBreak/>
+              <w:t>executar_</w:t>
+            </w:r>
             <w:proofErr w:type="gramStart"/>
             <w:r>
               <w:rPr>
                 <w:sz w:val="22"/>
                 <w:szCs w:val="22"/>
               </w:rPr>
-              <w:t>executar</w:t>
+              <w:t>processo</w:t>
+            </w:r>
+            <w:proofErr w:type="spellEnd"/>
+            <w:r>
+              <w:rPr>
+                <w:sz w:val="22"/>
+                <w:szCs w:val="22"/>
+              </w:rPr>
+              <w:t>(</w:t>
             </w:r>
             <w:proofErr w:type="gramEnd"/>
             <w:r>
@@ -4390,15 +4202,7 @@
                 <w:sz w:val="22"/>
                 <w:szCs w:val="22"/>
               </w:rPr>
-              <w:t>_processo</w:t>
-            </w:r>
-            <w:proofErr w:type="spellEnd"/>
-            <w:r>
-              <w:rPr>
-                <w:sz w:val="22"/>
-                <w:szCs w:val="22"/>
-              </w:rPr>
-              <w:t>(fila *pronto, fila *</w:t>
+              <w:t>fila *pronto, fila *</w:t>
             </w:r>
             <w:proofErr w:type="spellStart"/>
             <w:r>
@@ -4422,15 +4226,31 @@
                 <w:sz w:val="22"/>
                 <w:szCs w:val="22"/>
               </w:rPr>
-              <w:t>fila_recurso</w:t>
-            </w:r>
-            <w:proofErr w:type="spellEnd"/>
-            <w:r>
-              <w:rPr>
-                <w:sz w:val="22"/>
-                <w:szCs w:val="22"/>
-              </w:rPr>
-              <w:t>[],fila *</w:t>
+              <w:t>fila_</w:t>
+            </w:r>
+            <w:proofErr w:type="gramStart"/>
+            <w:r>
+              <w:rPr>
+                <w:sz w:val="22"/>
+                <w:szCs w:val="22"/>
+              </w:rPr>
+              <w:t>recurso</w:t>
+            </w:r>
+            <w:proofErr w:type="spellEnd"/>
+            <w:r>
+              <w:rPr>
+                <w:sz w:val="22"/>
+                <w:szCs w:val="22"/>
+              </w:rPr>
+              <w:t>[],fila</w:t>
+            </w:r>
+            <w:proofErr w:type="gramEnd"/>
+            <w:r>
+              <w:rPr>
+                <w:sz w:val="22"/>
+                <w:szCs w:val="22"/>
+              </w:rPr>
+              <w:t xml:space="preserve"> *</w:t>
             </w:r>
             <w:proofErr w:type="spellStart"/>
             <w:r>
@@ -4577,38 +4397,62 @@
         </w:tc>
       </w:tr>
       <w:tr>
-        <w:tblPrEx>
-          <w:tblCellMar>
-            <w:top w:w="0" w:type="dxa"/>
-            <w:bottom w:w="0" w:type="dxa"/>
-          </w:tblCellMar>
-        </w:tblPrEx>
-        <w:tc>
-          <w:tcPr>
-            <w:tcW w:w="4680" w:type="dxa"/>
-            <w:tcBorders>
-              <w:top w:val="single" w:sz="1" w:space="0" w:color="CCCCCC"/>
-              <w:left w:val="single" w:sz="1" w:space="0" w:color="CCCCCC"/>
-              <w:bottom w:val="single" w:sz="1" w:space="0" w:color="CCCCCC"/>
-              <w:right w:val="single" w:sz="1" w:space="0" w:color="CCCCCC"/>
-            </w:tcBorders>
-            <w:tcMar>
-              <w:top w:w="80" w:type="dxa"/>
-              <w:left w:w="120" w:type="dxa"/>
-              <w:bottom w:w="80" w:type="dxa"/>
-              <w:right w:w="120" w:type="dxa"/>
-            </w:tcMar>
-          </w:tcPr>
-          <w:p>
-            <w:proofErr w:type="spellStart"/>
+        <w:tc>
+          <w:tcPr>
+            <w:tcW w:w="4680" w:type="dxa"/>
+            <w:tcBorders>
+              <w:top w:val="single" w:sz="1" w:space="0" w:color="CCCCCC"/>
+              <w:left w:val="single" w:sz="1" w:space="0" w:color="CCCCCC"/>
+              <w:bottom w:val="single" w:sz="1" w:space="0" w:color="CCCCCC"/>
+              <w:right w:val="single" w:sz="1" w:space="0" w:color="CCCCCC"/>
+            </w:tcBorders>
+            <w:tcMar>
+              <w:top w:w="80" w:type="dxa"/>
+              <w:left w:w="120" w:type="dxa"/>
+              <w:bottom w:w="80" w:type="dxa"/>
+              <w:right w:w="120" w:type="dxa"/>
+            </w:tcMar>
+          </w:tcPr>
+          <w:p>
+            <w:proofErr w:type="spellStart"/>
+            <w:r>
+              <w:rPr>
+                <w:sz w:val="22"/>
+                <w:szCs w:val="22"/>
+              </w:rPr>
+              <w:t>verificar_desbloqueio</w:t>
+            </w:r>
+            <w:proofErr w:type="spellEnd"/>
+            <w:r>
+              <w:rPr>
+                <w:sz w:val="22"/>
+                <w:szCs w:val="22"/>
+              </w:rPr>
+              <w:t>(</w:t>
+            </w:r>
+            <w:proofErr w:type="spellStart"/>
+            <w:r>
+              <w:rPr>
+                <w:sz w:val="22"/>
+                <w:szCs w:val="22"/>
+              </w:rPr>
+              <w:t>fila_</w:t>
+            </w:r>
             <w:proofErr w:type="gramStart"/>
             <w:r>
               <w:rPr>
                 <w:sz w:val="22"/>
                 <w:szCs w:val="22"/>
               </w:rPr>
-              <w:lastRenderedPageBreak/>
-              <w:t>verificar</w:t>
+              <w:t>recurso</w:t>
+            </w:r>
+            <w:proofErr w:type="spellEnd"/>
+            <w:r>
+              <w:rPr>
+                <w:sz w:val="22"/>
+                <w:szCs w:val="22"/>
+              </w:rPr>
+              <w:t>[</w:t>
             </w:r>
             <w:proofErr w:type="gramEnd"/>
             <w:r>
@@ -4616,31 +4460,7 @@
                 <w:sz w:val="22"/>
                 <w:szCs w:val="22"/>
               </w:rPr>
-              <w:t>_desbloqueio</w:t>
-            </w:r>
-            <w:proofErr w:type="spellEnd"/>
-            <w:r>
-              <w:rPr>
-                <w:sz w:val="22"/>
-                <w:szCs w:val="22"/>
-              </w:rPr>
-              <w:t>(</w:t>
-            </w:r>
-            <w:proofErr w:type="spellStart"/>
-            <w:r>
-              <w:rPr>
-                <w:sz w:val="22"/>
-                <w:szCs w:val="22"/>
-              </w:rPr>
-              <w:t>fila_recurso</w:t>
-            </w:r>
-            <w:proofErr w:type="spellEnd"/>
-            <w:r>
-              <w:rPr>
-                <w:sz w:val="22"/>
-                <w:szCs w:val="22"/>
-              </w:rPr>
-              <w:t xml:space="preserve">[], pronto, </w:t>
+              <w:t xml:space="preserve">], pronto, </w:t>
             </w:r>
             <w:proofErr w:type="spellStart"/>
             <w:r>
@@ -4781,12 +4601,6 @@
         <w:gridCol w:w="4680"/>
       </w:tblGrid>
       <w:tr>
-        <w:tblPrEx>
-          <w:tblCellMar>
-            <w:top w:w="0" w:type="dxa"/>
-            <w:bottom w:w="0" w:type="dxa"/>
-          </w:tblCellMar>
-        </w:tblPrEx>
         <w:tc>
           <w:tcPr>
             <w:tcW w:w="4680" w:type="dxa"/>
@@ -4849,37 +4663,46 @@
         </w:tc>
       </w:tr>
       <w:tr>
-        <w:tblPrEx>
-          <w:tblCellMar>
-            <w:top w:w="0" w:type="dxa"/>
-            <w:bottom w:w="0" w:type="dxa"/>
-          </w:tblCellMar>
-        </w:tblPrEx>
-        <w:tc>
-          <w:tcPr>
-            <w:tcW w:w="4680" w:type="dxa"/>
-            <w:tcBorders>
-              <w:top w:val="single" w:sz="1" w:space="0" w:color="CCCCCC"/>
-              <w:left w:val="single" w:sz="1" w:space="0" w:color="CCCCCC"/>
-              <w:bottom w:val="single" w:sz="1" w:space="0" w:color="CCCCCC"/>
-              <w:right w:val="single" w:sz="1" w:space="0" w:color="CCCCCC"/>
-            </w:tcBorders>
-            <w:tcMar>
-              <w:top w:w="80" w:type="dxa"/>
-              <w:left w:w="120" w:type="dxa"/>
-              <w:bottom w:w="80" w:type="dxa"/>
-              <w:right w:w="120" w:type="dxa"/>
-            </w:tcMar>
-          </w:tcPr>
-          <w:p>
-            <w:proofErr w:type="spellStart"/>
+        <w:tc>
+          <w:tcPr>
+            <w:tcW w:w="4680" w:type="dxa"/>
+            <w:tcBorders>
+              <w:top w:val="single" w:sz="1" w:space="0" w:color="CCCCCC"/>
+              <w:left w:val="single" w:sz="1" w:space="0" w:color="CCCCCC"/>
+              <w:bottom w:val="single" w:sz="1" w:space="0" w:color="CCCCCC"/>
+              <w:right w:val="single" w:sz="1" w:space="0" w:color="CCCCCC"/>
+            </w:tcBorders>
+            <w:tcMar>
+              <w:top w:w="80" w:type="dxa"/>
+              <w:left w:w="120" w:type="dxa"/>
+              <w:bottom w:w="80" w:type="dxa"/>
+              <w:right w:w="120" w:type="dxa"/>
+            </w:tcMar>
+          </w:tcPr>
+          <w:p>
+            <w:proofErr w:type="spellStart"/>
+            <w:r>
+              <w:rPr>
+                <w:sz w:val="22"/>
+                <w:szCs w:val="22"/>
+              </w:rPr>
+              <w:t>exibir_</w:t>
+            </w:r>
             <w:proofErr w:type="gramStart"/>
             <w:r>
               <w:rPr>
                 <w:sz w:val="22"/>
                 <w:szCs w:val="22"/>
               </w:rPr>
-              <w:t>exibir</w:t>
+              <w:t>fila</w:t>
+            </w:r>
+            <w:proofErr w:type="spellEnd"/>
+            <w:r>
+              <w:rPr>
+                <w:sz w:val="22"/>
+                <w:szCs w:val="22"/>
+              </w:rPr>
+              <w:t>(</w:t>
             </w:r>
             <w:proofErr w:type="gramEnd"/>
             <w:r>
@@ -4887,15 +4710,7 @@
                 <w:sz w:val="22"/>
                 <w:szCs w:val="22"/>
               </w:rPr>
-              <w:t>_fila</w:t>
-            </w:r>
-            <w:proofErr w:type="spellEnd"/>
-            <w:r>
-              <w:rPr>
-                <w:sz w:val="22"/>
-                <w:szCs w:val="22"/>
-              </w:rPr>
-              <w:t xml:space="preserve">(f, </w:t>
+              <w:t xml:space="preserve">f, </w:t>
             </w:r>
             <w:proofErr w:type="spellStart"/>
             <w:r>
@@ -4943,37 +4758,62 @@
         </w:tc>
       </w:tr>
       <w:tr>
-        <w:tblPrEx>
-          <w:tblCellMar>
-            <w:top w:w="0" w:type="dxa"/>
-            <w:bottom w:w="0" w:type="dxa"/>
-          </w:tblCellMar>
-        </w:tblPrEx>
-        <w:tc>
-          <w:tcPr>
-            <w:tcW w:w="4680" w:type="dxa"/>
-            <w:tcBorders>
-              <w:top w:val="single" w:sz="1" w:space="0" w:color="CCCCCC"/>
-              <w:left w:val="single" w:sz="1" w:space="0" w:color="CCCCCC"/>
-              <w:bottom w:val="single" w:sz="1" w:space="0" w:color="CCCCCC"/>
-              <w:right w:val="single" w:sz="1" w:space="0" w:color="CCCCCC"/>
-            </w:tcBorders>
-            <w:tcMar>
-              <w:top w:w="80" w:type="dxa"/>
-              <w:left w:w="120" w:type="dxa"/>
-              <w:bottom w:w="80" w:type="dxa"/>
-              <w:right w:w="120" w:type="dxa"/>
-            </w:tcMar>
-          </w:tcPr>
-          <w:p>
-            <w:proofErr w:type="spellStart"/>
+        <w:tc>
+          <w:tcPr>
+            <w:tcW w:w="4680" w:type="dxa"/>
+            <w:tcBorders>
+              <w:top w:val="single" w:sz="1" w:space="0" w:color="CCCCCC"/>
+              <w:left w:val="single" w:sz="1" w:space="0" w:color="CCCCCC"/>
+              <w:bottom w:val="single" w:sz="1" w:space="0" w:color="CCCCCC"/>
+              <w:right w:val="single" w:sz="1" w:space="0" w:color="CCCCCC"/>
+            </w:tcBorders>
+            <w:tcMar>
+              <w:top w:w="80" w:type="dxa"/>
+              <w:left w:w="120" w:type="dxa"/>
+              <w:bottom w:w="80" w:type="dxa"/>
+              <w:right w:w="120" w:type="dxa"/>
+            </w:tcMar>
+          </w:tcPr>
+          <w:p>
+            <w:proofErr w:type="spellStart"/>
+            <w:r>
+              <w:rPr>
+                <w:sz w:val="22"/>
+                <w:szCs w:val="22"/>
+              </w:rPr>
+              <w:t>exibir_filas_recurso</w:t>
+            </w:r>
+            <w:proofErr w:type="spellEnd"/>
+            <w:r>
+              <w:rPr>
+                <w:sz w:val="22"/>
+                <w:szCs w:val="22"/>
+              </w:rPr>
+              <w:t>(</w:t>
+            </w:r>
+            <w:proofErr w:type="spellStart"/>
+            <w:r>
+              <w:rPr>
+                <w:sz w:val="22"/>
+                <w:szCs w:val="22"/>
+              </w:rPr>
+              <w:t>fila_</w:t>
+            </w:r>
             <w:proofErr w:type="gramStart"/>
             <w:r>
               <w:rPr>
                 <w:sz w:val="22"/>
                 <w:szCs w:val="22"/>
               </w:rPr>
-              <w:t>exibir</w:t>
+              <w:t>recurso</w:t>
+            </w:r>
+            <w:proofErr w:type="spellEnd"/>
+            <w:r>
+              <w:rPr>
+                <w:sz w:val="22"/>
+                <w:szCs w:val="22"/>
+              </w:rPr>
+              <w:t>[</w:t>
             </w:r>
             <w:proofErr w:type="gramEnd"/>
             <w:r>
@@ -4981,31 +4821,7 @@
                 <w:sz w:val="22"/>
                 <w:szCs w:val="22"/>
               </w:rPr>
-              <w:t>_filas_recurso</w:t>
-            </w:r>
-            <w:proofErr w:type="spellEnd"/>
-            <w:r>
-              <w:rPr>
-                <w:sz w:val="22"/>
-                <w:szCs w:val="22"/>
-              </w:rPr>
-              <w:t>(</w:t>
-            </w:r>
-            <w:proofErr w:type="spellStart"/>
-            <w:r>
-              <w:rPr>
-                <w:sz w:val="22"/>
-                <w:szCs w:val="22"/>
-              </w:rPr>
-              <w:t>fila_recurso</w:t>
-            </w:r>
-            <w:proofErr w:type="spellEnd"/>
-            <w:r>
-              <w:rPr>
-                <w:sz w:val="22"/>
-                <w:szCs w:val="22"/>
-              </w:rPr>
-              <w:t xml:space="preserve">[], </w:t>
+              <w:t xml:space="preserve">], </w:t>
             </w:r>
             <w:proofErr w:type="spellStart"/>
             <w:r>
@@ -5053,60 +4869,54 @@
         </w:tc>
       </w:tr>
       <w:tr>
-        <w:tblPrEx>
-          <w:tblCellMar>
-            <w:top w:w="0" w:type="dxa"/>
-            <w:bottom w:w="0" w:type="dxa"/>
-          </w:tblCellMar>
-        </w:tblPrEx>
-        <w:tc>
-          <w:tcPr>
-            <w:tcW w:w="4680" w:type="dxa"/>
-            <w:tcBorders>
-              <w:top w:val="single" w:sz="1" w:space="0" w:color="CCCCCC"/>
-              <w:left w:val="single" w:sz="1" w:space="0" w:color="CCCCCC"/>
-              <w:bottom w:val="single" w:sz="1" w:space="0" w:color="CCCCCC"/>
-              <w:right w:val="single" w:sz="1" w:space="0" w:color="CCCCCC"/>
-            </w:tcBorders>
-            <w:tcMar>
-              <w:top w:w="80" w:type="dxa"/>
-              <w:left w:w="120" w:type="dxa"/>
-              <w:bottom w:w="80" w:type="dxa"/>
-              <w:right w:w="120" w:type="dxa"/>
-            </w:tcMar>
-          </w:tcPr>
-          <w:p>
-            <w:proofErr w:type="spellStart"/>
+        <w:tc>
+          <w:tcPr>
+            <w:tcW w:w="4680" w:type="dxa"/>
+            <w:tcBorders>
+              <w:top w:val="single" w:sz="1" w:space="0" w:color="CCCCCC"/>
+              <w:left w:val="single" w:sz="1" w:space="0" w:color="CCCCCC"/>
+              <w:bottom w:val="single" w:sz="1" w:space="0" w:color="CCCCCC"/>
+              <w:right w:val="single" w:sz="1" w:space="0" w:color="CCCCCC"/>
+            </w:tcBorders>
+            <w:tcMar>
+              <w:top w:w="80" w:type="dxa"/>
+              <w:left w:w="120" w:type="dxa"/>
+              <w:bottom w:w="80" w:type="dxa"/>
+              <w:right w:w="120" w:type="dxa"/>
+            </w:tcMar>
+          </w:tcPr>
+          <w:p>
+            <w:proofErr w:type="spellStart"/>
+            <w:r>
+              <w:rPr>
+                <w:sz w:val="22"/>
+                <w:szCs w:val="22"/>
+              </w:rPr>
+              <w:t>exibir_fila_espera_</w:t>
+            </w:r>
             <w:proofErr w:type="gramStart"/>
             <w:r>
               <w:rPr>
                 <w:sz w:val="22"/>
                 <w:szCs w:val="22"/>
               </w:rPr>
-              <w:t>exibir</w:t>
-            </w:r>
+              <w:t>filho</w:t>
+            </w:r>
+            <w:proofErr w:type="spellEnd"/>
+            <w:r>
+              <w:rPr>
+                <w:sz w:val="22"/>
+                <w:szCs w:val="22"/>
+              </w:rPr>
+              <w:t>(</w:t>
+            </w:r>
+            <w:proofErr w:type="spellStart"/>
             <w:proofErr w:type="gramEnd"/>
             <w:r>
               <w:rPr>
                 <w:sz w:val="22"/>
                 <w:szCs w:val="22"/>
               </w:rPr>
-              <w:t>_fila_espera_filho</w:t>
-            </w:r>
-            <w:proofErr w:type="spellEnd"/>
-            <w:r>
-              <w:rPr>
-                <w:sz w:val="22"/>
-                <w:szCs w:val="22"/>
-              </w:rPr>
-              <w:t>(</w:t>
-            </w:r>
-            <w:proofErr w:type="spellStart"/>
-            <w:r>
-              <w:rPr>
-                <w:sz w:val="22"/>
-                <w:szCs w:val="22"/>
-              </w:rPr>
               <w:t>f_filho</w:t>
             </w:r>
             <w:proofErr w:type="spellEnd"/>
@@ -5157,14 +4967,7 @@
                 <w:sz w:val="22"/>
                 <w:szCs w:val="22"/>
               </w:rPr>
-              <w:t>Exibe os processos bloque</w:t>
-            </w:r>
-            <w:r>
-              <w:rPr>
-                <w:sz w:val="22"/>
-                <w:szCs w:val="22"/>
-              </w:rPr>
-              <w:t xml:space="preserve">ados em </w:t>
+              <w:t xml:space="preserve">Exibe os processos bloqueados em </w:t>
             </w:r>
             <w:proofErr w:type="spellStart"/>
             <w:r>
@@ -5186,12 +4989,6 @@
         </w:tc>
       </w:tr>
       <w:tr>
-        <w:tblPrEx>
-          <w:tblCellMar>
-            <w:top w:w="0" w:type="dxa"/>
-            <w:bottom w:w="0" w:type="dxa"/>
-          </w:tblCellMar>
-        </w:tblPrEx>
         <w:tc>
           <w:tcPr>
             <w:tcW w:w="4680" w:type="dxa"/>
@@ -5216,13 +5013,28 @@
               </w:rPr>
             </w:pPr>
             <w:proofErr w:type="spellStart"/>
+            <w:r>
+              <w:rPr>
+                <w:sz w:val="22"/>
+                <w:szCs w:val="22"/>
+              </w:rPr>
+              <w:t>exibir_estado_</w:t>
+            </w:r>
             <w:proofErr w:type="gramStart"/>
             <w:r>
               <w:rPr>
                 <w:sz w:val="22"/>
                 <w:szCs w:val="22"/>
               </w:rPr>
-              <w:t>exibir</w:t>
+              <w:t>sistema</w:t>
+            </w:r>
+            <w:proofErr w:type="spellEnd"/>
+            <w:r>
+              <w:rPr>
+                <w:sz w:val="22"/>
+                <w:szCs w:val="22"/>
+              </w:rPr>
+              <w:t>(</w:t>
             </w:r>
             <w:proofErr w:type="gramEnd"/>
             <w:r>
@@ -5230,21 +5042,6 @@
                 <w:sz w:val="22"/>
                 <w:szCs w:val="22"/>
               </w:rPr>
-              <w:t>_estado_sistema</w:t>
-            </w:r>
-            <w:proofErr w:type="spellEnd"/>
-            <w:r>
-              <w:rPr>
-                <w:sz w:val="22"/>
-                <w:szCs w:val="22"/>
-              </w:rPr>
-              <w:t>(</w:t>
-            </w:r>
-            <w:r>
-              <w:rPr>
-                <w:sz w:val="22"/>
-                <w:szCs w:val="22"/>
-              </w:rPr>
               <w:t>fila *pronto, fila *</w:t>
             </w:r>
             <w:proofErr w:type="spellStart"/>
@@ -5269,7 +5066,15 @@
                 <w:sz w:val="22"/>
                 <w:szCs w:val="22"/>
               </w:rPr>
-              <w:t>fila_recurso</w:t>
+              <w:t>fila_</w:t>
+            </w:r>
+            <w:proofErr w:type="gramStart"/>
+            <w:r>
+              <w:rPr>
+                <w:sz w:val="22"/>
+                <w:szCs w:val="22"/>
+              </w:rPr>
+              <w:t>recurso</w:t>
             </w:r>
             <w:proofErr w:type="spellEnd"/>
             <w:r>
@@ -5284,7 +5089,15 @@
                 <w:sz w:val="22"/>
                 <w:szCs w:val="22"/>
               </w:rPr>
-              <w:t>fila *</w:t>
+              <w:t>fila</w:t>
+            </w:r>
+            <w:proofErr w:type="gramEnd"/>
+            <w:r>
+              <w:rPr>
+                <w:sz w:val="22"/>
+                <w:szCs w:val="22"/>
+              </w:rPr>
+              <w:t xml:space="preserve"> *</w:t>
             </w:r>
             <w:proofErr w:type="spellStart"/>
             <w:r>
@@ -5406,13 +5219,7 @@
     </w:p>
     <w:p>
       <w:r>
-        <w:t xml:space="preserve">O loop </w:t>
-      </w:r>
-      <w:r>
-        <w:t>continua enquanto existir pelo menos</w:t>
-      </w:r>
-      <w:r>
-        <w:t xml:space="preserve"> um processo em qualquer f</w:t>
+        <w:t>O loop continua enquanto existir pelo menos um processo em qualquer f</w:t>
       </w:r>
       <w:r>
         <w:t>ila do sistema. A cada iteração de 10UT:</w:t>
@@ -5511,12 +5318,6 @@
         <w:gridCol w:w="4680"/>
       </w:tblGrid>
       <w:tr>
-        <w:tblPrEx>
-          <w:tblCellMar>
-            <w:top w:w="0" w:type="dxa"/>
-            <w:bottom w:w="0" w:type="dxa"/>
-          </w:tblCellMar>
-        </w:tblPrEx>
         <w:tc>
           <w:tcPr>
             <w:tcW w:w="4680" w:type="dxa"/>
@@ -5579,12 +5380,6 @@
         </w:tc>
       </w:tr>
       <w:tr>
-        <w:tblPrEx>
-          <w:tblCellMar>
-            <w:top w:w="0" w:type="dxa"/>
-            <w:bottom w:w="0" w:type="dxa"/>
-          </w:tblCellMar>
-        </w:tblPrEx>
         <w:tc>
           <w:tcPr>
             <w:tcW w:w="4680" w:type="dxa"/>
@@ -5679,14 +5474,7 @@
                 <w:sz w:val="22"/>
                 <w:szCs w:val="22"/>
               </w:rPr>
-              <w:t>F</w:t>
-            </w:r>
-            <w:r>
-              <w:rPr>
-                <w:sz w:val="22"/>
-                <w:szCs w:val="22"/>
-              </w:rPr>
-              <w:t xml:space="preserve">az </w:t>
+              <w:t xml:space="preserve">Faz </w:t>
             </w:r>
             <w:proofErr w:type="spellStart"/>
             <w:r>
@@ -5729,12 +5517,6 @@
         </w:tc>
       </w:tr>
       <w:tr>
-        <w:tblPrEx>
-          <w:tblCellMar>
-            <w:top w:w="0" w:type="dxa"/>
-            <w:bottom w:w="0" w:type="dxa"/>
-          </w:tblCellMar>
-        </w:tblPrEx>
         <w:tc>
           <w:tcPr>
             <w:tcW w:w="4680" w:type="dxa"/>
@@ -5801,7 +5583,6 @@
             </w:tcMar>
           </w:tcPr>
           <w:p>
-            <w:proofErr w:type="gramStart"/>
             <w:r>
               <w:rPr>
                 <w:sz w:val="22"/>
@@ -5814,48 +5595,35 @@
                 <w:sz w:val="22"/>
                 <w:szCs w:val="22"/>
               </w:rPr>
-              <w:t>ai</w:t>
-            </w:r>
-            <w:proofErr w:type="gramEnd"/>
-            <w:r>
-              <w:rPr>
-                <w:sz w:val="22"/>
-                <w:szCs w:val="22"/>
-              </w:rPr>
-              <w:t xml:space="preserve"> vai para fila de espera por filho (bloqueado)</w:t>
+              <w:t>ai vai para fila de espera por filho (bloqueado)</w:t>
             </w:r>
           </w:p>
         </w:tc>
       </w:tr>
       <w:tr>
-        <w:tblPrEx>
-          <w:tblCellMar>
-            <w:top w:w="0" w:type="dxa"/>
-            <w:bottom w:w="0" w:type="dxa"/>
-          </w:tblCellMar>
-        </w:tblPrEx>
-        <w:tc>
-          <w:tcPr>
-            <w:tcW w:w="4680" w:type="dxa"/>
-            <w:tcBorders>
-              <w:top w:val="single" w:sz="1" w:space="0" w:color="CCCCCC"/>
-              <w:left w:val="single" w:sz="1" w:space="0" w:color="CCCCCC"/>
-              <w:bottom w:val="single" w:sz="1" w:space="0" w:color="CCCCCC"/>
-              <w:right w:val="single" w:sz="1" w:space="0" w:color="CCCCCC"/>
-            </w:tcBorders>
-            <w:tcMar>
-              <w:top w:w="80" w:type="dxa"/>
-              <w:left w:w="120" w:type="dxa"/>
-              <w:bottom w:w="80" w:type="dxa"/>
-              <w:right w:w="120" w:type="dxa"/>
-            </w:tcMar>
-          </w:tcPr>
-          <w:p>
-            <w:r>
-              <w:rPr>
-                <w:sz w:val="22"/>
-                <w:szCs w:val="22"/>
-              </w:rPr>
+        <w:tc>
+          <w:tcPr>
+            <w:tcW w:w="4680" w:type="dxa"/>
+            <w:tcBorders>
+              <w:top w:val="single" w:sz="1" w:space="0" w:color="CCCCCC"/>
+              <w:left w:val="single" w:sz="1" w:space="0" w:color="CCCCCC"/>
+              <w:bottom w:val="single" w:sz="1" w:space="0" w:color="CCCCCC"/>
+              <w:right w:val="single" w:sz="1" w:space="0" w:color="CCCCCC"/>
+            </w:tcBorders>
+            <w:tcMar>
+              <w:top w:w="80" w:type="dxa"/>
+              <w:left w:w="120" w:type="dxa"/>
+              <w:bottom w:w="80" w:type="dxa"/>
+              <w:right w:w="120" w:type="dxa"/>
+            </w:tcMar>
+          </w:tcPr>
+          <w:p>
+            <w:r>
+              <w:rPr>
+                <w:sz w:val="22"/>
+                <w:szCs w:val="22"/>
+              </w:rPr>
+              <w:lastRenderedPageBreak/>
               <w:t xml:space="preserve">Sorteio </w:t>
             </w:r>
             <w:r>
@@ -5925,30 +5693,23 @@
         </w:tc>
       </w:tr>
       <w:tr>
-        <w:tblPrEx>
-          <w:tblCellMar>
-            <w:top w:w="0" w:type="dxa"/>
-            <w:bottom w:w="0" w:type="dxa"/>
-          </w:tblCellMar>
-        </w:tblPrEx>
-        <w:tc>
-          <w:tcPr>
-            <w:tcW w:w="4680" w:type="dxa"/>
-            <w:tcBorders>
-              <w:top w:val="single" w:sz="1" w:space="0" w:color="CCCCCC"/>
-              <w:left w:val="single" w:sz="1" w:space="0" w:color="CCCCCC"/>
-              <w:bottom w:val="single" w:sz="1" w:space="0" w:color="CCCCCC"/>
-              <w:right w:val="single" w:sz="1" w:space="0" w:color="CCCCCC"/>
-            </w:tcBorders>
-            <w:tcMar>
-              <w:top w:w="80" w:type="dxa"/>
-              <w:left w:w="120" w:type="dxa"/>
-              <w:bottom w:w="80" w:type="dxa"/>
-              <w:right w:w="120" w:type="dxa"/>
-            </w:tcMar>
-          </w:tcPr>
-          <w:p>
-            <w:proofErr w:type="spellStart"/>
+        <w:tc>
+          <w:tcPr>
+            <w:tcW w:w="4680" w:type="dxa"/>
+            <w:tcBorders>
+              <w:top w:val="single" w:sz="1" w:space="0" w:color="CCCCCC"/>
+              <w:left w:val="single" w:sz="1" w:space="0" w:color="CCCCCC"/>
+              <w:bottom w:val="single" w:sz="1" w:space="0" w:color="CCCCCC"/>
+              <w:right w:val="single" w:sz="1" w:space="0" w:color="CCCCCC"/>
+            </w:tcBorders>
+            <w:tcMar>
+              <w:top w:w="80" w:type="dxa"/>
+              <w:left w:w="120" w:type="dxa"/>
+              <w:bottom w:w="80" w:type="dxa"/>
+              <w:right w:w="120" w:type="dxa"/>
+            </w:tcMar>
+          </w:tcPr>
+          <w:p>
             <w:r>
               <w:rPr>
                 <w:sz w:val="22"/>
@@ -5956,7 +5717,6 @@
               </w:rPr>
               <w:t>Else</w:t>
             </w:r>
-            <w:proofErr w:type="spellEnd"/>
           </w:p>
         </w:tc>
         <w:tc>
@@ -6008,7 +5768,6 @@
           <w:sz w:val="28"/>
           <w:szCs w:val="28"/>
         </w:rPr>
-        <w:lastRenderedPageBreak/>
         <w:t>5. Conceitos de SO: O que o trabalho pede e o que foi implantado</w:t>
       </w:r>
     </w:p>
@@ -6043,15 +5802,7 @@
         <w:t>Bloqueio por I/O</w:t>
       </w:r>
       <w:r>
-        <w:t xml:space="preserve">: 30% de chance de bloquear por recurso (escolhido de forma aleatória), espera pelo menos 10UT </w:t>
-      </w:r>
-      <w:proofErr w:type="gramStart"/>
-      <w:r>
-        <w:t>pra</w:t>
-      </w:r>
-      <w:proofErr w:type="gramEnd"/>
-      <w:r>
-        <w:t xml:space="preserve"> ter chance de desbloqueio.</w:t>
+        <w:t>: 30% de chance de bloquear por recurso (escolhido de forma aleatória), espera pelo menos 10UT pra ter chance de desbloqueio.</w:t>
       </w:r>
     </w:p>
     <w:p>
@@ -6107,15 +5858,31 @@
           <w:sz w:val="22"/>
           <w:szCs w:val="22"/>
         </w:rPr>
-        <w:t>fazer_fork</w:t>
-      </w:r>
-      <w:proofErr w:type="spellEnd"/>
+        <w:t>fazer_</w:t>
+      </w:r>
+      <w:proofErr w:type="gramStart"/>
       <w:r>
         <w:rPr>
           <w:sz w:val="22"/>
           <w:szCs w:val="22"/>
         </w:rPr>
-        <w:t xml:space="preserve">() cria um novo processo filho com </w:t>
+        <w:t>fork</w:t>
+      </w:r>
+      <w:proofErr w:type="spellEnd"/>
+      <w:r>
+        <w:rPr>
+          <w:sz w:val="22"/>
+          <w:szCs w:val="22"/>
+        </w:rPr>
+        <w:t>(</w:t>
+      </w:r>
+      <w:proofErr w:type="gramEnd"/>
+      <w:r>
+        <w:rPr>
+          <w:sz w:val="22"/>
+          <w:szCs w:val="22"/>
+        </w:rPr>
+        <w:t xml:space="preserve">) cria um novo processo filho com </w:t>
       </w:r>
       <w:proofErr w:type="spellStart"/>
       <w:r>
@@ -6235,22 +6002,31 @@
           <w:sz w:val="22"/>
           <w:szCs w:val="22"/>
         </w:rPr>
-        <w:t>fazer_wait</w:t>
-      </w:r>
-      <w:proofErr w:type="spellEnd"/>
+        <w:t>fazer_</w:t>
+      </w:r>
+      <w:proofErr w:type="gramStart"/>
       <w:r>
         <w:rPr>
           <w:sz w:val="22"/>
           <w:szCs w:val="22"/>
         </w:rPr>
-        <w:t>() bloqueia o pai na fila de e</w:t>
-      </w:r>
+        <w:t>wait</w:t>
+      </w:r>
+      <w:proofErr w:type="spellEnd"/>
       <w:r>
         <w:rPr>
           <w:sz w:val="22"/>
           <w:szCs w:val="22"/>
         </w:rPr>
-        <w:t xml:space="preserve">spera. Ele só é liberado quando </w:t>
+        <w:t>(</w:t>
+      </w:r>
+      <w:proofErr w:type="gramEnd"/>
+      <w:r>
+        <w:rPr>
+          <w:sz w:val="22"/>
+          <w:szCs w:val="22"/>
+        </w:rPr>
+        <w:t xml:space="preserve">) bloqueia o pai na fila de espera. Ele só é liberado quando </w:t>
       </w:r>
       <w:proofErr w:type="spellStart"/>
       <w:r>
@@ -6290,7 +6066,7 @@
 </file>
 
 <file path=word/endnotes.xml><?xml version="1.0" encoding="utf-8"?>
-<w:endnotes xmlns:wpc="http://schemas.microsoft.com/office/word/2010/wordprocessingCanvas" xmlns:mc="http://schemas.openxmlformats.org/markup-compatibility/2006" xmlns:o="urn:schemas-microsoft-com:office:office" xmlns:r="http://schemas.openxmlformats.org/officeDocument/2006/relationships" xmlns:m="http://schemas.openxmlformats.org/officeDocument/2006/math" xmlns:v="urn:schemas-microsoft-com:vml" xmlns:wp14="http://schemas.microsoft.com/office/word/2010/wordprocessingDrawing" xmlns:wp="http://schemas.openxmlformats.org/drawingml/2006/wordprocessingDrawing" xmlns:w10="urn:schemas-microsoft-com:office:word" xmlns:w="http://schemas.openxmlformats.org/wordprocessingml/2006/main" xmlns:w14="http://schemas.microsoft.com/office/word/2010/wordml" xmlns:w15="http://schemas.microsoft.com/office/word/2012/wordml" xmlns:wpg="http://schemas.microsoft.com/office/word/2010/wordprocessingGroup" xmlns:wpi="http://schemas.microsoft.com/office/word/2010/wordprocessingInk" xmlns:wne="http://schemas.microsoft.com/office/word/2006/wordml" xmlns:wps="http://schemas.microsoft.com/office/word/2010/wordprocessingShape" mc:Ignorable="w14 w15 wp14">
+<w:endnotes xmlns:wpc="http://schemas.microsoft.com/office/word/2010/wordprocessingCanvas" xmlns:cx="http://schemas.microsoft.com/office/drawing/2014/chartex" xmlns:cx1="http://schemas.microsoft.com/office/drawing/2015/9/8/chartex" xmlns:cx2="http://schemas.microsoft.com/office/drawing/2015/10/21/chartex" xmlns:cx3="http://schemas.microsoft.com/office/drawing/2016/5/9/chartex" xmlns:cx4="http://schemas.microsoft.com/office/drawing/2016/5/10/chartex" xmlns:cx5="http://schemas.microsoft.com/office/drawing/2016/5/11/chartex" xmlns:cx6="http://schemas.microsoft.com/office/drawing/2016/5/12/chartex" xmlns:cx7="http://schemas.microsoft.com/office/drawing/2016/5/13/chartex" xmlns:cx8="http://schemas.microsoft.com/office/drawing/2016/5/14/chartex" xmlns:mc="http://schemas.openxmlformats.org/markup-compatibility/2006" xmlns:aink="http://schemas.microsoft.com/office/drawing/2016/ink" xmlns:am3d="http://schemas.microsoft.com/office/drawing/2017/model3d" xmlns:o="urn:schemas-microsoft-com:office:office" xmlns:oel="http://schemas.microsoft.com/office/2019/extlst" xmlns:r="http://schemas.openxmlformats.org/officeDocument/2006/relationships" xmlns:m="http://schemas.openxmlformats.org/officeDocument/2006/math" xmlns:v="urn:schemas-microsoft-com:vml" xmlns:wp14="http://schemas.microsoft.com/office/word/2010/wordprocessingDrawing" xmlns:wp="http://schemas.openxmlformats.org/drawingml/2006/wordprocessingDrawing" xmlns:w10="urn:schemas-microsoft-com:office:word" xmlns:w="http://schemas.openxmlformats.org/wordprocessingml/2006/main" xmlns:w14="http://schemas.microsoft.com/office/word/2010/wordml" xmlns:w15="http://schemas.microsoft.com/office/word/2012/wordml" xmlns:w16cex="http://schemas.microsoft.com/office/word/2018/wordml/cex" xmlns:w16cid="http://schemas.microsoft.com/office/word/2016/wordml/cid" xmlns:w16="http://schemas.microsoft.com/office/word/2018/wordml" xmlns:w16du="http://schemas.microsoft.com/office/word/2023/wordml/word16du" xmlns:w16sdtdh="http://schemas.microsoft.com/office/word/2020/wordml/sdtdatahash" xmlns:w16sdtfl="http://schemas.microsoft.com/office/word/2024/wordml/sdtformatlock" xmlns:w16se="http://schemas.microsoft.com/office/word/2015/wordml/symex" xmlns:wpg="http://schemas.microsoft.com/office/word/2010/wordprocessingGroup" xmlns:wpi="http://schemas.microsoft.com/office/word/2010/wordprocessingInk" xmlns:wne="http://schemas.microsoft.com/office/word/2006/wordml" xmlns:wps="http://schemas.microsoft.com/office/word/2010/wordprocessingShape" mc:Ignorable="w14 w15 w16se w16cid w16 w16cex w16sdtdh w16sdtfl w16du wp14">
   <w:endnote w:type="separator" w:id="-1">
     <w:p>
       <w:r>
@@ -6309,7 +6085,7 @@
 </file>
 
 <file path=word/footer1.xml><?xml version="1.0" encoding="utf-8"?>
-<w:ftr xmlns:wpc="http://schemas.microsoft.com/office/word/2010/wordprocessingCanvas" xmlns:mc="http://schemas.openxmlformats.org/markup-compatibility/2006" xmlns:o="urn:schemas-microsoft-com:office:office" xmlns:r="http://schemas.openxmlformats.org/officeDocument/2006/relationships" xmlns:m="http://schemas.openxmlformats.org/officeDocument/2006/math" xmlns:v="urn:schemas-microsoft-com:vml" xmlns:wp14="http://schemas.microsoft.com/office/word/2010/wordprocessingDrawing" xmlns:wp="http://schemas.openxmlformats.org/drawingml/2006/wordprocessingDrawing" xmlns:w10="urn:schemas-microsoft-com:office:word" xmlns:w="http://schemas.openxmlformats.org/wordprocessingml/2006/main" xmlns:w14="http://schemas.microsoft.com/office/word/2010/wordml" xmlns:w15="http://schemas.microsoft.com/office/word/2012/wordml" xmlns:wpg="http://schemas.microsoft.com/office/word/2010/wordprocessingGroup" xmlns:wpi="http://schemas.microsoft.com/office/word/2010/wordprocessingInk" xmlns:wne="http://schemas.microsoft.com/office/word/2006/wordml" xmlns:wps="http://schemas.microsoft.com/office/word/2010/wordprocessingShape" mc:Ignorable="w14 w15 wp14">
+<w:ftr xmlns:wpc="http://schemas.microsoft.com/office/word/2010/wordprocessingCanvas" xmlns:cx="http://schemas.microsoft.com/office/drawing/2014/chartex" xmlns:cx1="http://schemas.microsoft.com/office/drawing/2015/9/8/chartex" xmlns:cx2="http://schemas.microsoft.com/office/drawing/2015/10/21/chartex" xmlns:cx3="http://schemas.microsoft.com/office/drawing/2016/5/9/chartex" xmlns:cx4="http://schemas.microsoft.com/office/drawing/2016/5/10/chartex" xmlns:cx5="http://schemas.microsoft.com/office/drawing/2016/5/11/chartex" xmlns:cx6="http://schemas.microsoft.com/office/drawing/2016/5/12/chartex" xmlns:cx7="http://schemas.microsoft.com/office/drawing/2016/5/13/chartex" xmlns:cx8="http://schemas.microsoft.com/office/drawing/2016/5/14/chartex" xmlns:mc="http://schemas.openxmlformats.org/markup-compatibility/2006" xmlns:aink="http://schemas.microsoft.com/office/drawing/2016/ink" xmlns:am3d="http://schemas.microsoft.com/office/drawing/2017/model3d" xmlns:o="urn:schemas-microsoft-com:office:office" xmlns:oel="http://schemas.microsoft.com/office/2019/extlst" xmlns:r="http://schemas.openxmlformats.org/officeDocument/2006/relationships" xmlns:m="http://schemas.openxmlformats.org/officeDocument/2006/math" xmlns:v="urn:schemas-microsoft-com:vml" xmlns:wp14="http://schemas.microsoft.com/office/word/2010/wordprocessingDrawing" xmlns:wp="http://schemas.openxmlformats.org/drawingml/2006/wordprocessingDrawing" xmlns:w10="urn:schemas-microsoft-com:office:word" xmlns:w="http://schemas.openxmlformats.org/wordprocessingml/2006/main" xmlns:w14="http://schemas.microsoft.com/office/word/2010/wordml" xmlns:w15="http://schemas.microsoft.com/office/word/2012/wordml" xmlns:w16cex="http://schemas.microsoft.com/office/word/2018/wordml/cex" xmlns:w16cid="http://schemas.microsoft.com/office/word/2016/wordml/cid" xmlns:w16="http://schemas.microsoft.com/office/word/2018/wordml" xmlns:w16du="http://schemas.microsoft.com/office/word/2023/wordml/word16du" xmlns:w16sdtdh="http://schemas.microsoft.com/office/word/2020/wordml/sdtdatahash" xmlns:w16sdtfl="http://schemas.microsoft.com/office/word/2024/wordml/sdtformatlock" xmlns:w16se="http://schemas.microsoft.com/office/word/2015/wordml/symex" xmlns:wpg="http://schemas.microsoft.com/office/word/2010/wordprocessingGroup" xmlns:wpi="http://schemas.microsoft.com/office/word/2010/wordprocessingInk" xmlns:wne="http://schemas.microsoft.com/office/word/2006/wordml" xmlns:wps="http://schemas.microsoft.com/office/word/2010/wordprocessingShape" mc:Ignorable="w14 w15 w16se w16cid w16 w16cex w16sdtdh w16sdtfl w16du wp14">
   <w:p>
     <w:pPr>
       <w:jc w:val="center"/>
@@ -6319,7 +6095,7 @@
 </file>
 
 <file path=word/footnotes.xml><?xml version="1.0" encoding="utf-8"?>
-<w:footnotes xmlns:wpc="http://schemas.microsoft.com/office/word/2010/wordprocessingCanvas" xmlns:mc="http://schemas.openxmlformats.org/markup-compatibility/2006" xmlns:o="urn:schemas-microsoft-com:office:office" xmlns:r="http://schemas.openxmlformats.org/officeDocument/2006/relationships" xmlns:m="http://schemas.openxmlformats.org/officeDocument/2006/math" xmlns:v="urn:schemas-microsoft-com:vml" xmlns:wp14="http://schemas.microsoft.com/office/word/2010/wordprocessingDrawing" xmlns:wp="http://schemas.openxmlformats.org/drawingml/2006/wordprocessingDrawing" xmlns:w10="urn:schemas-microsoft-com:office:word" xmlns:w="http://schemas.openxmlformats.org/wordprocessingml/2006/main" xmlns:w14="http://schemas.microsoft.com/office/word/2010/wordml" xmlns:w15="http://schemas.microsoft.com/office/word/2012/wordml" xmlns:wpg="http://schemas.microsoft.com/office/word/2010/wordprocessingGroup" xmlns:wpi="http://schemas.microsoft.com/office/word/2010/wordprocessingInk" xmlns:wne="http://schemas.microsoft.com/office/word/2006/wordml" xmlns:wps="http://schemas.microsoft.com/office/word/2010/wordprocessingShape" mc:Ignorable="w14 w15 wp14">
+<w:footnotes xmlns:wpc="http://schemas.microsoft.com/office/word/2010/wordprocessingCanvas" xmlns:cx="http://schemas.microsoft.com/office/drawing/2014/chartex" xmlns:cx1="http://schemas.microsoft.com/office/drawing/2015/9/8/chartex" xmlns:cx2="http://schemas.microsoft.com/office/drawing/2015/10/21/chartex" xmlns:cx3="http://schemas.microsoft.com/office/drawing/2016/5/9/chartex" xmlns:cx4="http://schemas.microsoft.com/office/drawing/2016/5/10/chartex" xmlns:cx5="http://schemas.microsoft.com/office/drawing/2016/5/11/chartex" xmlns:cx6="http://schemas.microsoft.com/office/drawing/2016/5/12/chartex" xmlns:cx7="http://schemas.microsoft.com/office/drawing/2016/5/13/chartex" xmlns:cx8="http://schemas.microsoft.com/office/drawing/2016/5/14/chartex" xmlns:mc="http://schemas.openxmlformats.org/markup-compatibility/2006" xmlns:aink="http://schemas.microsoft.com/office/drawing/2016/ink" xmlns:am3d="http://schemas.microsoft.com/office/drawing/2017/model3d" xmlns:o="urn:schemas-microsoft-com:office:office" xmlns:oel="http://schemas.microsoft.com/office/2019/extlst" xmlns:r="http://schemas.openxmlformats.org/officeDocument/2006/relationships" xmlns:m="http://schemas.openxmlformats.org/officeDocument/2006/math" xmlns:v="urn:schemas-microsoft-com:vml" xmlns:wp14="http://schemas.microsoft.com/office/word/2010/wordprocessingDrawing" xmlns:wp="http://schemas.openxmlformats.org/drawingml/2006/wordprocessingDrawing" xmlns:w10="urn:schemas-microsoft-com:office:word" xmlns:w="http://schemas.openxmlformats.org/wordprocessingml/2006/main" xmlns:w14="http://schemas.microsoft.com/office/word/2010/wordml" xmlns:w15="http://schemas.microsoft.com/office/word/2012/wordml" xmlns:w16cex="http://schemas.microsoft.com/office/word/2018/wordml/cex" xmlns:w16cid="http://schemas.microsoft.com/office/word/2016/wordml/cid" xmlns:w16="http://schemas.microsoft.com/office/word/2018/wordml" xmlns:w16du="http://schemas.microsoft.com/office/word/2023/wordml/word16du" xmlns:w16sdtdh="http://schemas.microsoft.com/office/word/2020/wordml/sdtdatahash" xmlns:w16sdtfl="http://schemas.microsoft.com/office/word/2024/wordml/sdtformatlock" xmlns:w16se="http://schemas.microsoft.com/office/word/2015/wordml/symex" xmlns:wpg="http://schemas.microsoft.com/office/word/2010/wordprocessingGroup" xmlns:wpi="http://schemas.microsoft.com/office/word/2010/wordprocessingInk" xmlns:wne="http://schemas.microsoft.com/office/word/2006/wordml" xmlns:wps="http://schemas.microsoft.com/office/word/2010/wordprocessingShape" mc:Ignorable="w14 w15 w16se w16cid w16 w16cex w16sdtdh w16sdtfl w16du wp14">
   <w:footnote w:type="separator" w:id="-1">
     <w:p>
       <w:r>
@@ -6338,7 +6114,7 @@
 </file>
 
 <file path=word/numbering.xml><?xml version="1.0" encoding="utf-8"?>
-<w:numbering xmlns:wpc="http://schemas.microsoft.com/office/word/2010/wordprocessingCanvas" xmlns:mc="http://schemas.openxmlformats.org/markup-compatibility/2006" xmlns:o="urn:schemas-microsoft-com:office:office" xmlns:r="http://schemas.openxmlformats.org/officeDocument/2006/relationships" xmlns:m="http://schemas.openxmlformats.org/officeDocument/2006/math" xmlns:v="urn:schemas-microsoft-com:vml" xmlns:wp14="http://schemas.microsoft.com/office/word/2010/wordprocessingDrawing" xmlns:wp="http://schemas.openxmlformats.org/drawingml/2006/wordprocessingDrawing" xmlns:w10="urn:schemas-microsoft-com:office:word" xmlns:w="http://schemas.openxmlformats.org/wordprocessingml/2006/main" xmlns:w14="http://schemas.microsoft.com/office/word/2010/wordml" xmlns:w15="http://schemas.microsoft.com/office/word/2012/wordml" xmlns:wpg="http://schemas.microsoft.com/office/word/2010/wordprocessingGroup" xmlns:wpi="http://schemas.microsoft.com/office/word/2010/wordprocessingInk" xmlns:wne="http://schemas.microsoft.com/office/word/2006/wordml" xmlns:wps="http://schemas.microsoft.com/office/word/2010/wordprocessingShape" mc:Ignorable="w14 w15 wp14">
+<w:numbering xmlns:wpc="http://schemas.microsoft.com/office/word/2010/wordprocessingCanvas" xmlns:cx="http://schemas.microsoft.com/office/drawing/2014/chartex" xmlns:cx1="http://schemas.microsoft.com/office/drawing/2015/9/8/chartex" xmlns:cx2="http://schemas.microsoft.com/office/drawing/2015/10/21/chartex" xmlns:cx3="http://schemas.microsoft.com/office/drawing/2016/5/9/chartex" xmlns:cx4="http://schemas.microsoft.com/office/drawing/2016/5/10/chartex" xmlns:cx5="http://schemas.microsoft.com/office/drawing/2016/5/11/chartex" xmlns:cx6="http://schemas.microsoft.com/office/drawing/2016/5/12/chartex" xmlns:cx7="http://schemas.microsoft.com/office/drawing/2016/5/13/chartex" xmlns:cx8="http://schemas.microsoft.com/office/drawing/2016/5/14/chartex" xmlns:mc="http://schemas.openxmlformats.org/markup-compatibility/2006" xmlns:aink="http://schemas.microsoft.com/office/drawing/2016/ink" xmlns:am3d="http://schemas.microsoft.com/office/drawing/2017/model3d" xmlns:o="urn:schemas-microsoft-com:office:office" xmlns:oel="http://schemas.microsoft.com/office/2019/extlst" xmlns:r="http://schemas.openxmlformats.org/officeDocument/2006/relationships" xmlns:m="http://schemas.openxmlformats.org/officeDocument/2006/math" xmlns:v="urn:schemas-microsoft-com:vml" xmlns:wp14="http://schemas.microsoft.com/office/word/2010/wordprocessingDrawing" xmlns:wp="http://schemas.openxmlformats.org/drawingml/2006/wordprocessingDrawing" xmlns:w10="urn:schemas-microsoft-com:office:word" xmlns:w="http://schemas.openxmlformats.org/wordprocessingml/2006/main" xmlns:w14="http://schemas.microsoft.com/office/word/2010/wordml" xmlns:w15="http://schemas.microsoft.com/office/word/2012/wordml" xmlns:w16cex="http://schemas.microsoft.com/office/word/2018/wordml/cex" xmlns:w16cid="http://schemas.microsoft.com/office/word/2016/wordml/cid" xmlns:w16="http://schemas.microsoft.com/office/word/2018/wordml" xmlns:w16du="http://schemas.microsoft.com/office/word/2023/wordml/word16du" xmlns:w16sdtdh="http://schemas.microsoft.com/office/word/2020/wordml/sdtdatahash" xmlns:w16sdtfl="http://schemas.microsoft.com/office/word/2024/wordml/sdtformatlock" xmlns:w16se="http://schemas.microsoft.com/office/word/2015/wordml/symex" xmlns:wpg="http://schemas.microsoft.com/office/word/2010/wordprocessingGroup" xmlns:wpi="http://schemas.microsoft.com/office/word/2010/wordprocessingInk" xmlns:wne="http://schemas.microsoft.com/office/word/2006/wordml" xmlns:wps="http://schemas.microsoft.com/office/word/2010/wordprocessingShape" mc:Ignorable="w14 w15 w16se w16cid w16 w16cex w16sdtdh w16sdtfl w16du wp14">
   <w:abstractNum w:abstractNumId="0" w15:restartNumberingAfterBreak="0">
     <w:nsid w:val="39593D34"/>
     <w:multiLevelType w:val="hybridMultilevel"/>
@@ -6479,13 +6255,13 @@
       </w:pPr>
     </w:lvl>
   </w:abstractNum>
-  <w:num w:numId="1">
+  <w:num w:numId="1" w16cid:durableId="2076856698">
     <w:abstractNumId w:val="1"/>
     <w:lvlOverride w:ilvl="0">
       <w:startOverride w:val="1"/>
     </w:lvlOverride>
   </w:num>
-  <w:num w:numId="2">
+  <w:num w:numId="2" w16cid:durableId="311564930">
     <w:abstractNumId w:val="0"/>
     <w:lvlOverride w:ilvl="0">
       <w:startOverride w:val="1"/>
@@ -6495,7 +6271,7 @@
 </file>
 
 <file path=word/styles.xml><?xml version="1.0" encoding="utf-8"?>
-<w:styles xmlns:mc="http://schemas.openxmlformats.org/markup-compatibility/2006" xmlns:r="http://schemas.openxmlformats.org/officeDocument/2006/relationships" xmlns:w="http://schemas.openxmlformats.org/wordprocessingml/2006/main" xmlns:w14="http://schemas.microsoft.com/office/word/2010/wordml" xmlns:w15="http://schemas.microsoft.com/office/word/2012/wordml" mc:Ignorable="w14 w15">
+<w:styles xmlns:mc="http://schemas.openxmlformats.org/markup-compatibility/2006" xmlns:r="http://schemas.openxmlformats.org/officeDocument/2006/relationships" xmlns:w="http://schemas.openxmlformats.org/wordprocessingml/2006/main" xmlns:w14="http://schemas.microsoft.com/office/word/2010/wordml" xmlns:w15="http://schemas.microsoft.com/office/word/2012/wordml" xmlns:w16cex="http://schemas.microsoft.com/office/word/2018/wordml/cex" xmlns:w16cid="http://schemas.microsoft.com/office/word/2016/wordml/cid" xmlns:w16="http://schemas.microsoft.com/office/word/2018/wordml" xmlns:w16du="http://schemas.microsoft.com/office/word/2023/wordml/word16du" xmlns:w16sdtdh="http://schemas.microsoft.com/office/word/2020/wordml/sdtdatahash" xmlns:w16sdtfl="http://schemas.microsoft.com/office/word/2024/wordml/sdtformatlock" xmlns:w16se="http://schemas.microsoft.com/office/word/2015/wordml/symex" mc:Ignorable="w14 w15 w16se w16cid w16 w16cex w16sdtdh w16sdtfl w16du">
   <w:docDefaults>
     <w:rPrDefault>
       <w:rPr>
@@ -6507,7 +6283,7 @@
     </w:rPrDefault>
     <w:pPrDefault/>
   </w:docDefaults>
-  <w:latentStyles w:defLockedState="0" w:defUIPriority="99" w:defSemiHidden="0" w:defUnhideWhenUsed="0" w:defQFormat="0" w:count="371">
+  <w:latentStyles w:defLockedState="0" w:defUIPriority="99" w:defSemiHidden="0" w:defUnhideWhenUsed="0" w:defQFormat="0" w:count="376">
     <w:lsdException w:name="Normal" w:uiPriority="0" w:qFormat="1"/>
     <w:lsdException w:name="heading 1" w:uiPriority="9" w:qFormat="1"/>
     <w:lsdException w:name="heading 2" w:semiHidden="1" w:uiPriority="9" w:unhideWhenUsed="1" w:qFormat="1"/>
@@ -6879,6 +6655,11 @@
     <w:lsdException w:name="List Table 5 Dark Accent 6" w:uiPriority="50"/>
     <w:lsdException w:name="List Table 6 Colorful Accent 6" w:uiPriority="51"/>
     <w:lsdException w:name="List Table 7 Colorful Accent 6" w:uiPriority="52"/>
+    <w:lsdException w:name="Mention" w:semiHidden="1" w:unhideWhenUsed="1"/>
+    <w:lsdException w:name="Smart Hyperlink" w:semiHidden="1" w:unhideWhenUsed="1"/>
+    <w:lsdException w:name="Hashtag" w:semiHidden="1" w:unhideWhenUsed="1"/>
+    <w:lsdException w:name="Unresolved Mention" w:semiHidden="1" w:unhideWhenUsed="1"/>
+    <w:lsdException w:name="Smart Link" w:semiHidden="1" w:unhideWhenUsed="1"/>
   </w:latentStyles>
   <w:style w:type="paragraph" w:default="1" w:styleId="Normal">
     <w:name w:val="Normal"/>

</xml_diff>